<commit_message>
docs: fix paper formatting — US Letter page size, add Figure 4, renumber figures sequentially
</commit_message>
<xml_diff>
--- a/exports/paper.docx
+++ b/exports/paper.docx
@@ -100,7 +100,7 @@
     <w:p>
       <w:pPr>
         <w:sectPr>
-          <w:pgSz w:w="11906" w:h="16838" w:orient="portrait"/>
+          <w:pgSz w:w="12240" w:h="15840" w:orient="portrait"/>
           <w:pgMar w:top="1440" w:right="1440" w:bottom="1440" w:left="1440" w:header="708" w:footer="708" w:gutter="0"/>
           <w:pgNumType/>
           <w:docGrid w:linePitch="360"/>
@@ -1518,7 +1518,7 @@
           <wp:inline distT="0" distB="0" distL="0" distR="0">
             <wp:extent cx="5524500" cy="3619500"/>
             <wp:effectExtent t="0" r="0" b="0" l="0"/>
-            <wp:docPr id="1" name="fig3" descr="Daily Enrollment and Completion (Feb 2-9, 2026)" title="Figure 3"/>
+            <wp:docPr id="1" name="fig3" descr="Daily Enrollment and Completion (Feb 2-9, 2026)" title="Figure 1"/>
             <wp:cNvGraphicFramePr>
               <a:graphicFrameLocks xmlns:a="http://schemas.openxmlformats.org/drawingml/2006/main" noChangeAspect="1"/>
             </wp:cNvGraphicFramePr>
@@ -1567,43 +1567,21 @@
           <w:sz w:val="20"/>
           <w:szCs w:val="20"/>
         </w:rPr>
-        <w:t xml:space="preserve">Figure 3. Daily Enrollment and Completion (Feb 2-9, 2026)</w:t>
-      </w:r>
-    </w:p>
-    <w:p>
-      <w:pPr>
-        <w:spacing w:line="360" w:after="200"/>
-        <w:jc w:val="left"/>
-      </w:pPr>
-      <w:r>
-        <w:rPr>
-          <w:rFonts w:ascii="Times New Roman" w:cs="Times New Roman" w:eastAsia="Times New Roman" w:hAnsi="Times New Roman"/>
-          <w:sz w:val="24"/>
-          <w:szCs w:val="24"/>
-        </w:rPr>
-        <w:t xml:space="preserve">Figure 3 displays the daily enrollment and assessment completion counts alongside cumulative totals over the 8-day assessment window. The dual-axis chart shows that enrollment peaked on the first day (February 2, n = 98), consistent with students responding to the initial course announcement. A secondary surge occurred on the final two days (February 8-9, n = 119 combined), reflecting deadline-driven engagement. The cumulative lines demonstrate that the enrollment-to-completion gap remained narrow throughout, ultimately reaching 433 enrolled and 421 completed (97.2%). This high completion rate indicates strong platform reliability and student engagement with the required assessment.</w:t>
-      </w:r>
-    </w:p>
-    <w:p>
-      <w:pPr>
-        <w:pStyle w:val="Heading2"/>
-      </w:pPr>
-      <w:r>
-        <w:t xml:space="preserve">5.2 Sample Demographics</w:t>
-      </w:r>
-    </w:p>
-    <w:p>
-      <w:pPr>
-        <w:spacing w:line="360" w:after="200"/>
-        <w:jc w:val="left"/>
-      </w:pPr>
-      <w:r>
-        <w:rPr>
-          <w:rFonts w:ascii="Times New Roman" w:cs="Times New Roman" w:eastAsia="Times New Roman" w:hAnsi="Times New Roman"/>
-          <w:sz w:val="24"/>
-          <w:szCs w:val="24"/>
-        </w:rPr>
-        <w:t xml:space="preserve">The sample of 421 completers is predominantly female (58.4%), traditional college age (87.4% aged 20 or under), and racially diverse. White/Caucasian students comprise roughly half the sample (49.4%), with meaningful representation from Hispanic/Latino (22.3%), Asian (13.3%), and Black/African American (6.9%) students. Nearly three-quarters of respondents report part-time employment (72.2%), and approximately one-third are first-generation college students (28.5%). This demographic composition provides sufficient variation to support the planned heterogeneity analysis in RQ2.</w:t>
+        <w:t xml:space="preserve">Figure 1. Daily Enrollment and Completion (Feb 2-9, 2026)</w:t>
+      </w:r>
+    </w:p>
+    <w:p>
+      <w:pPr>
+        <w:spacing w:line="360" w:after="200"/>
+        <w:jc w:val="left"/>
+      </w:pPr>
+      <w:r>
+        <w:rPr>
+          <w:rFonts w:ascii="Times New Roman" w:cs="Times New Roman" w:eastAsia="Times New Roman" w:hAnsi="Times New Roman"/>
+          <w:sz w:val="24"/>
+          <w:szCs w:val="24"/>
+        </w:rPr>
+        <w:t xml:space="preserve">Figure 1 displays the daily enrollment and assessment completion counts alongside cumulative totals over the 8-day assessment window. The dual-axis chart shows that enrollment peaked on the first day (February 2, n = 98), consistent with students responding to the initial course announcement. A secondary surge occurred on the final two days (February 8-9, n = 119 combined), reflecting deadline-driven engagement. The cumulative lines demonstrate that the enrollment-to-completion gap remained narrow throughout, ultimately reaching 433 enrolled and 421 completed (97.2%). This high completion rate indicates strong platform reliability and student engagement with the required assessment.</w:t>
       </w:r>
     </w:p>
     <w:p>
@@ -1614,9 +1592,9 @@
       <w:r>
         <w:drawing>
           <wp:inline distT="0" distB="0" distL="0" distR="0">
-            <wp:extent cx="5715000" cy="3333750"/>
+            <wp:extent cx="5524500" cy="3619500"/>
             <wp:effectExtent t="0" r="0" b="0" l="0"/>
-            <wp:docPr id="1" name="fig7" descr="Sample Demographics (N = 421)" title="Figure 7"/>
+            <wp:docPr id="1" name="fig4" descr="Assessment Submission Time of Day (N = 421)" title="Figure 2"/>
             <wp:cNvGraphicFramePr>
               <a:graphicFrameLocks xmlns:a="http://schemas.openxmlformats.org/drawingml/2006/main" noChangeAspect="1"/>
             </wp:cNvGraphicFramePr>
@@ -1639,7 +1617,7 @@
                   <pic:spPr bwMode="auto">
                     <a:xfrm>
                       <a:off x="0" y="0"/>
-                      <a:ext cx="5715000" cy="3333750"/>
+                      <a:ext cx="5524500" cy="3619500"/>
                     </a:xfrm>
                     <a:prstGeom prst="rect">
                       <a:avLst/>
@@ -1665,21 +1643,21 @@
           <w:sz w:val="20"/>
           <w:szCs w:val="20"/>
         </w:rPr>
-        <w:t xml:space="preserve">Figure 7. Sample Demographics (N = 421)</w:t>
-      </w:r>
-    </w:p>
-    <w:p>
-      <w:pPr>
-        <w:spacing w:line="360" w:after="200"/>
-        <w:jc w:val="left"/>
-      </w:pPr>
-      <w:r>
-        <w:rPr>
-          <w:rFonts w:ascii="Times New Roman" w:cs="Times New Roman" w:eastAsia="Times New Roman" w:hAnsi="Times New Roman"/>
-          <w:sz w:val="24"/>
-          <w:szCs w:val="24"/>
-        </w:rPr>
-        <w:t xml:space="preserve">Figure 7 presents the demographic composition of the sample across five dimensions. Panel (a) shows the gender split (58.4% female, 40.2% male). Panel (b) confirms a predominantly traditional-age sample (87.4% aged 20 or under). Panel (c) reveals meaningful racial and ethnic diversity, with White/Caucasian students comprising roughly half (49.4%) and substantial representation from Hispanic/Latino (22.3%), Asian (13.3%), and Black/African American (6.9%) students. Panel (d) shows that nearly three-quarters of students work part-time (72.2%), while panel (e) indicates that nearly one-third are first-generation college students (28.5%). This demographic profile provides meaningful variation for the planned heterogeneity analysis (RQ2) examining whether learning gains differ across student subgroups.</w:t>
+        <w:t xml:space="preserve">Figure 2. Assessment Submission Time of Day (N = 421)</w:t>
+      </w:r>
+    </w:p>
+    <w:p>
+      <w:pPr>
+        <w:spacing w:line="360" w:after="200"/>
+        <w:jc w:val="left"/>
+      </w:pPr>
+      <w:r>
+        <w:rPr>
+          <w:rFonts w:ascii="Times New Roman" w:cs="Times New Roman" w:eastAsia="Times New Roman" w:hAnsi="Times New Roman"/>
+          <w:sz w:val="24"/>
+          <w:szCs w:val="24"/>
+        </w:rPr>
+        <w:t xml:space="preserve">Figure 2 presents the distribution of assessment submission times across the 24-hour clock (CST). The area chart reveals a pronounced evening peak between 8:00 PM and 10:00 PM, when approximately 35% of all submissions occurred. Morning hours (6:00 AM–12:00 PM) accounted for fewer than 10% of completions, with the lowest activity between 2:00 AM and 7:00 AM. A secondary afternoon uptick is visible between 2:00 PM and 5:00 PM. This temporal pattern is consistent with typical college student schedules, where academic tasks are concentrated in evening hours after classes and extracurricular activities. The strong evening concentration also suggests that students treated the assessment as a focused task rather than a casual activity, which supports the validity of the measured completion times.</w:t>
       </w:r>
     </w:p>
     <w:p>
@@ -1687,21 +1665,21 @@
         <w:pStyle w:val="Heading2"/>
       </w:pPr>
       <w:r>
-        <w:t xml:space="preserve">5.3 Financial Background</w:t>
-      </w:r>
-    </w:p>
-    <w:p>
-      <w:pPr>
-        <w:spacing w:line="360" w:after="200"/>
-        <w:jc w:val="left"/>
-      </w:pPr>
-      <w:r>
-        <w:rPr>
-          <w:rFonts w:ascii="Times New Roman" w:cs="Times New Roman" w:eastAsia="Times New Roman" w:hAnsi="Times New Roman"/>
-          <w:sz w:val="24"/>
-          <w:szCs w:val="24"/>
-        </w:rPr>
-        <w:t xml:space="preserve">Students report varying levels of financial stress and self-assessed financial knowledge. The majority experience financial stress sometimes (44.7%) or rarely (22.3%), though nearly a quarter (23.8%) report stress often or always. Self-rated financial knowledge clusters around moderate (60.1%) and low (25.2%), with only 14.5% rating themselves as high or very high. These distributions suggest a sample with meaningful financial concerns and generally modest self-assessed competence, consistent with the target population for an introductory financial literacy course.</w:t>
+        <w:t xml:space="preserve">5.2 Sample Demographics</w:t>
+      </w:r>
+    </w:p>
+    <w:p>
+      <w:pPr>
+        <w:spacing w:line="360" w:after="200"/>
+        <w:jc w:val="left"/>
+      </w:pPr>
+      <w:r>
+        <w:rPr>
+          <w:rFonts w:ascii="Times New Roman" w:cs="Times New Roman" w:eastAsia="Times New Roman" w:hAnsi="Times New Roman"/>
+          <w:sz w:val="24"/>
+          <w:szCs w:val="24"/>
+        </w:rPr>
+        <w:t xml:space="preserve">The sample of 421 completers is predominantly female (58.4%), traditional college age (87.4% aged 20 or under), and racially diverse. White/Caucasian students comprise roughly half the sample (49.4%), with meaningful representation from Hispanic/Latino (22.3%), Asian (13.3%), and Black/African American (6.9%) students. Nearly three-quarters of respondents report part-time employment (72.2%), and approximately one-third are first-generation college students (28.5%). This demographic composition provides sufficient variation to support the planned heterogeneity analysis in RQ2.</w:t>
       </w:r>
     </w:p>
     <w:p>
@@ -1714,7 +1692,7 @@
           <wp:inline distT="0" distB="0" distL="0" distR="0">
             <wp:extent cx="5715000" cy="3333750"/>
             <wp:effectExtent t="0" r="0" b="0" l="0"/>
-            <wp:docPr id="1" name="fig8" descr="Financial Background and Self-Assessment (N = 421)" title="Figure 8"/>
+            <wp:docPr id="1" name="fig7" descr="Sample Demographics (N = 421)" title="Figure 3"/>
             <wp:cNvGraphicFramePr>
               <a:graphicFrameLocks xmlns:a="http://schemas.openxmlformats.org/drawingml/2006/main" noChangeAspect="1"/>
             </wp:cNvGraphicFramePr>
@@ -1763,21 +1741,119 @@
           <w:sz w:val="20"/>
           <w:szCs w:val="20"/>
         </w:rPr>
-        <w:t xml:space="preserve">Figure 8. Financial Background and Self-Assessment (N = 421)</w:t>
-      </w:r>
-    </w:p>
-    <w:p>
-      <w:pPr>
-        <w:spacing w:line="360" w:after="200"/>
-        <w:jc w:val="left"/>
-      </w:pPr>
-      <w:r>
-        <w:rPr>
-          <w:rFonts w:ascii="Times New Roman" w:cs="Times New Roman" w:eastAsia="Times New Roman" w:hAnsi="Times New Roman"/>
-          <w:sz w:val="24"/>
-          <w:szCs w:val="24"/>
-        </w:rPr>
-        <w:t xml:space="preserve">Figure 8 illustrates two key dimensions of students’ financial context. Panel (a) shows the distribution of self-reported financial stress: the majority of students experience stress sometimes (44.7%) or rarely (22.3%), but nearly a quarter (23.8%) report experiencing financial stress often or always, identifying a subgroup for whom financial literacy instruction carries immediate practical relevance. Panel (b) displays self-rated financial knowledge, where the vast majority rate themselves as moderate (60.1%) or low (25.2%). Only 14.5% rate their knowledge as high or very high. The predominance of moderate self-ratings, combined with the 66.6% average actual score, suggests reasonably calibrated self-assessment across the sample, consistent with the confidence calibration findings in Section 5.7.</w:t>
+        <w:t xml:space="preserve">Figure 3. Sample Demographics (N = 421)</w:t>
+      </w:r>
+    </w:p>
+    <w:p>
+      <w:pPr>
+        <w:spacing w:line="360" w:after="200"/>
+        <w:jc w:val="left"/>
+      </w:pPr>
+      <w:r>
+        <w:rPr>
+          <w:rFonts w:ascii="Times New Roman" w:cs="Times New Roman" w:eastAsia="Times New Roman" w:hAnsi="Times New Roman"/>
+          <w:sz w:val="24"/>
+          <w:szCs w:val="24"/>
+        </w:rPr>
+        <w:t xml:space="preserve">Figure 3 presents the demographic composition of the sample across five dimensions. Panel (a) shows the gender split (58.4% female, 40.2% male). Panel (b) confirms a predominantly traditional-age sample (87.4% aged 20 or under). Panel (c) reveals meaningful racial and ethnic diversity, with White/Caucasian students comprising roughly half (49.4%) and substantial representation from Hispanic/Latino (22.3%), Asian (13.3%), and Black/African American (6.9%) students. Panel (d) shows that nearly three-quarters of students work part-time (72.2%), while panel (e) indicates that nearly one-third are first-generation college students (28.5%). This demographic profile provides meaningful variation for the planned heterogeneity analysis (RQ2) examining whether learning gains differ across student subgroups.</w:t>
+      </w:r>
+    </w:p>
+    <w:p>
+      <w:pPr>
+        <w:pStyle w:val="Heading2"/>
+      </w:pPr>
+      <w:r>
+        <w:t xml:space="preserve">5.3 Financial Background</w:t>
+      </w:r>
+    </w:p>
+    <w:p>
+      <w:pPr>
+        <w:spacing w:line="360" w:after="200"/>
+        <w:jc w:val="left"/>
+      </w:pPr>
+      <w:r>
+        <w:rPr>
+          <w:rFonts w:ascii="Times New Roman" w:cs="Times New Roman" w:eastAsia="Times New Roman" w:hAnsi="Times New Roman"/>
+          <w:sz w:val="24"/>
+          <w:szCs w:val="24"/>
+        </w:rPr>
+        <w:t xml:space="preserve">Students report varying levels of financial stress and self-assessed financial knowledge. The majority experience financial stress sometimes (44.7%) or rarely (22.3%), though nearly a quarter (23.8%) report stress often or always. Self-rated financial knowledge clusters around moderate (60.1%) and low (25.2%), with only 14.5% rating themselves as high or very high. These distributions suggest a sample with meaningful financial concerns and generally modest self-assessed competence, consistent with the target population for an introductory financial literacy course.</w:t>
+      </w:r>
+    </w:p>
+    <w:p>
+      <w:pPr>
+        <w:spacing w:before="240" w:after="120"/>
+        <w:jc w:val="center"/>
+      </w:pPr>
+      <w:r>
+        <w:drawing>
+          <wp:inline distT="0" distB="0" distL="0" distR="0">
+            <wp:extent cx="5715000" cy="3333750"/>
+            <wp:effectExtent t="0" r="0" b="0" l="0"/>
+            <wp:docPr id="1" name="fig8" descr="Financial Background and Self-Assessment (N = 421)" title="Figure 4"/>
+            <wp:cNvGraphicFramePr>
+              <a:graphicFrameLocks xmlns:a="http://schemas.openxmlformats.org/drawingml/2006/main" noChangeAspect="1"/>
+            </wp:cNvGraphicFramePr>
+            <a:graphic xmlns:a="http://schemas.openxmlformats.org/drawingml/2006/main">
+              <a:graphicData uri="http://schemas.openxmlformats.org/drawingml/2006/picture">
+                <pic:pic xmlns:pic="http://schemas.openxmlformats.org/drawingml/2006/picture">
+                  <pic:nvPicPr>
+                    <pic:cNvPr id="0" name="" descr=""/>
+                    <pic:cNvPicPr>
+                      <a:picLocks noChangeAspect="1" noChangeArrowheads="1"/>
+                    </pic:cNvPicPr>
+                  </pic:nvPicPr>
+                  <pic:blipFill>
+                    <a:blip r:embed="rId11" cstate="none"/>
+                    <a:srcRect/>
+                    <a:stretch>
+                      <a:fillRect/>
+                    </a:stretch>
+                  </pic:blipFill>
+                  <pic:spPr bwMode="auto">
+                    <a:xfrm>
+                      <a:off x="0" y="0"/>
+                      <a:ext cx="5715000" cy="3333750"/>
+                    </a:xfrm>
+                    <a:prstGeom prst="rect">
+                      <a:avLst/>
+                    </a:prstGeom>
+                  </pic:spPr>
+                </pic:pic>
+              </a:graphicData>
+            </a:graphic>
+          </wp:inline>
+        </w:drawing>
+      </w:r>
+    </w:p>
+    <w:p>
+      <w:pPr>
+        <w:spacing w:line="360" w:after="120"/>
+        <w:jc w:val="center"/>
+      </w:pPr>
+      <w:r>
+        <w:rPr>
+          <w:rFonts w:ascii="Times New Roman" w:cs="Times New Roman" w:eastAsia="Times New Roman" w:hAnsi="Times New Roman"/>
+          <w:i/>
+          <w:iCs/>
+          <w:sz w:val="20"/>
+          <w:szCs w:val="20"/>
+        </w:rPr>
+        <w:t xml:space="preserve">Figure 4. Financial Background and Self-Assessment (N = 421)</w:t>
+      </w:r>
+    </w:p>
+    <w:p>
+      <w:pPr>
+        <w:spacing w:line="360" w:after="200"/>
+        <w:jc w:val="left"/>
+      </w:pPr>
+      <w:r>
+        <w:rPr>
+          <w:rFonts w:ascii="Times New Roman" w:cs="Times New Roman" w:eastAsia="Times New Roman" w:hAnsi="Times New Roman"/>
+          <w:sz w:val="24"/>
+          <w:szCs w:val="24"/>
+        </w:rPr>
+        <w:t xml:space="preserve">Figure 4 illustrates two key dimensions of students’ financial context. Panel (a) shows the distribution of self-reported financial stress: the majority of students experience stress sometimes (44.7%) or rarely (22.3%), but nearly a quarter (23.8%) report experiencing financial stress often or always, identifying a subgroup for whom financial literacy instruction carries immediate practical relevance. Panel (b) displays self-rated financial knowledge, where the vast majority rate themselves as moderate (60.1%) or low (25.2%). Only 14.5% rate their knowledge as high or very high. The predominance of moderate self-ratings, combined with the 66.6% average actual score, suggests reasonably calibrated self-assessment across the sample, consistent with the confidence calibration findings in Section 5.7.</w:t>
       </w:r>
     </w:p>
     <w:p>
@@ -2103,316 +2179,7 @@
           <wp:inline distT="0" distB="0" distL="0" distR="0">
             <wp:extent cx="5524500" cy="3619500"/>
             <wp:effectExtent t="0" r="0" b="0" l="0"/>
-            <wp:docPr id="1" name="fig1" descr="Pre-Course Overall Score Distribution (N = 421)" title="Figure 1"/>
-            <wp:cNvGraphicFramePr>
-              <a:graphicFrameLocks xmlns:a="http://schemas.openxmlformats.org/drawingml/2006/main" noChangeAspect="1"/>
-            </wp:cNvGraphicFramePr>
-            <a:graphic xmlns:a="http://schemas.openxmlformats.org/drawingml/2006/main">
-              <a:graphicData uri="http://schemas.openxmlformats.org/drawingml/2006/picture">
-                <pic:pic xmlns:pic="http://schemas.openxmlformats.org/drawingml/2006/picture">
-                  <pic:nvPicPr>
-                    <pic:cNvPr id="0" name="" descr=""/>
-                    <pic:cNvPicPr>
-                      <a:picLocks noChangeAspect="1" noChangeArrowheads="1"/>
-                    </pic:cNvPicPr>
-                  </pic:nvPicPr>
-                  <pic:blipFill>
-                    <a:blip r:embed="rId11" cstate="none"/>
-                    <a:srcRect/>
-                    <a:stretch>
-                      <a:fillRect/>
-                    </a:stretch>
-                  </pic:blipFill>
-                  <pic:spPr bwMode="auto">
-                    <a:xfrm>
-                      <a:off x="0" y="0"/>
-                      <a:ext cx="5524500" cy="3619500"/>
-                    </a:xfrm>
-                    <a:prstGeom prst="rect">
-                      <a:avLst/>
-                    </a:prstGeom>
-                  </pic:spPr>
-                </pic:pic>
-              </a:graphicData>
-            </a:graphic>
-          </wp:inline>
-        </w:drawing>
-      </w:r>
-    </w:p>
-    <w:p>
-      <w:pPr>
-        <w:spacing w:line="360" w:after="120"/>
-        <w:jc w:val="center"/>
-      </w:pPr>
-      <w:r>
-        <w:rPr>
-          <w:rFonts w:ascii="Times New Roman" w:cs="Times New Roman" w:eastAsia="Times New Roman" w:hAnsi="Times New Roman"/>
-          <w:i/>
-          <w:iCs/>
-          <w:sz w:val="20"/>
-          <w:szCs w:val="20"/>
-        </w:rPr>
-        <w:t xml:space="preserve">Figure 1. Pre-Course Overall Score Distribution (N = 421)</w:t>
-      </w:r>
-    </w:p>
-    <w:p>
-      <w:pPr>
-        <w:spacing w:line="360" w:after="200"/>
-        <w:jc w:val="left"/>
-      </w:pPr>
-      <w:r>
-        <w:rPr>
-          <w:rFonts w:ascii="Times New Roman" w:cs="Times New Roman" w:eastAsia="Times New Roman" w:hAnsi="Times New Roman"/>
-          <w:sz w:val="24"/>
-          <w:szCs w:val="24"/>
-        </w:rPr>
-        <w:t xml:space="preserve">Figure 1 displays the distribution of overall pre-course scores computed from the 26 knowledge items. The distribution is roughly bell-shaped with a slight left skew. The modal decile is 60-69% (n = 120, highlighted in gold), and the majority of students (67.2%) scored between 50% and 89%. The dashed green line marks the sample mean of 66.6%. Eleven students achieved perfect scores (100%), while 18 students (4.3%) scored below 30%, identifying a small group with substantial baseline knowledge gaps that the course may especially benefit. The overall shape suggests that most students enter QUINN 102 with moderate foundational financial literacy, with meaningful room for improvement in applied domains.</w:t>
-      </w:r>
-    </w:p>
-    <w:p>
-      <w:pPr>
-        <w:pStyle w:val="Heading2"/>
-      </w:pPr>
-      <w:r>
-        <w:t xml:space="preserve">5.5 Domain-Level Performance</w:t>
-      </w:r>
-    </w:p>
-    <w:p>
-      <w:pPr>
-        <w:spacing w:line="360" w:after="200"/>
-        <w:jc w:val="left"/>
-      </w:pPr>
-      <w:r>
-        <w:rPr>
-          <w:rFonts w:ascii="Times New Roman" w:cs="Times New Roman" w:eastAsia="Times New Roman" w:hAnsi="Times New Roman"/>
-          <w:sz w:val="24"/>
-          <w:szCs w:val="24"/>
-        </w:rPr>
-        <w:t xml:space="preserve">Performance varied meaningfully across the three assessment domains, with a 9.5 percentage-point gap between the strongest and weakest domains. The domain-level results are presented in the table below.</w:t>
-      </w:r>
-    </w:p>
-    <w:p>
-      <w:pPr>
-        <w:spacing w:before="240" w:after="120"/>
-        <w:jc w:val="center"/>
-      </w:pPr>
-      <w:r>
-        <w:rPr>
-          <w:rFonts w:ascii="Times New Roman" w:cs="Times New Roman" w:eastAsia="Times New Roman" w:hAnsi="Times New Roman"/>
-          <w:b/>
-          <w:bCs/>
-          <w:i/>
-          <w:iCs/>
-          <w:sz w:val="22"/>
-          <w:szCs w:val="22"/>
-        </w:rPr>
-        <w:t xml:space="preserve">Table 5.2. Domain-Level Performance Summary</w:t>
-      </w:r>
-    </w:p>
-    <w:tbl>
-      <w:tblPr>
-        <w:tblW w:type="dxa" w:w="9360"/>
-        <w:tblBorders>
-          <w:top w:val="single" w:color="CCCCCC" w:sz="1"/>
-          <w:left w:val="single" w:color="CCCCCC" w:sz="1"/>
-          <w:bottom w:val="single" w:color="CCCCCC" w:sz="1"/>
-          <w:right w:val="single" w:color="CCCCCC" w:sz="1"/>
-          <w:insideH w:val="single" w:color="CCCCCC" w:sz="1"/>
-          <w:insideV w:val="single" w:color="CCCCCC" w:sz="1"/>
-        </w:tblBorders>
-        <w:tblLayout w:type="fixed"/>
-        <w:tblCellMar>
-          <w:top w:type="dxa" w:w="60"/>
-          <w:left w:type="dxa" w:w="120"/>
-          <w:bottom w:type="dxa" w:w="60"/>
-          <w:right w:type="dxa" w:w="120"/>
-        </w:tblCellMar>
-      </w:tblPr>
-      <w:tblGrid>
-        <w:gridCol w:w="6240"/>
-        <w:gridCol w:w="3120"/>
-      </w:tblGrid>
-      <w:tr>
-        <w:trPr>
-          <w:tblHeader/>
-        </w:trPr>
-        <w:tc>
-          <w:tcPr>
-            <w:tcW w:type="dxa" w:w="6240"/>
-            <w:shd w:fill="D5E8F0" w:color="auto" w:val="clear"/>
-            <w:vAlign w:val="center"/>
-          </w:tcPr>
-          <w:p>
-            <w:pPr>
-              <w:jc w:val="center"/>
-            </w:pPr>
-            <w:r>
-              <w:rPr>
-                <w:rFonts w:ascii="Times New Roman" w:cs="Times New Roman" w:eastAsia="Times New Roman" w:hAnsi="Times New Roman"/>
-                <w:b/>
-                <w:bCs/>
-                <w:sz w:val="22"/>
-                <w:szCs w:val="22"/>
-              </w:rPr>
-              <w:t xml:space="preserve">Domain</w:t>
-            </w:r>
-          </w:p>
-        </w:tc>
-        <w:tc>
-          <w:tcPr>
-            <w:tcW w:type="dxa" w:w="3120"/>
-            <w:shd w:fill="D5E8F0" w:color="auto" w:val="clear"/>
-            <w:vAlign w:val="center"/>
-          </w:tcPr>
-          <w:p>
-            <w:pPr>
-              <w:jc w:val="center"/>
-            </w:pPr>
-            <w:r>
-              <w:rPr>
-                <w:rFonts w:ascii="Times New Roman" w:cs="Times New Roman" w:eastAsia="Times New Roman" w:hAnsi="Times New Roman"/>
-                <w:b/>
-                <w:bCs/>
-                <w:sz w:val="22"/>
-                <w:szCs w:val="22"/>
-              </w:rPr>
-              <w:t xml:space="preserve">Mean Score</w:t>
-            </w:r>
-          </w:p>
-        </w:tc>
-      </w:tr>
-      <w:tr>
-        <w:tc>
-          <w:tcPr>
-            <w:tcW w:type="dxa" w:w="6240"/>
-            <w:vAlign w:val="center"/>
-          </w:tcPr>
-          <w:p>
-            <w:pPr>
-              <w:jc w:val="center"/>
-            </w:pPr>
-            <w:r>
-              <w:rPr>
-                <w:rFonts w:ascii="Times New Roman" w:cs="Times New Roman" w:eastAsia="Times New Roman" w:hAnsi="Times New Roman"/>
-                <w:sz w:val="22"/>
-                <w:szCs w:val="22"/>
-              </w:rPr>
-              <w:t xml:space="preserve">Behavioral &amp; Risk Management Knowledge</w:t>
-            </w:r>
-          </w:p>
-        </w:tc>
-        <w:tc>
-          <w:tcPr>
-            <w:tcW w:type="dxa" w:w="3120"/>
-            <w:vAlign w:val="center"/>
-          </w:tcPr>
-          <w:p>
-            <w:pPr>
-              <w:jc w:val="center"/>
-            </w:pPr>
-            <w:r>
-              <w:rPr>
-                <w:rFonts w:ascii="Times New Roman" w:cs="Times New Roman" w:eastAsia="Times New Roman" w:hAnsi="Times New Roman"/>
-                <w:sz w:val="22"/>
-                <w:szCs w:val="22"/>
-              </w:rPr>
-              <w:t xml:space="preserve">73.46%</w:t>
-            </w:r>
-          </w:p>
-        </w:tc>
-      </w:tr>
-      <w:tr>
-        <w:tc>
-          <w:tcPr>
-            <w:tcW w:type="dxa" w:w="6240"/>
-            <w:vAlign w:val="center"/>
-          </w:tcPr>
-          <w:p>
-            <w:pPr>
-              <w:jc w:val="center"/>
-            </w:pPr>
-            <w:r>
-              <w:rPr>
-                <w:rFonts w:ascii="Times New Roman" w:cs="Times New Roman" w:eastAsia="Times New Roman" w:hAnsi="Times New Roman"/>
-                <w:sz w:val="22"/>
-                <w:szCs w:val="22"/>
-              </w:rPr>
-              <w:t xml:space="preserve">Borrowing, Interest Rates &amp; Financial Numeracy</w:t>
-            </w:r>
-          </w:p>
-        </w:tc>
-        <w:tc>
-          <w:tcPr>
-            <w:tcW w:type="dxa" w:w="3120"/>
-            <w:vAlign w:val="center"/>
-          </w:tcPr>
-          <w:p>
-            <w:pPr>
-              <w:jc w:val="center"/>
-            </w:pPr>
-            <w:r>
-              <w:rPr>
-                <w:rFonts w:ascii="Times New Roman" w:cs="Times New Roman" w:eastAsia="Times New Roman" w:hAnsi="Times New Roman"/>
-                <w:sz w:val="22"/>
-                <w:szCs w:val="22"/>
-              </w:rPr>
-              <w:t xml:space="preserve">69.33%</w:t>
-            </w:r>
-          </w:p>
-        </w:tc>
-      </w:tr>
-      <w:tr>
-        <w:tc>
-          <w:tcPr>
-            <w:tcW w:type="dxa" w:w="6240"/>
-            <w:vAlign w:val="center"/>
-          </w:tcPr>
-          <w:p>
-            <w:pPr>
-              <w:jc w:val="center"/>
-            </w:pPr>
-            <w:r>
-              <w:rPr>
-                <w:rFonts w:ascii="Times New Roman" w:cs="Times New Roman" w:eastAsia="Times New Roman" w:hAnsi="Times New Roman"/>
-                <w:sz w:val="22"/>
-                <w:szCs w:val="22"/>
-              </w:rPr>
-              <w:t xml:space="preserve">Risk &amp; Return Knowledge</w:t>
-            </w:r>
-          </w:p>
-        </w:tc>
-        <w:tc>
-          <w:tcPr>
-            <w:tcW w:type="dxa" w:w="3120"/>
-            <w:vAlign w:val="center"/>
-          </w:tcPr>
-          <w:p>
-            <w:pPr>
-              <w:jc w:val="center"/>
-            </w:pPr>
-            <w:r>
-              <w:rPr>
-                <w:rFonts w:ascii="Times New Roman" w:cs="Times New Roman" w:eastAsia="Times New Roman" w:hAnsi="Times New Roman"/>
-                <w:sz w:val="22"/>
-                <w:szCs w:val="22"/>
-              </w:rPr>
-              <w:t xml:space="preserve">63.97%</w:t>
-            </w:r>
-          </w:p>
-        </w:tc>
-      </w:tr>
-    </w:tbl>
-    <w:p>
-      <w:pPr>
-        <w:spacing w:before="240" w:after="120"/>
-        <w:jc w:val="center"/>
-      </w:pPr>
-      <w:r>
-        <w:drawing>
-          <wp:inline distT="0" distB="0" distL="0" distR="0">
-            <wp:extent cx="5524500" cy="3619500"/>
-            <wp:effectExtent t="0" r="0" b="0" l="0"/>
-            <wp:docPr id="1" name="fig2" descr="Domain-Level Performance Comparison" title="Figure 2"/>
+            <wp:docPr id="1" name="fig1" descr="Pre-Course Overall Score Distribution (N = 421)" title="Figure 5"/>
             <wp:cNvGraphicFramePr>
               <a:graphicFrameLocks xmlns:a="http://schemas.openxmlformats.org/drawingml/2006/main" noChangeAspect="1"/>
             </wp:cNvGraphicFramePr>
@@ -2461,21 +2228,21 @@
           <w:sz w:val="20"/>
           <w:szCs w:val="20"/>
         </w:rPr>
-        <w:t xml:space="preserve">Figure 2. Domain-Level Performance Comparison</w:t>
-      </w:r>
-    </w:p>
-    <w:p>
-      <w:pPr>
-        <w:spacing w:line="360" w:after="200"/>
-        <w:jc w:val="left"/>
-      </w:pPr>
-      <w:r>
-        <w:rPr>
-          <w:rFonts w:ascii="Times New Roman" w:cs="Times New Roman" w:eastAsia="Times New Roman" w:hAnsi="Times New Roman"/>
-          <w:sz w:val="24"/>
-          <w:szCs w:val="24"/>
-        </w:rPr>
-        <w:t xml:space="preserve">Figure 2 compares average performance across the three assessment domains. Behavioral and Risk Management Knowledge (73.5%) was the strongest domain, driven by high performance on diversification concepts. Borrowing, Interest Rates, and Financial Numeracy (69.3%) fell near the overall average. Risk and Return Knowledge (64.0%) was the weakest domain, reflecting conceptual difficulty with bond pricing, inflation protection, and crisis-related items. Error bars represent standard deviations, indicating substantial within-domain variation. The dashed maroon line marks the overall mean (66.6%). The 9.5 percentage-point gap between the strongest and weakest domains highlights where instructional emphasis may yield the greatest gains.</w:t>
+        <w:t xml:space="preserve">Figure 5. Pre-Course Overall Score Distribution (N = 421)</w:t>
+      </w:r>
+    </w:p>
+    <w:p>
+      <w:pPr>
+        <w:spacing w:line="360" w:after="200"/>
+        <w:jc w:val="left"/>
+      </w:pPr>
+      <w:r>
+        <w:rPr>
+          <w:rFonts w:ascii="Times New Roman" w:cs="Times New Roman" w:eastAsia="Times New Roman" w:hAnsi="Times New Roman"/>
+          <w:sz w:val="24"/>
+          <w:szCs w:val="24"/>
+        </w:rPr>
+        <w:t xml:space="preserve">Figure 5 displays the distribution of overall pre-course scores computed from the 26 knowledge items. The distribution is roughly bell-shaped with a slight left skew. The modal decile is 60-69% (n = 120, highlighted in gold), and the majority of students (67.2%) scored between 50% and 89%. The dashed green line marks the sample mean of 66.6%. Eleven students achieved perfect scores (100%), while 18 students (4.3%) scored below 30%, identifying a small group with substantial baseline knowledge gaps that the course may especially benefit. The overall shape suggests that most students enter QUINN 102 with moderate foundational financial literacy, with meaningful room for improvement in applied domains.</w:t>
       </w:r>
     </w:p>
     <w:p>
@@ -2483,23 +2250,234 @@
         <w:pStyle w:val="Heading2"/>
       </w:pPr>
       <w:r>
-        <w:t xml:space="preserve">5.6 Subdomain Analysis</w:t>
-      </w:r>
-    </w:p>
-    <w:p>
-      <w:pPr>
-        <w:spacing w:line="360" w:after="200"/>
-        <w:jc w:val="left"/>
-      </w:pPr>
-      <w:r>
-        <w:rPr>
-          <w:rFonts w:ascii="Times New Roman" w:cs="Times New Roman" w:eastAsia="Times New Roman" w:hAnsi="Times New Roman"/>
-          <w:sz w:val="24"/>
-          <w:szCs w:val="24"/>
-        </w:rPr>
-        <w:t xml:space="preserve">Item-level analysis reveals a clear hierarchy from foundational concepts (simple interest at 92.9%, compound interest at 88.4%) to applied reasoning tasks (inflation hedge at 24.0%, compound growth at 38.7%). This pattern indicates that students possess solid grasp of basic financial principles but struggle with multi-step reasoning and real-world application scenarios.</w:t>
-      </w:r>
-    </w:p>
+        <w:t xml:space="preserve">5.5 Domain-Level Performance</w:t>
+      </w:r>
+    </w:p>
+    <w:p>
+      <w:pPr>
+        <w:spacing w:line="360" w:after="200"/>
+        <w:jc w:val="left"/>
+      </w:pPr>
+      <w:r>
+        <w:rPr>
+          <w:rFonts w:ascii="Times New Roman" w:cs="Times New Roman" w:eastAsia="Times New Roman" w:hAnsi="Times New Roman"/>
+          <w:sz w:val="24"/>
+          <w:szCs w:val="24"/>
+        </w:rPr>
+        <w:t xml:space="preserve">Performance varied meaningfully across the three assessment domains, with a 9.5 percentage-point gap between the strongest and weakest domains. The domain-level results are presented in the table below.</w:t>
+      </w:r>
+    </w:p>
+    <w:p>
+      <w:pPr>
+        <w:spacing w:before="240" w:after="120"/>
+        <w:jc w:val="center"/>
+      </w:pPr>
+      <w:r>
+        <w:rPr>
+          <w:rFonts w:ascii="Times New Roman" w:cs="Times New Roman" w:eastAsia="Times New Roman" w:hAnsi="Times New Roman"/>
+          <w:b/>
+          <w:bCs/>
+          <w:i/>
+          <w:iCs/>
+          <w:sz w:val="22"/>
+          <w:szCs w:val="22"/>
+        </w:rPr>
+        <w:t xml:space="preserve">Table 5.2. Domain-Level Performance Summary</w:t>
+      </w:r>
+    </w:p>
+    <w:tbl>
+      <w:tblPr>
+        <w:tblW w:type="dxa" w:w="9360"/>
+        <w:tblBorders>
+          <w:top w:val="single" w:color="CCCCCC" w:sz="1"/>
+          <w:left w:val="single" w:color="CCCCCC" w:sz="1"/>
+          <w:bottom w:val="single" w:color="CCCCCC" w:sz="1"/>
+          <w:right w:val="single" w:color="CCCCCC" w:sz="1"/>
+          <w:insideH w:val="single" w:color="CCCCCC" w:sz="1"/>
+          <w:insideV w:val="single" w:color="CCCCCC" w:sz="1"/>
+        </w:tblBorders>
+        <w:tblLayout w:type="fixed"/>
+        <w:tblCellMar>
+          <w:top w:type="dxa" w:w="60"/>
+          <w:left w:type="dxa" w:w="120"/>
+          <w:bottom w:type="dxa" w:w="60"/>
+          <w:right w:type="dxa" w:w="120"/>
+        </w:tblCellMar>
+      </w:tblPr>
+      <w:tblGrid>
+        <w:gridCol w:w="6240"/>
+        <w:gridCol w:w="3120"/>
+      </w:tblGrid>
+      <w:tr>
+        <w:trPr>
+          <w:tblHeader/>
+        </w:trPr>
+        <w:tc>
+          <w:tcPr>
+            <w:tcW w:type="dxa" w:w="6240"/>
+            <w:shd w:fill="D5E8F0" w:color="auto" w:val="clear"/>
+            <w:vAlign w:val="center"/>
+          </w:tcPr>
+          <w:p>
+            <w:pPr>
+              <w:jc w:val="center"/>
+            </w:pPr>
+            <w:r>
+              <w:rPr>
+                <w:rFonts w:ascii="Times New Roman" w:cs="Times New Roman" w:eastAsia="Times New Roman" w:hAnsi="Times New Roman"/>
+                <w:b/>
+                <w:bCs/>
+                <w:sz w:val="22"/>
+                <w:szCs w:val="22"/>
+              </w:rPr>
+              <w:t xml:space="preserve">Domain</w:t>
+            </w:r>
+          </w:p>
+        </w:tc>
+        <w:tc>
+          <w:tcPr>
+            <w:tcW w:type="dxa" w:w="3120"/>
+            <w:shd w:fill="D5E8F0" w:color="auto" w:val="clear"/>
+            <w:vAlign w:val="center"/>
+          </w:tcPr>
+          <w:p>
+            <w:pPr>
+              <w:jc w:val="center"/>
+            </w:pPr>
+            <w:r>
+              <w:rPr>
+                <w:rFonts w:ascii="Times New Roman" w:cs="Times New Roman" w:eastAsia="Times New Roman" w:hAnsi="Times New Roman"/>
+                <w:b/>
+                <w:bCs/>
+                <w:sz w:val="22"/>
+                <w:szCs w:val="22"/>
+              </w:rPr>
+              <w:t xml:space="preserve">Mean Score</w:t>
+            </w:r>
+          </w:p>
+        </w:tc>
+      </w:tr>
+      <w:tr>
+        <w:tc>
+          <w:tcPr>
+            <w:tcW w:type="dxa" w:w="6240"/>
+            <w:vAlign w:val="center"/>
+          </w:tcPr>
+          <w:p>
+            <w:pPr>
+              <w:jc w:val="center"/>
+            </w:pPr>
+            <w:r>
+              <w:rPr>
+                <w:rFonts w:ascii="Times New Roman" w:cs="Times New Roman" w:eastAsia="Times New Roman" w:hAnsi="Times New Roman"/>
+                <w:sz w:val="22"/>
+                <w:szCs w:val="22"/>
+              </w:rPr>
+              <w:t xml:space="preserve">Behavioral &amp; Risk Management Knowledge</w:t>
+            </w:r>
+          </w:p>
+        </w:tc>
+        <w:tc>
+          <w:tcPr>
+            <w:tcW w:type="dxa" w:w="3120"/>
+            <w:vAlign w:val="center"/>
+          </w:tcPr>
+          <w:p>
+            <w:pPr>
+              <w:jc w:val="center"/>
+            </w:pPr>
+            <w:r>
+              <w:rPr>
+                <w:rFonts w:ascii="Times New Roman" w:cs="Times New Roman" w:eastAsia="Times New Roman" w:hAnsi="Times New Roman"/>
+                <w:sz w:val="22"/>
+                <w:szCs w:val="22"/>
+              </w:rPr>
+              <w:t xml:space="preserve">73.46%</w:t>
+            </w:r>
+          </w:p>
+        </w:tc>
+      </w:tr>
+      <w:tr>
+        <w:tc>
+          <w:tcPr>
+            <w:tcW w:type="dxa" w:w="6240"/>
+            <w:vAlign w:val="center"/>
+          </w:tcPr>
+          <w:p>
+            <w:pPr>
+              <w:jc w:val="center"/>
+            </w:pPr>
+            <w:r>
+              <w:rPr>
+                <w:rFonts w:ascii="Times New Roman" w:cs="Times New Roman" w:eastAsia="Times New Roman" w:hAnsi="Times New Roman"/>
+                <w:sz w:val="22"/>
+                <w:szCs w:val="22"/>
+              </w:rPr>
+              <w:t xml:space="preserve">Borrowing, Interest Rates &amp; Financial Numeracy</w:t>
+            </w:r>
+          </w:p>
+        </w:tc>
+        <w:tc>
+          <w:tcPr>
+            <w:tcW w:type="dxa" w:w="3120"/>
+            <w:vAlign w:val="center"/>
+          </w:tcPr>
+          <w:p>
+            <w:pPr>
+              <w:jc w:val="center"/>
+            </w:pPr>
+            <w:r>
+              <w:rPr>
+                <w:rFonts w:ascii="Times New Roman" w:cs="Times New Roman" w:eastAsia="Times New Roman" w:hAnsi="Times New Roman"/>
+                <w:sz w:val="22"/>
+                <w:szCs w:val="22"/>
+              </w:rPr>
+              <w:t xml:space="preserve">69.33%</w:t>
+            </w:r>
+          </w:p>
+        </w:tc>
+      </w:tr>
+      <w:tr>
+        <w:tc>
+          <w:tcPr>
+            <w:tcW w:type="dxa" w:w="6240"/>
+            <w:vAlign w:val="center"/>
+          </w:tcPr>
+          <w:p>
+            <w:pPr>
+              <w:jc w:val="center"/>
+            </w:pPr>
+            <w:r>
+              <w:rPr>
+                <w:rFonts w:ascii="Times New Roman" w:cs="Times New Roman" w:eastAsia="Times New Roman" w:hAnsi="Times New Roman"/>
+                <w:sz w:val="22"/>
+                <w:szCs w:val="22"/>
+              </w:rPr>
+              <w:t xml:space="preserve">Risk &amp; Return Knowledge</w:t>
+            </w:r>
+          </w:p>
+        </w:tc>
+        <w:tc>
+          <w:tcPr>
+            <w:tcW w:type="dxa" w:w="3120"/>
+            <w:vAlign w:val="center"/>
+          </w:tcPr>
+          <w:p>
+            <w:pPr>
+              <w:jc w:val="center"/>
+            </w:pPr>
+            <w:r>
+              <w:rPr>
+                <w:rFonts w:ascii="Times New Roman" w:cs="Times New Roman" w:eastAsia="Times New Roman" w:hAnsi="Times New Roman"/>
+                <w:sz w:val="22"/>
+                <w:szCs w:val="22"/>
+              </w:rPr>
+              <w:t xml:space="preserve">63.97%</w:t>
+            </w:r>
+          </w:p>
+        </w:tc>
+      </w:tr>
+    </w:tbl>
     <w:p>
       <w:pPr>
         <w:spacing w:before="240" w:after="120"/>
@@ -2510,7 +2488,7 @@
           <wp:inline distT="0" distB="0" distL="0" distR="0">
             <wp:extent cx="5524500" cy="3619500"/>
             <wp:effectExtent t="0" r="0" b="0" l="0"/>
-            <wp:docPr id="1" name="fig6" descr="Item Difficulty Ranking by Subdomain (N = 421)" title="Figure 6"/>
+            <wp:docPr id="1" name="fig2" descr="Domain-Level Performance Comparison" title="Figure 6"/>
             <wp:cNvGraphicFramePr>
               <a:graphicFrameLocks xmlns:a="http://schemas.openxmlformats.org/drawingml/2006/main" noChangeAspect="1"/>
             </wp:cNvGraphicFramePr>
@@ -2559,21 +2537,21 @@
           <w:sz w:val="20"/>
           <w:szCs w:val="20"/>
         </w:rPr>
-        <w:t xml:space="preserve">Figure 6. Item Difficulty Ranking by Subdomain (N = 421)</w:t>
-      </w:r>
-    </w:p>
-    <w:p>
-      <w:pPr>
-        <w:spacing w:line="360" w:after="200"/>
-        <w:jc w:val="left"/>
-      </w:pPr>
-      <w:r>
-        <w:rPr>
-          <w:rFonts w:ascii="Times New Roman" w:cs="Times New Roman" w:eastAsia="Times New Roman" w:hAnsi="Times New Roman"/>
-          <w:sz w:val="24"/>
-          <w:szCs w:val="24"/>
-        </w:rPr>
-        <w:t xml:space="preserve">Figure 6 ranks all 21 assessed subdomains from easiest (top) to hardest (bottom). Color coding distinguishes three performance tiers: green indicates strong performance (&gt;=70% correct), gold indicates moderate performance (50-69%), and coral indicates weak performance (&lt;50%). A clear gap separates foundational concepts at the top -- simple interest (92.9%), compound interest (88.4%), impulse control (86.9%) -- from applied reasoning at the bottom -- inflation hedge (24.0%), compound growth (38.7%), return ranking (40.6%). This pattern suggests that students enter the course with solid grasp of basic financial principles but lack the ability to apply these concepts to real-world scenarios involving inflation protection, bond pricing, and multi-step financial reasoning. The dashed maroon line marks the overall mean (66.6%), with 10 subdomains above and 11 below this threshold.</w:t>
+        <w:t xml:space="preserve">Figure 6. Domain-Level Performance Comparison</w:t>
+      </w:r>
+    </w:p>
+    <w:p>
+      <w:pPr>
+        <w:spacing w:line="360" w:after="200"/>
+        <w:jc w:val="left"/>
+      </w:pPr>
+      <w:r>
+        <w:rPr>
+          <w:rFonts w:ascii="Times New Roman" w:cs="Times New Roman" w:eastAsia="Times New Roman" w:hAnsi="Times New Roman"/>
+          <w:sz w:val="24"/>
+          <w:szCs w:val="24"/>
+        </w:rPr>
+        <w:t xml:space="preserve">Figure 6 compares average performance across the three assessment domains. Behavioral and Risk Management Knowledge (73.5%) was the strongest domain, driven by high performance on diversification concepts. Borrowing, Interest Rates, and Financial Numeracy (69.3%) fell near the overall average. Risk and Return Knowledge (64.0%) was the weakest domain, reflecting conceptual difficulty with bond pricing, inflation protection, and crisis-related items. Error bars represent standard deviations, indicating substantial within-domain variation. The dashed maroon line marks the overall mean (66.6%). The 9.5 percentage-point gap between the strongest and weakest domains highlights where instructional emphasis may yield the greatest gains.</w:t>
       </w:r>
     </w:p>
     <w:p>
@@ -2581,21 +2559,21 @@
         <w:pStyle w:val="Heading2"/>
       </w:pPr>
       <w:r>
-        <w:t xml:space="preserve">5.7 Confidence Calibration</w:t>
-      </w:r>
-    </w:p>
-    <w:p>
-      <w:pPr>
-        <w:spacing w:line="360" w:after="200"/>
-        <w:jc w:val="left"/>
-      </w:pPr>
-      <w:r>
-        <w:rPr>
-          <w:rFonts w:ascii="Times New Roman" w:cs="Times New Roman" w:eastAsia="Times New Roman" w:hAnsi="Times New Roman"/>
-          <w:sz w:val="24"/>
-          <w:szCs w:val="24"/>
-        </w:rPr>
-        <w:t xml:space="preserve">Confidence calibration analysis categorizes students based on the overconfidence index (OC), defined as the difference between average self-reported confidence and actual accuracy. The largest group is well-calibrated (41.1%, n = 173), followed by underconfident (32.8%, n = 138), moderately overconfident (19.0%, n = 79), and highly overconfident (7.1%, n = 29). The slightly negative mean OC index (-0.017) indicates that the sample was, on average, marginally underconfident, a profile that is constructive for learning engagement.</w:t>
+        <w:t xml:space="preserve">5.6 Subdomain Analysis</w:t>
+      </w:r>
+    </w:p>
+    <w:p>
+      <w:pPr>
+        <w:spacing w:line="360" w:after="200"/>
+        <w:jc w:val="left"/>
+      </w:pPr>
+      <w:r>
+        <w:rPr>
+          <w:rFonts w:ascii="Times New Roman" w:cs="Times New Roman" w:eastAsia="Times New Roman" w:hAnsi="Times New Roman"/>
+          <w:sz w:val="24"/>
+          <w:szCs w:val="24"/>
+        </w:rPr>
+        <w:t xml:space="preserve">Item-level analysis reveals a clear hierarchy from foundational concepts (simple interest at 92.9%, compound interest at 88.4%) to applied reasoning tasks (inflation hedge at 24.0%, compound growth at 38.7%). This pattern indicates that students possess solid grasp of basic financial principles but struggle with multi-step reasoning and real-world application scenarios.</w:t>
       </w:r>
     </w:p>
     <w:p>
@@ -2608,7 +2586,7 @@
           <wp:inline distT="0" distB="0" distL="0" distR="0">
             <wp:extent cx="5524500" cy="3619500"/>
             <wp:effectExtent t="0" r="0" b="0" l="0"/>
-            <wp:docPr id="1" name="fig5" descr="Confidence Calibration Categories (N = 421)" title="Figure 5"/>
+            <wp:docPr id="1" name="fig6" descr="Item Difficulty Ranking by Subdomain (N = 421)" title="Figure 7"/>
             <wp:cNvGraphicFramePr>
               <a:graphicFrameLocks xmlns:a="http://schemas.openxmlformats.org/drawingml/2006/main" noChangeAspect="1"/>
             </wp:cNvGraphicFramePr>
@@ -2657,21 +2635,119 @@
           <w:sz w:val="20"/>
           <w:szCs w:val="20"/>
         </w:rPr>
-        <w:t xml:space="preserve">Figure 5. Confidence Calibration Categories (N = 421)</w:t>
-      </w:r>
-    </w:p>
-    <w:p>
-      <w:pPr>
-        <w:spacing w:line="360" w:after="200"/>
-        <w:jc w:val="left"/>
-      </w:pPr>
-      <w:r>
-        <w:rPr>
-          <w:rFonts w:ascii="Times New Roman" w:cs="Times New Roman" w:eastAsia="Times New Roman" w:hAnsi="Times New Roman"/>
-          <w:sz w:val="24"/>
-          <w:szCs w:val="24"/>
-        </w:rPr>
-        <w:t xml:space="preserve">Figure 5 presents the distribution of students across four confidence calibration categories based on the overconfidence index (OC), defined as the difference between average confidence and actual accuracy. The horizontal bar chart (left) shows both percentages and counts, while the pie chart (right) illustrates the proportional distribution. The largest group is well-calibrated (41.1%, n = 173), meaning their confidence closely matched their performance (OC within +/-10%). Nearly a third were underconfident (32.8%, n = 138), systematically underestimating their abilities. Moderately overconfident students (19.0%, n = 79) and highly overconfident students (7.1%, n = 29) together account for 26.1% of the sample. The slightly negative mean OC index (-0.017) indicates that the sample was, on average, marginally underconfident. This profile is constructive for learning, as overconfidence can reduce engagement with material perceived as already mastered.</w:t>
+        <w:t xml:space="preserve">Figure 7. Item Difficulty Ranking by Subdomain (N = 421)</w:t>
+      </w:r>
+    </w:p>
+    <w:p>
+      <w:pPr>
+        <w:spacing w:line="360" w:after="200"/>
+        <w:jc w:val="left"/>
+      </w:pPr>
+      <w:r>
+        <w:rPr>
+          <w:rFonts w:ascii="Times New Roman" w:cs="Times New Roman" w:eastAsia="Times New Roman" w:hAnsi="Times New Roman"/>
+          <w:sz w:val="24"/>
+          <w:szCs w:val="24"/>
+        </w:rPr>
+        <w:t xml:space="preserve">Figure 7 ranks all 21 assessed subdomains from easiest (top) to hardest (bottom). Color coding distinguishes three performance tiers: green indicates strong performance (&gt;=70% correct), gold indicates moderate performance (50-69%), and coral indicates weak performance (&lt;50%). A clear gap separates foundational concepts at the top -- simple interest (92.9%), compound interest (88.4%), impulse control (86.9%) -- from applied reasoning at the bottom -- inflation hedge (24.0%), compound growth (38.7%), return ranking (40.6%). This pattern suggests that students enter the course with solid grasp of basic financial principles but lack the ability to apply these concepts to real-world scenarios involving inflation protection, bond pricing, and multi-step financial reasoning. The dashed maroon line marks the overall mean (66.6%), with 10 subdomains above and 11 below this threshold.</w:t>
+      </w:r>
+    </w:p>
+    <w:p>
+      <w:pPr>
+        <w:pStyle w:val="Heading2"/>
+      </w:pPr>
+      <w:r>
+        <w:t xml:space="preserve">5.7 Confidence Calibration</w:t>
+      </w:r>
+    </w:p>
+    <w:p>
+      <w:pPr>
+        <w:spacing w:line="360" w:after="200"/>
+        <w:jc w:val="left"/>
+      </w:pPr>
+      <w:r>
+        <w:rPr>
+          <w:rFonts w:ascii="Times New Roman" w:cs="Times New Roman" w:eastAsia="Times New Roman" w:hAnsi="Times New Roman"/>
+          <w:sz w:val="24"/>
+          <w:szCs w:val="24"/>
+        </w:rPr>
+        <w:t xml:space="preserve">Confidence calibration analysis categorizes students based on the overconfidence index (OC), defined as the difference between average self-reported confidence and actual accuracy. The largest group is well-calibrated (41.1%, n = 173), followed by underconfident (32.8%, n = 138), moderately overconfident (19.0%, n = 79), and highly overconfident (7.1%, n = 29). The slightly negative mean OC index (-0.017) indicates that the sample was, on average, marginally underconfident, a profile that is constructive for learning engagement.</w:t>
+      </w:r>
+    </w:p>
+    <w:p>
+      <w:pPr>
+        <w:spacing w:before="240" w:after="120"/>
+        <w:jc w:val="center"/>
+      </w:pPr>
+      <w:r>
+        <w:drawing>
+          <wp:inline distT="0" distB="0" distL="0" distR="0">
+            <wp:extent cx="5524500" cy="3619500"/>
+            <wp:effectExtent t="0" r="0" b="0" l="0"/>
+            <wp:docPr id="1" name="fig5" descr="Confidence Calibration Categories (N = 421)" title="Figure 8"/>
+            <wp:cNvGraphicFramePr>
+              <a:graphicFrameLocks xmlns:a="http://schemas.openxmlformats.org/drawingml/2006/main" noChangeAspect="1"/>
+            </wp:cNvGraphicFramePr>
+            <a:graphic xmlns:a="http://schemas.openxmlformats.org/drawingml/2006/main">
+              <a:graphicData uri="http://schemas.openxmlformats.org/drawingml/2006/picture">
+                <pic:pic xmlns:pic="http://schemas.openxmlformats.org/drawingml/2006/picture">
+                  <pic:nvPicPr>
+                    <pic:cNvPr id="0" name="" descr=""/>
+                    <pic:cNvPicPr>
+                      <a:picLocks noChangeAspect="1" noChangeArrowheads="1"/>
+                    </pic:cNvPicPr>
+                  </pic:nvPicPr>
+                  <pic:blipFill>
+                    <a:blip r:embed="rId15" cstate="none"/>
+                    <a:srcRect/>
+                    <a:stretch>
+                      <a:fillRect/>
+                    </a:stretch>
+                  </pic:blipFill>
+                  <pic:spPr bwMode="auto">
+                    <a:xfrm>
+                      <a:off x="0" y="0"/>
+                      <a:ext cx="5524500" cy="3619500"/>
+                    </a:xfrm>
+                    <a:prstGeom prst="rect">
+                      <a:avLst/>
+                    </a:prstGeom>
+                  </pic:spPr>
+                </pic:pic>
+              </a:graphicData>
+            </a:graphic>
+          </wp:inline>
+        </w:drawing>
+      </w:r>
+    </w:p>
+    <w:p>
+      <w:pPr>
+        <w:spacing w:line="360" w:after="120"/>
+        <w:jc w:val="center"/>
+      </w:pPr>
+      <w:r>
+        <w:rPr>
+          <w:rFonts w:ascii="Times New Roman" w:cs="Times New Roman" w:eastAsia="Times New Roman" w:hAnsi="Times New Roman"/>
+          <w:i/>
+          <w:iCs/>
+          <w:sz w:val="20"/>
+          <w:szCs w:val="20"/>
+        </w:rPr>
+        <w:t xml:space="preserve">Figure 8. Confidence Calibration Categories (N = 421)</w:t>
+      </w:r>
+    </w:p>
+    <w:p>
+      <w:pPr>
+        <w:spacing w:line="360" w:after="200"/>
+        <w:jc w:val="left"/>
+      </w:pPr>
+      <w:r>
+        <w:rPr>
+          <w:rFonts w:ascii="Times New Roman" w:cs="Times New Roman" w:eastAsia="Times New Roman" w:hAnsi="Times New Roman"/>
+          <w:sz w:val="24"/>
+          <w:szCs w:val="24"/>
+        </w:rPr>
+        <w:t xml:space="preserve">Figure 8 presents the distribution of students across four confidence calibration categories based on the overconfidence index (OC), defined as the difference between average confidence and actual accuracy. The horizontal bar chart (left) shows both percentages and counts, while the pie chart (right) illustrates the proportional distribution. The largest group is well-calibrated (41.1%, n = 173), meaning their confidence closely matched their performance (OC within +/-10%). Nearly a third were underconfident (32.8%, n = 138), systematically underestimating their abilities. Moderately overconfident students (19.0%, n = 79) and highly overconfident students (7.1%, n = 29) together account for 26.1% of the sample. The slightly negative mean OC index (-0.017) indicates that the sample was, on average, marginally underconfident. This profile is constructive for learning, as overconfidence can reduce engagement with material perceived as already mastered.</w:t>
       </w:r>
     </w:p>
     <w:p>
@@ -4195,7 +4271,7 @@
       <w:headerReference w:type="default" r:id="rId6"/>
       <w:footerReference w:type="default" r:id="rId7"/>
       <w:type w:val="nextPage"/>
-      <w:pgSz w:w="11906" w:h="16838" w:orient="portrait"/>
+      <w:pgSz w:w="12240" w:h="15840" w:orient="portrait"/>
       <w:pgMar w:top="1440" w:right="1440" w:bottom="1440" w:left="1440" w:header="708" w:footer="708" w:gutter="0"/>
       <w:pgNumType/>
       <w:docGrid w:linePitch="360"/>

</xml_diff>

<commit_message>
docs: organize repository for academic citation
- Add Apache 2.0 LICENSE
- Add CITATION.cff for GitHub citation button
- Rewrite README.md with research-focused content (abstract, RQs,
  assessment structure, baseline results, citation section)
- Move development content to docs/DEVELOPMENT.md
- Refresh data exports: replace 109-student CSV with complete
  421-student response-level data (21,275 rows)
- Regenerate SDM open answers CSV (953 responses)
- Add data quality audit note to paper limitations section
- Add docx dependency for Word document generation
</commit_message>
<xml_diff>
--- a/exports/paper.docx
+++ b/exports/paper.docx
@@ -720,7 +720,7 @@
           <w:sz w:val="24"/>
           <w:szCs w:val="24"/>
         </w:rPr>
-        <w:t xml:space="preserve">The assessment is administered through a custom-built Next.js web application deployed on a secure virtual private server. The platform handles student authentication via anonymous access codes, enforces one-attempt-per-student logic, implements the adaptive SDM-10 routing algorithm, and stores all response data in a PostgreSQL database. Timestamped response logs enable computation of item-level and section-level duration metrics for quality control and engagement analysis.</w:t>
+        <w:t xml:space="preserve">The assessment is administered through a custom-built Next.js web application deployed on a secure virtual private server. The platform handles student authentication via anonymous access codes, enforces one-attempt-per-student logic, implements the adaptive SDM-10 routing algorithm, and stores all response data in a PostgreSQL database. Timestamped response logs enable computation of item-level and section-level duration metrics for quality control and engagement analysis. The complete platform source code, assessment instruments, and data processing scripts are publicly available in the project repository (Boulaid, 2026).</w:t>
       </w:r>
     </w:p>
     <w:p>
@@ -3229,6 +3229,20 @@
           <w:szCs w:val="24"/>
         </w:rPr>
         <w:t xml:space="preserve">Allgood, S., &amp; Walstad, W. B. (2016). The effects of perceived and actual financial literacy on financial behaviors. Economic Inquiry, 54(1), 675–697.</w:t>
+      </w:r>
+    </w:p>
+    <w:p>
+      <w:pPr>
+        <w:spacing w:line="360" w:after="200"/>
+        <w:jc w:val="left"/>
+      </w:pPr>
+      <w:r>
+        <w:rPr>
+          <w:rFonts w:ascii="Times New Roman" w:cs="Times New Roman" w:eastAsia="Times New Roman" w:hAnsi="Times New Roman"/>
+          <w:sz w:val="24"/>
+          <w:szCs w:val="24"/>
+        </w:rPr>
+        <w:t xml:space="preserve">Boulaid, G. (2026). Financial Literacy Toolkit: Assessment platform for QUINN 102 [Source code]. GitHub. https://github.com/GuillaumeBld/Financial-Literacy-Toolkit</w:t>
       </w:r>
     </w:p>
     <w:p>

</xml_diff>

<commit_message>
docs: add AI disclosure section, revert AI censoring, add LLM scoring citations
- Revert "Automated Scoring Pipeline" back to "AI-Assisted Scoring Pipeline"
  with explicit Claude 3.5 Sonnet / OpenRouter API disclosure
- Add "Declaration of AI and AI-Assisted Technologies" section following
  COPE/AMEE 2025 best practices (platform dev, scoring, manuscript)
- Add 4 new references: Flodén (2025, BERJ), Mizumoto & Eguchi (2024),
  Olivos et al. (2025, Teaching Sociology), Yavuz (2025, BJET)
- Contrast generic LLM grading limitations with our item-specific approach
- Add SDM10_AI_Scoring_Implementation_Prompt.md for scoring pipeline setup
- Regenerate paper.docx (41 pages, 22 references)
</commit_message>
<xml_diff>
--- a/exports/paper.docx
+++ b/exports/paper.docx
@@ -1755,7 +1755,7 @@
           <w:sz w:val="24"/>
           <w:szCs w:val="24"/>
         </w:rPr>
-        <w:t xml:space="preserve">Open-ended responses are scored using a large language model (Claude Sonnet, Anthropic) accessed via the OpenRouter API. Each response is processed with an item-specific prompt containing the anchor question context, the student’s selected answer and confidence level, applicable misconception families with calibration examples, and a decision tree for three-way classification. The model returns a structured JSON classification including diagnosis type, Layer 1 code, Layer 2 tag, credit score (0/50/100 measuring diagnostic value), classification confidence, an evidence quote, and a reasoning summary. Low-confidence classifications are flagged for human review. The AI is used only for scoring; all item selection decisions are deterministic and rule-based.</w:t>
+        <w:t xml:space="preserve">Open-ended responses are scored using a large language model (Claude 3.5 Sonnet, Anthropic) accessed via the OpenRouter API. Each response is processed with an item-specific prompt containing the anchor question context, the student’s selected answer and confidence level, applicable misconception families with calibration examples, and a decision tree for three-way classification. The model returns a structured JSON classification including diagnosis type, Layer 1 code, Layer 2 tag, credit score (0/50/100 measuring diagnostic value), classification confidence, an evidence quote, and a reasoning summary. Low-confidence classifications (approximately 5–10% of responses) are flagged for human review and adjudication by the course instructor. Prior work on LLM-based grading in business education found limited reliability when applying generic prompts to domain-specific content (Flodén, 2025). To address this, our pipeline uses item-specific prompts with calibration examples, a structured misconception taxonomy, and explicit decision trees, following the collaborative human-AI scoring model in which the LLM serves as a second rater whose low-confidence outputs are flagged for instructor adjudication (Olivos, Kamelski, &amp; Ascui-Gac, 2025). This approach follows established practices for LLM-based assessment scoring (Mizumoto &amp; Eguchi, 2024; Yavuz, 2025). All item selection decisions are deterministic and rule-based; the language model is used only for open-ended response classification.</w:t>
       </w:r>
     </w:p>
     <w:p>
@@ -5362,7 +5362,7 @@
           <w:sz w:val="24"/>
           <w:szCs w:val="24"/>
         </w:rPr>
-        <w:t xml:space="preserve">Goyal, K., &amp; Kumar, S. (2021). Financial literacy: A systematic review and bibliometric analysis. International Journal of Consumer Studies, 45(1), 80–105.</w:t>
+        <w:t xml:space="preserve">Flodén, J. (2025). Grading exams using large language models: A comparison between human and AI grading of exams in higher education using ChatGPT. British Educational Research Journal, 51(1), 201–224.</w:t>
       </w:r>
     </w:p>
     <w:p>
@@ -5376,7 +5376,7 @@
           <w:sz w:val="24"/>
           <w:szCs w:val="24"/>
         </w:rPr>
-        <w:t xml:space="preserve">Hastings, J. S., Madrian, B. C., &amp; Skimmyhorn, W. L. (2013). Financial literacy, financial education, and economic outcomes. Annual Review of Economics, 5, 347–373.</w:t>
+        <w:t xml:space="preserve">Goyal, K., &amp; Kumar, S. (2021). Financial literacy: A systematic review and bibliometric analysis. International Journal of Consumer Studies, 45(1), 80–105.</w:t>
       </w:r>
     </w:p>
     <w:p>
@@ -5390,7 +5390,7 @@
           <w:sz w:val="24"/>
           <w:szCs w:val="24"/>
         </w:rPr>
-        <w:t xml:space="preserve">Huston, S. J. (2010). Measuring financial literacy. Journal of Consumer Affairs, 44(2), 296–316.</w:t>
+        <w:t xml:space="preserve">Hastings, J. S., Madrian, B. C., &amp; Skimmyhorn, W. L. (2013). Financial literacy, financial education, and economic outcomes. Annual Review of Economics, 5, 347–373.</w:t>
       </w:r>
     </w:p>
     <w:p>
@@ -5404,7 +5404,7 @@
           <w:sz w:val="24"/>
           <w:szCs w:val="24"/>
         </w:rPr>
-        <w:t xml:space="preserve">Ipatova, E., &amp; Merheb, K. (2023). Re-examining the Dunning-Kruger effect: Objective vs. subjective financial literacy in the young and overconfident (SSRN Working Paper No. 4645450).</w:t>
+        <w:t xml:space="preserve">Huston, S. J. (2010). Measuring financial literacy. Journal of Consumer Affairs, 44(2), 296–316.</w:t>
       </w:r>
     </w:p>
     <w:p>
@@ -5418,7 +5418,7 @@
           <w:sz w:val="24"/>
           <w:szCs w:val="24"/>
         </w:rPr>
-        <w:t xml:space="preserve">Kaiser, T., Lusardi, A., Menkhoff, L., &amp; Urban, C. (2022). Financial education affects financial knowledge and downstream behaviors. Journal of Financial Economics, 145(2), 255–272.</w:t>
+        <w:t xml:space="preserve">Ipatova, E., &amp; Merheb, K. (2023). Re-examining the Dunning-Kruger effect: Objective vs. subjective financial literacy in the young and overconfident (SSRN Working Paper No. 4645450).</w:t>
       </w:r>
     </w:p>
     <w:p>
@@ -5432,7 +5432,7 @@
           <w:sz w:val="24"/>
           <w:szCs w:val="24"/>
         </w:rPr>
-        <w:t xml:space="preserve">Kramer, M. M. (2016). Financial literacy, confidence and financial advice seeking. Journal of Economic Behavior &amp; Organization, 131(Part A), 198–217.</w:t>
+        <w:t xml:space="preserve">Kaiser, T., Lusardi, A., Menkhoff, L., &amp; Urban, C. (2022). Financial education affects financial knowledge and downstream behaviors. Journal of Financial Economics, 145(2), 255–272.</w:t>
       </w:r>
     </w:p>
     <w:p>
@@ -5446,7 +5446,7 @@
           <w:sz w:val="24"/>
           <w:szCs w:val="24"/>
         </w:rPr>
-        <w:t xml:space="preserve">Lusardi, A. (2019). Financial literacy and the need for financial education: Evidence and implications. Swiss Journal of Economics and Statistics, 155, Article 1.</w:t>
+        <w:t xml:space="preserve">Kramer, M. M. (2016). Financial literacy, confidence and financial advice seeking. Journal of Economic Behavior &amp; Organization, 131(Part A), 198–217.</w:t>
       </w:r>
     </w:p>
     <w:p>
@@ -5460,7 +5460,7 @@
           <w:sz w:val="24"/>
           <w:szCs w:val="24"/>
         </w:rPr>
-        <w:t xml:space="preserve">Lusardi, A., &amp; Mitchell, O. S. (2014). The economic importance of financial literacy: Theory and evidence. Journal of Economic Literature, 52(1), 5–44.</w:t>
+        <w:t xml:space="preserve">Lusardi, A. (2019). Financial literacy and the need for financial education: Evidence and implications. Swiss Journal of Economics and Statistics, 155, Article 1.</w:t>
       </w:r>
     </w:p>
     <w:p>
@@ -5474,7 +5474,7 @@
           <w:sz w:val="24"/>
           <w:szCs w:val="24"/>
         </w:rPr>
-        <w:t xml:space="preserve">Lusardi, A., &amp; Tufano, P. (2015). Debt literacy, financial experiences, and overindebtedness. Journal of Pension Economics and Finance, 14(4), 332–368.</w:t>
+        <w:t xml:space="preserve">Lusardi, A., &amp; Mitchell, O. S. (2014). The economic importance of financial literacy: Theory and evidence. Journal of Economic Literature, 52(1), 5–44.</w:t>
       </w:r>
     </w:p>
     <w:p>
@@ -5488,7 +5488,7 @@
           <w:sz w:val="24"/>
           <w:szCs w:val="24"/>
         </w:rPr>
-        <w:t xml:space="preserve">Mandell, L., &amp; Klein, L. S. (2009). The impact of financial literacy education on subsequent financial behavior. Journal of Financial Counseling and Planning, 20(1), 15–24.</w:t>
+        <w:t xml:space="preserve">Lusardi, A., &amp; Tufano, P. (2015). Debt literacy, financial experiences, and overindebtedness. Journal of Pension Economics and Finance, 14(4), 332–368.</w:t>
       </w:r>
     </w:p>
     <w:p>
@@ -5502,7 +5502,7 @@
           <w:sz w:val="24"/>
           <w:szCs w:val="24"/>
         </w:rPr>
-        <w:t xml:space="preserve">OECD. (2022). OECD/INFE toolkit for measuring financial literacy and financial inclusion 2022. OECD Publishing.</w:t>
+        <w:t xml:space="preserve">Mandell, L., &amp; Klein, L. S. (2009). The impact of financial literacy education on subsequent financial behavior. Journal of Financial Counseling and Planning, 20(1), 15–24.</w:t>
       </w:r>
     </w:p>
     <w:p>
@@ -5516,7 +5516,7 @@
           <w:sz w:val="24"/>
           <w:szCs w:val="24"/>
         </w:rPr>
-        <w:t xml:space="preserve">Porto, N., &amp; Xiao, J. J. (2016). Financial literacy overconfidence and financial advice seeking. Journal of Financial Service Professionals, 70(4), 78–88.</w:t>
+        <w:t xml:space="preserve">Mizumoto, A., &amp; Eguchi, M. (2024). Large language models and automated essay scoring of English language learner writing: Insights into validity and reliability. Computers and Education: Artificial Intelligence, 6, 100208.</w:t>
       </w:r>
     </w:p>
     <w:p>
@@ -5530,7 +5530,7 @@
           <w:sz w:val="24"/>
           <w:szCs w:val="24"/>
         </w:rPr>
-        <w:t xml:space="preserve">Robb, C. A., &amp; Woodyard, A. (2011). Financial knowledge and best practice behavior. Journal of Financial Counseling and Planning, 22(1), 60–70.</w:t>
+        <w:t xml:space="preserve">OECD. (2022). OECD/INFE toolkit for measuring financial literacy and financial inclusion 2022. OECD Publishing.</w:t>
       </w:r>
     </w:p>
     <w:p>
@@ -5544,7 +5544,7 @@
           <w:sz w:val="24"/>
           <w:szCs w:val="24"/>
         </w:rPr>
-        <w:t xml:space="preserve">Stango, V., &amp; Zinman, J. (2009). Exponential growth bias and household finance. Journal of Finance, 64(6), 2807–2849.</w:t>
+        <w:t xml:space="preserve">Olivos, F., Kamelski, T., &amp; Ascui-Gac, S. (2025). Assessing instructor-AI cooperation for grading essay-type questions in an introductory sociology course. Teaching Sociology. Advance online publication. https://doi.org/10.1177/0092055X251397371</w:t>
       </w:r>
     </w:p>
     <w:p>
@@ -5558,7 +5558,7 @@
           <w:sz w:val="24"/>
           <w:szCs w:val="24"/>
         </w:rPr>
-        <w:t xml:space="preserve">van Rooij, M., Lusardi, A., &amp; Alessie, R. (2011). Financial literacy and stock market participation. Journal of Financial Economics, 101(2), 449–472.</w:t>
+        <w:t xml:space="preserve">Porto, N., &amp; Xiao, J. J. (2016). Financial literacy overconfidence and financial advice seeking. Journal of Financial Service Professionals, 70(4), 78–88.</w:t>
       </w:r>
     </w:p>
     <w:p>
@@ -5572,7 +5572,7 @@
           <w:sz w:val="24"/>
           <w:szCs w:val="24"/>
         </w:rPr>
-        <w:t xml:space="preserve">Wagner, J., &amp; Walstad, W. B. (2019). The effects of financial education on short-term and long-term financial behaviors. Journal of Consumer Affairs, 53(1), 234–259.</w:t>
+        <w:t xml:space="preserve">Robb, C. A., &amp; Woodyard, A. (2011). Financial knowledge and best practice behavior. Journal of Financial Counseling and Planning, 22(1), 60–70.</w:t>
       </w:r>
     </w:p>
     <w:p>
@@ -5586,7 +5586,159 @@
           <w:sz w:val="24"/>
           <w:szCs w:val="24"/>
         </w:rPr>
+        <w:t xml:space="preserve">Stango, V., &amp; Zinman, J. (2009). Exponential growth bias and household finance. Journal of Finance, 64(6), 2807–2849.</w:t>
+      </w:r>
+    </w:p>
+    <w:p>
+      <w:pPr>
+        <w:spacing w:line="360" w:after="200"/>
+        <w:jc w:val="left"/>
+      </w:pPr>
+      <w:r>
+        <w:rPr>
+          <w:rFonts w:ascii="Times New Roman" w:cs="Times New Roman" w:eastAsia="Times New Roman" w:hAnsi="Times New Roman"/>
+          <w:sz w:val="24"/>
+          <w:szCs w:val="24"/>
+        </w:rPr>
+        <w:t xml:space="preserve">van Rooij, M., Lusardi, A., &amp; Alessie, R. (2011). Financial literacy and stock market participation. Journal of Financial Economics, 101(2), 449–472.</w:t>
+      </w:r>
+    </w:p>
+    <w:p>
+      <w:pPr>
+        <w:spacing w:line="360" w:after="200"/>
+        <w:jc w:val="left"/>
+      </w:pPr>
+      <w:r>
+        <w:rPr>
+          <w:rFonts w:ascii="Times New Roman" w:cs="Times New Roman" w:eastAsia="Times New Roman" w:hAnsi="Times New Roman"/>
+          <w:sz w:val="24"/>
+          <w:szCs w:val="24"/>
+        </w:rPr>
+        <w:t xml:space="preserve">Wagner, J., &amp; Walstad, W. B. (2019). The effects of financial education on short-term and long-term financial behaviors. Journal of Consumer Affairs, 53(1), 234–259.</w:t>
+      </w:r>
+    </w:p>
+    <w:p>
+      <w:pPr>
+        <w:spacing w:line="360" w:after="200"/>
+        <w:jc w:val="left"/>
+      </w:pPr>
+      <w:r>
+        <w:rPr>
+          <w:rFonts w:ascii="Times New Roman" w:cs="Times New Roman" w:eastAsia="Times New Roman" w:hAnsi="Times New Roman"/>
+          <w:sz w:val="24"/>
+          <w:szCs w:val="24"/>
+        </w:rPr>
         <w:t xml:space="preserve">Willis, L. E. (2011). The financial education fallacy. American Economic Review, 101(3), 429–434.</w:t>
+      </w:r>
+    </w:p>
+    <w:p>
+      <w:pPr>
+        <w:spacing w:line="360" w:after="200"/>
+        <w:jc w:val="left"/>
+      </w:pPr>
+      <w:r>
+        <w:rPr>
+          <w:rFonts w:ascii="Times New Roman" w:cs="Times New Roman" w:eastAsia="Times New Roman" w:hAnsi="Times New Roman"/>
+          <w:sz w:val="24"/>
+          <w:szCs w:val="24"/>
+        </w:rPr>
+        <w:t xml:space="preserve">Yavuz, F. (2025). Utilizing large language models for EFL essay grading: An examination of reliability and validity in rubric-based assessments. British Journal of Educational Technology, 56(2), 487–506.</w:t>
+      </w:r>
+    </w:p>
+    <w:p>
+      <w:r>
+        <w:br w:type="page"/>
+      </w:r>
+    </w:p>
+    <w:p>
+      <w:pPr>
+        <w:pStyle w:val="Heading1"/>
+      </w:pPr>
+      <w:r>
+        <w:t xml:space="preserve">Declaration of AI and AI-Assisted Technologies</w:t>
+      </w:r>
+    </w:p>
+    <w:p>
+      <w:pPr>
+        <w:spacing w:line="360" w:after="200"/>
+        <w:jc w:val="left"/>
+      </w:pPr>
+      <w:r>
+        <w:rPr>
+          <w:rFonts w:ascii="Times New Roman" w:cs="Times New Roman" w:eastAsia="Times New Roman" w:hAnsi="Times New Roman"/>
+          <w:sz w:val="24"/>
+          <w:szCs w:val="24"/>
+        </w:rPr>
+        <w:t xml:space="preserve">This study employed AI tools in three capacities, disclosed here in accordance with current best-practice guidelines for transparency in academic publishing (COPE, 2023; AMEE Guide No. 192, 2025).</w:t>
+      </w:r>
+    </w:p>
+    <w:p>
+      <w:pPr>
+        <w:spacing w:line="360" w:after="200"/>
+      </w:pPr>
+      <w:r>
+        <w:rPr>
+          <w:rFonts w:ascii="Times New Roman" w:cs="Times New Roman" w:eastAsia="Times New Roman" w:hAnsi="Times New Roman"/>
+          <w:b/>
+          <w:bCs/>
+          <w:sz w:val="24"/>
+          <w:szCs w:val="24"/>
+        </w:rPr>
+        <w:t xml:space="preserve">1. Assessment platform development. </w:t>
+      </w:r>
+      <w:r>
+        <w:rPr>
+          <w:rFonts w:ascii="Times New Roman" w:cs="Times New Roman" w:eastAsia="Times New Roman" w:hAnsi="Times New Roman"/>
+          <w:sz w:val="24"/>
+          <w:szCs w:val="24"/>
+        </w:rPr>
+        <w:t xml:space="preserve">AI-assisted coding tools (GitHub Copilot, Claude Code) were used during development of the web-based assessment platform to accelerate implementation of the user interface, data collection logic, and adaptive routing algorithm. All platform functionality was independently tested and validated by the research team prior to deployment. The complete source code is publicly available for inspection in the project repository (Boulaid, 2026).</w:t>
+      </w:r>
+    </w:p>
+    <w:p>
+      <w:pPr>
+        <w:spacing w:line="360" w:after="200"/>
+      </w:pPr>
+      <w:r>
+        <w:rPr>
+          <w:rFonts w:ascii="Times New Roman" w:cs="Times New Roman" w:eastAsia="Times New Roman" w:hAnsi="Times New Roman"/>
+          <w:b/>
+          <w:bCs/>
+          <w:sz w:val="24"/>
+          <w:szCs w:val="24"/>
+        </w:rPr>
+        <w:t xml:space="preserve">2. Open-ended response scoring. </w:t>
+      </w:r>
+      <w:r>
+        <w:rPr>
+          <w:rFonts w:ascii="Times New Roman" w:cs="Times New Roman" w:eastAsia="Times New Roman" w:hAnsi="Times New Roman"/>
+          <w:sz w:val="24"/>
+          <w:szCs w:val="24"/>
+        </w:rPr>
+        <w:t xml:space="preserve">Claude 3.5 Sonnet (Anthropic), accessed via the OpenRouter API, served as the automated scoring engine for classifying open-ended student responses into the three-way taxonomy (misconception, knowledge gap, selection error). The scoring rubric, item-specific prompts, misconception taxonomy, and calibration examples were developed entirely by the research team based on manual analysis of 931 student responses. Low-confidence classifications were flagged for human adjudication by the course instructor. This methodological use of LLM-based scoring follows established practices in educational assessment (Mizumoto &amp; Eguchi, 2024; Yavuz, 2025) and is detailed in Section 4.2.3.</w:t>
+      </w:r>
+    </w:p>
+    <w:p>
+      <w:pPr>
+        <w:spacing w:line="360" w:after="200"/>
+      </w:pPr>
+      <w:r>
+        <w:rPr>
+          <w:rFonts w:ascii="Times New Roman" w:cs="Times New Roman" w:eastAsia="Times New Roman" w:hAnsi="Times New Roman"/>
+          <w:b/>
+          <w:bCs/>
+          <w:sz w:val="24"/>
+          <w:szCs w:val="24"/>
+        </w:rPr>
+        <w:t xml:space="preserve">3. Manuscript preparation. </w:t>
+      </w:r>
+      <w:r>
+        <w:rPr>
+          <w:rFonts w:ascii="Times New Roman" w:cs="Times New Roman" w:eastAsia="Times New Roman" w:hAnsi="Times New Roman"/>
+          <w:sz w:val="24"/>
+          <w:szCs w:val="24"/>
+        </w:rPr>
+        <w:t xml:space="preserve">Generative AI tools assisted with drafting, editing, and formatting portions of this manuscript. All content was reviewed, revised, and verified by the authors, who take full responsibility for the accuracy and integrity of the publication.</w:t>
       </w:r>
     </w:p>
     <w:p>

</xml_diff>

<commit_message>
feat: implement SDM-10 AI scoring pipeline and add Appendix D model selection protocol
Score all 953 open-ended responses using GPT-4.1 (OpenAI) via OpenRouter API.
Selected from 11-model concordance evaluation documented in new Appendix D.
Update paper to reference GPT-4.1 as production scorer with model selection methodology.
</commit_message>
<xml_diff>
--- a/exports/paper.docx
+++ b/exports/paper.docx
@@ -611,6 +611,20 @@
           <w:szCs w:val="24"/>
         </w:rPr>
         <w:t xml:space="preserve">A supplemental adaptive module (SDM-10) accompanies each administration. The SDM-10 targets each student’s weakest domain as identified by the fixed core, providing finer-grained diagnostic information without extending total assessment time beyond approximately 15 minutes.</w:t>
+      </w:r>
+    </w:p>
+    <w:p>
+      <w:pPr>
+        <w:spacing w:line="360" w:after="200"/>
+        <w:jc w:val="left"/>
+      </w:pPr>
+      <w:r>
+        <w:rPr>
+          <w:rFonts w:ascii="Times New Roman" w:cs="Times New Roman" w:eastAsia="Times New Roman" w:hAnsi="Times New Roman"/>
+          <w:sz w:val="24"/>
+          <w:szCs w:val="24"/>
+        </w:rPr>
+        <w:t xml:space="preserve">Research consent was voluntary and administered through a structured two-part consent process described in Section 4.4.3; students could decline research participation without penalty and without any impact on course standing or grades. The study protocol has been prepared for institutional review (see Section 4.4.1).</w:t>
       </w:r>
     </w:p>
     <w:p>
@@ -1755,7 +1769,7 @@
           <w:sz w:val="24"/>
           <w:szCs w:val="24"/>
         </w:rPr>
-        <w:t xml:space="preserve">Open-ended responses are scored using a large language model (Claude 3.5 Sonnet, Anthropic) accessed via the OpenRouter API. Each response is processed with an item-specific prompt containing the anchor question context, the student’s selected answer and confidence level, applicable misconception families with calibration examples, and a decision tree for three-way classification. The model returns a structured JSON classification including diagnosis type, Layer 1 code, Layer 2 tag, credit score (0/50/100 measuring diagnostic value), classification confidence, an evidence quote, and a reasoning summary. Low-confidence classifications (approximately 5–10% of responses) are flagged for human review and adjudication by the course instructor. Prior work on LLM-based grading in business education found limited reliability when applying generic prompts to domain-specific content (Flodén, 2025). To address this, our pipeline uses item-specific prompts with calibration examples, a structured misconception taxonomy, and explicit decision trees, following the collaborative human-AI scoring model in which the LLM serves as a second rater whose low-confidence outputs are flagged for instructor adjudication (Olivos, Kamelski, &amp; Ascui-Gac, 2025). This approach follows established practices for LLM-based assessment scoring (Mizumoto &amp; Eguchi, 2024; Yavuz, 2025). All item selection decisions are deterministic and rule-based; the language model is used only for open-ended response classification.</w:t>
+        <w:t xml:space="preserve">Open-ended responses are scored using a large language model (GPT-4.1, OpenAI) accessed via the OpenRouter API. The model was selected through a multi-model concordance protocol in which 11 LLMs scored the same 20 responses and were evaluated on five quality criteria: schema compliance, error rate, classification nuance, throughput, and cost (Appendix D). Each response is processed with an item-specific prompt containing the anchor question context, the student’s selected answer and confidence level, applicable misconception families with calibration examples, and a decision tree for three-way classification. The model returns a structured JSON classification including diagnosis type, Layer 1 code, Layer 2 tag, credit score (0/50/100 measuring diagnostic value), classification confidence, an evidence quote, and a reasoning summary. Low-confidence classifications (approximately 5–10% of responses) are flagged for human review and adjudication by the course instructor. Prior work on LLM-based grading in business education found limited reliability when applying generic prompts to domain-specific content (Flodén, 2025). To address this, our pipeline uses item-specific prompts with calibration examples, a structured misconception taxonomy, and explicit decision trees, following the collaborative human-AI scoring model in which the LLM serves as a second rater whose low-confidence outputs are flagged for instructor adjudication (Olivos, Kamelski, &amp; Ascui-Gac, 2025). This approach follows established practices for LLM-based assessment scoring (Mizumoto &amp; Eguchi, 2024; Yavuz, 2025). All item selection decisions are deterministic and rule-based; the language model is used only for open-ended response classification.</w:t>
       </w:r>
     </w:p>
     <w:p>
@@ -1777,15 +1791,7 @@
           <w:sz w:val="24"/>
           <w:szCs w:val="24"/>
         </w:rPr>
-        <w:t xml:space="preserve">The assessment is administered through a custom-built Next.js web application deployed on a secure virtual private server. The platform handles student authentication via anonymous access codes, enforces one-attempt-per-student logic, implements the adaptive SDM-10 routing algorithm, and stores all response data in a PostgreSQL database. Timestamped response logs enable computation of item-level and section-level duration metrics for quality control and engagement analysis. The complete platform source code, assessment instruments, and data processing scripts are publicly available in the project repository (Boulaid, 2026).</w:t>
-      </w:r>
-    </w:p>
-    <w:p>
-      <w:pPr>
-        <w:pStyle w:val="Heading2"/>
-      </w:pPr>
-      <w:r>
-        <w:t xml:space="preserve">4.4 Privacy and FERPA Compliance</w:t>
+        <w:t xml:space="preserve">To ensure standardized delivery and data integrity at scale, the questionnaire was administered through a dedicated web platform developed for this study: the Financial Literacy Toolkit. Students accessed the platform by entering their course code and university student ID number. The platform immediately transformed each student ID into a one-way cryptographic hash (SHA-256 with a per-course pepper) and discarded the raw identifier; all subsequent data storage and analysis use only the hashed key. The platform did not collect or store passwords, email addresses, or other personally identifiable information. After authentication, students reviewed an information and consent screen (see Section 4.4.3) and completed a brief onboarding process.</w:t>
       </w:r>
     </w:p>
     <w:p>
@@ -1799,7 +1805,318 @@
           <w:sz w:val="24"/>
           <w:szCs w:val="24"/>
         </w:rPr>
-        <w:t xml:space="preserve">No personally identifiable information (PII) is collected or stored. Students access the assessment via anonymous codes that cannot be linked to university records. All data are stored on an encrypted server with access restricted to the research team. The study design was reviewed for compliance with FERPA and Loyola University Chicago’s institutional data policies. Because no PII is collected and participation is embedded within normal course requirements, the study qualifies for exempt status under federal human subjects regulations.</w:t>
+        <w:t xml:space="preserve">The question bank was developed by adapting and synthesizing items from established financial literacy and numeracy instruments and large-scale surveys, including the Berlin Numeracy Test (BNT), Lipkus Numeracy Scale, Schwartz Numeracy Scale, the ‘Big Three’ (Lusardi and Mitchell), the FINRA National Financial Capability Study (NFCS) item sets including the NFCS extension ‘Big Five,’ the OECD/INFE Toolkit (2022), the P-Fin Index (including Retirement Fluency; TIAA and GFLEC), and related decision science and medical decision-making research instruments. An initial pool of approximately 80 candidate items was curated and refined to a 40-item anchor assessment. Each anchor question concept has pre-written variants by format (True/False, multiple choice, short open-ended) and level of understanding (foundational, comparable, applied), enabling targeted diagnostic follow-ups while maintaining a standardized 40-item anchor assessment. The complete platform source code, assessment instruments, and data processing scripts are publicly available in the project repository (Boulaid, 2026).</w:t>
+      </w:r>
+    </w:p>
+    <w:p>
+      <w:pPr>
+        <w:pStyle w:val="Heading2"/>
+      </w:pPr>
+      <w:r>
+        <w:t xml:space="preserve">4.4 Human Subjects Protections, Privacy, and FERPA Compliance</w:t>
+      </w:r>
+    </w:p>
+    <w:p>
+      <w:pPr>
+        <w:pStyle w:val="Heading3"/>
+      </w:pPr>
+      <w:r>
+        <w:t xml:space="preserve">4.4.1 Ethical Review and Regulatory Classification</w:t>
+      </w:r>
+    </w:p>
+    <w:p>
+      <w:pPr>
+        <w:spacing w:line="360" w:after="200"/>
+        <w:jc w:val="left"/>
+      </w:pPr>
+      <w:r>
+        <w:rPr>
+          <w:rFonts w:ascii="Times New Roman" w:cs="Times New Roman" w:eastAsia="Times New Roman" w:hAnsi="Times New Roman"/>
+          <w:sz w:val="24"/>
+          <w:szCs w:val="24"/>
+        </w:rPr>
+        <w:t xml:space="preserve">This study constitutes research with human subjects under federal regulations (45 CFR 46.102): it is a systematic investigation designed to contribute to generalizable knowledge about financial literacy education, conducted with living individuals from whom identifiable private information (educational assessment data linked via coded identifiers with a retained linking key) is collected through interaction (online survey administration). Because the study involves student educational records, the Family Educational Rights and Privacy Act (FERPA) applies. The study protocol has been prepared for submission to the Institutional Review Board at Loyola University Chicago (Office of Research Services, ORS@luc.edu). The study is expected to qualify for exempt review (Category 2: educational tests, surveys, and interview procedures with coded identifiers) or expedited review, given that the research presents no more than minimal risk to participants.</w:t>
+      </w:r>
+    </w:p>
+    <w:p>
+      <w:pPr>
+        <w:pStyle w:val="Heading3"/>
+      </w:pPr>
+      <w:r>
+        <w:t xml:space="preserve">4.4.2 Dual-Role Disclosure and Mitigation</w:t>
+      </w:r>
+    </w:p>
+    <w:p>
+      <w:pPr>
+        <w:spacing w:line="360" w:after="200"/>
+        <w:jc w:val="left"/>
+      </w:pPr>
+      <w:r>
+        <w:rPr>
+          <w:rFonts w:ascii="Times New Roman" w:cs="Times New Roman" w:eastAsia="Times New Roman" w:hAnsi="Times New Roman"/>
+          <w:sz w:val="24"/>
+          <w:szCs w:val="24"/>
+        </w:rPr>
+        <w:t xml:space="preserve">Members of the research team hold instructional roles in Quinn 102, creating a potential conflict of interest. Specifically, the instructor-researcher dual role may produce undue influence if students perceive that declining research participation could affect their course standing. Three safeguards address this concern. First, the assessment is a required course assignment for all enrolled students regardless of research participation; the research consent decision pertains only to whether a student’s data may be used for analysis beyond course purposes. Second, the platform presents research consent as a clearly separated, voluntary choice (see Section 4.4.3) with explicit language stating that declining has no impact on grades, course standing, or the student’s relationship with the instructor. Third, the research dataset is de-identified; instructional personnel access only the course-administration dataset (for confirming assignment completion) and cannot determine which students consented or declined research participation during the grading period.</w:t>
+      </w:r>
+    </w:p>
+    <w:p>
+      <w:pPr>
+        <w:pStyle w:val="Heading3"/>
+      </w:pPr>
+      <w:r>
+        <w:t xml:space="preserve">4.4.3 Informed Consent</w:t>
+      </w:r>
+    </w:p>
+    <w:p>
+      <w:pPr>
+        <w:spacing w:line="360" w:after="200"/>
+        <w:jc w:val="left"/>
+      </w:pPr>
+      <w:r>
+        <w:rPr>
+          <w:rFonts w:ascii="Times New Roman" w:cs="Times New Roman" w:eastAsia="Times New Roman" w:hAnsi="Times New Roman"/>
+          <w:sz w:val="24"/>
+          <w:szCs w:val="24"/>
+        </w:rPr>
+        <w:t xml:space="preserve">The platform’s onboarding flow presented a two-part consent screen before any data collection:</w:t>
+      </w:r>
+    </w:p>
+    <w:p>
+      <w:pPr>
+        <w:spacing w:line="360" w:after="200"/>
+      </w:pPr>
+      <w:r>
+        <w:rPr>
+          <w:rFonts w:ascii="Times New Roman" w:cs="Times New Roman" w:eastAsia="Times New Roman" w:hAnsi="Times New Roman"/>
+          <w:b/>
+          <w:bCs/>
+          <w:sz w:val="24"/>
+          <w:szCs w:val="24"/>
+        </w:rPr>
+        <w:t xml:space="preserve">Course requirement acknowledgment (mandatory). </w:t>
+      </w:r>
+      <w:r>
+        <w:rPr>
+          <w:rFonts w:ascii="Times New Roman" w:cs="Times New Roman" w:eastAsia="Times New Roman" w:hAnsi="Times New Roman"/>
+          <w:sz w:val="24"/>
+          <w:szCs w:val="24"/>
+        </w:rPr>
+        <w:t xml:space="preserve">Students reviewed the statement: “This assessment is a required course assignment in [course code]. Completion affects course credit, but your answers are not graded for correctness.” Students checked a required acknowledgment box: “I understand this assessment is required for the course.”</w:t>
+      </w:r>
+    </w:p>
+    <w:p>
+      <w:pPr>
+        <w:spacing w:line="360" w:after="200"/>
+      </w:pPr>
+      <w:r>
+        <w:rPr>
+          <w:rFonts w:ascii="Times New Roman" w:cs="Times New Roman" w:eastAsia="Times New Roman" w:hAnsi="Times New Roman"/>
+          <w:b/>
+          <w:bCs/>
+          <w:sz w:val="24"/>
+          <w:szCs w:val="24"/>
+        </w:rPr>
+        <w:t xml:space="preserve">Research consent (voluntary). </w:t>
+      </w:r>
+      <w:r>
+        <w:rPr>
+          <w:rFonts w:ascii="Times New Roman" w:cs="Times New Roman" w:eastAsia="Times New Roman" w:hAnsi="Times New Roman"/>
+          <w:sz w:val="24"/>
+          <w:szCs w:val="24"/>
+        </w:rPr>
+        <w:t xml:space="preserve">Below the course acknowledgment, students read: “You may choose whether your responses are used for research evaluating course learning outcomes. Declining has no impact on grades.” Students selected one of two options: “Yes, I consent” or “No, I do not consent.” The default selection was “Yes, I consent.”</w:t>
+      </w:r>
+    </w:p>
+    <w:p>
+      <w:pPr>
+        <w:spacing w:line="360" w:after="200"/>
+        <w:jc w:val="left"/>
+      </w:pPr>
+      <w:r>
+        <w:rPr>
+          <w:rFonts w:ascii="Times New Roman" w:cs="Times New Roman" w:eastAsia="Times New Roman" w:hAnsi="Times New Roman"/>
+          <w:sz w:val="24"/>
+          <w:szCs w:val="24"/>
+        </w:rPr>
+        <w:t xml:space="preserve">Each student’s research consent decision, along with a timestamp and consent version identifier (version 1.0), was recorded in the database. Of the 421 students who submitted completed assessments, 353 (83.8%) consented to research use of their data and 68 (16.2%) declined. Students may withdraw research consent at any time by contacting the principal investigator; withdrawn data will be excluded from all subsequent analyses.</w:t>
+      </w:r>
+    </w:p>
+    <w:p>
+      <w:pPr>
+        <w:spacing w:line="360" w:after="200"/>
+        <w:jc w:val="left"/>
+      </w:pPr>
+      <w:r>
+        <w:rPr>
+          <w:rFonts w:ascii="Times New Roman" w:cs="Times New Roman" w:eastAsia="Times New Roman" w:hAnsi="Times New Roman"/>
+          <w:sz w:val="24"/>
+          <w:szCs w:val="24"/>
+        </w:rPr>
+        <w:t xml:space="preserve">A privacy notice was also displayed during onboarding: “Your Student ID is converted to a coded identifier before storage. Identifiable information, if collected for course administration, is stored separately from the research dataset and access is restricted. Research analysis uses de-identified data and is governed by your consent choice.”</w:t>
+      </w:r>
+    </w:p>
+    <w:p>
+      <w:pPr>
+        <w:pStyle w:val="Heading3"/>
+      </w:pPr>
+      <w:r>
+        <w:t xml:space="preserve">4.4.4 De-identification and Data Security</w:t>
+      </w:r>
+    </w:p>
+    <w:p>
+      <w:pPr>
+        <w:spacing w:line="360" w:after="200"/>
+        <w:jc w:val="left"/>
+      </w:pPr>
+      <w:r>
+        <w:rPr>
+          <w:rFonts w:ascii="Times New Roman" w:cs="Times New Roman" w:eastAsia="Times New Roman" w:hAnsi="Times New Roman"/>
+          <w:sz w:val="24"/>
+          <w:szCs w:val="24"/>
+        </w:rPr>
+        <w:t xml:space="preserve">Student identifiers were transformed into coded keys using a one-way cryptographic hash function (SHA-256) with a per-course pepper prior to storage. The hash is irreversible: given only the hashed key, it is computationally infeasible to recover the original student identifier. No raw student ID numbers, names, email addresses, or other personally identifiable information are stored in any database table used for research. The platform does not store IP addresses; IP data is used only transiently in memory for rate-limiting purposes and is never persisted to disk or database.</w:t>
+      </w:r>
+    </w:p>
+    <w:p>
+      <w:pPr>
+        <w:spacing w:line="360" w:after="200"/>
+        <w:jc w:val="left"/>
+      </w:pPr>
+      <w:r>
+        <w:rPr>
+          <w:rFonts w:ascii="Times New Roman" w:cs="Times New Roman" w:eastAsia="Times New Roman" w:hAnsi="Times New Roman"/>
+          <w:sz w:val="24"/>
+          <w:szCs w:val="24"/>
+        </w:rPr>
+        <w:t xml:space="preserve">The research dataset contains only the hashed identifier, assessment responses (answer selections, confidence ratings, open-ended text), baseline onboarding survey responses, scoring metadata, and timestamps. Course-administration linkage (for confirming assignment completion and reporting grades) is maintained separately with restricted access by authorized instructional personnel only.</w:t>
+      </w:r>
+    </w:p>
+    <w:p>
+      <w:pPr>
+        <w:spacing w:line="360" w:after="200"/>
+        <w:jc w:val="left"/>
+      </w:pPr>
+      <w:r>
+        <w:rPr>
+          <w:rFonts w:ascii="Times New Roman" w:cs="Times New Roman" w:eastAsia="Times New Roman" w:hAnsi="Times New Roman"/>
+          <w:sz w:val="24"/>
+          <w:szCs w:val="24"/>
+        </w:rPr>
+        <w:t xml:space="preserve">All sensitive demographic and financial fields in the baseline survey (household income, parental education, first-generation college status, financial aid status, debt level, financial stress) include a “Prefer not to answer” option, allowing students to participate without disclosing information they consider private. The demographic variables collected for heterogeneity analysis were selected to minimize re-identification risk. The survey collects age as a categorical range (e.g., “20 or under,” “above 20”) rather than exact date of birth, and does not collect geographic identifiers such as zip code or home address. Research has demonstrated that 87% of the U.S. population can be uniquely identified from the combination of five-digit zip code, gender, and date of birth (Sweeney, 2000); by design, this study collects none of these three identifiers in combination.</w:t>
+      </w:r>
+    </w:p>
+    <w:p>
+      <w:pPr>
+        <w:pStyle w:val="Heading3"/>
+      </w:pPr>
+      <w:r>
+        <w:t xml:space="preserve">4.4.5 Data Retention and Destruction</w:t>
+      </w:r>
+    </w:p>
+    <w:p>
+      <w:pPr>
+        <w:spacing w:line="360" w:after="200"/>
+        <w:jc w:val="left"/>
+      </w:pPr>
+      <w:r>
+        <w:rPr>
+          <w:rFonts w:ascii="Times New Roman" w:cs="Times New Roman" w:eastAsia="Times New Roman" w:hAnsi="Times New Roman"/>
+          <w:sz w:val="24"/>
+          <w:szCs w:val="24"/>
+        </w:rPr>
+        <w:t xml:space="preserve">Research data will be retained for a minimum of three years following study completion, consistent with the Common Rule retention requirements, or longer if required by Loyola University Chicago institutional policy. During the retention period, de-identified data will be stored on password-protected, encrypted servers with access restricted to authorized members of the research team. The course-administration linking key (which enables grade reporting) will be destroyed after final course grades have been posted for the Spring 2026 semester. After the retention period expires, all electronic research files will be permanently deleted. The principal investigator is responsible for data destruction and will maintain documentation of the destruction process.</w:t>
+      </w:r>
+    </w:p>
+    <w:p>
+      <w:pPr>
+        <w:pStyle w:val="Heading3"/>
+      </w:pPr>
+      <w:r>
+        <w:t xml:space="preserve">4.4.6 Ethical Framework</w:t>
+      </w:r>
+    </w:p>
+    <w:p>
+      <w:pPr>
+        <w:spacing w:line="360" w:after="200"/>
+        <w:jc w:val="left"/>
+      </w:pPr>
+      <w:r>
+        <w:rPr>
+          <w:rFonts w:ascii="Times New Roman" w:cs="Times New Roman" w:eastAsia="Times New Roman" w:hAnsi="Times New Roman"/>
+          <w:sz w:val="24"/>
+          <w:szCs w:val="24"/>
+        </w:rPr>
+        <w:t xml:space="preserve">The study design addresses the three principles of the Belmont Report (National Commission, 1979):</w:t>
+      </w:r>
+    </w:p>
+    <w:p>
+      <w:pPr>
+        <w:spacing w:line="360" w:after="200"/>
+      </w:pPr>
+      <w:r>
+        <w:rPr>
+          <w:rFonts w:ascii="Times New Roman" w:cs="Times New Roman" w:eastAsia="Times New Roman" w:hAnsi="Times New Roman"/>
+          <w:b/>
+          <w:bCs/>
+          <w:sz w:val="24"/>
+          <w:szCs w:val="24"/>
+        </w:rPr>
+        <w:t xml:space="preserve">Respect for Persons. </w:t>
+      </w:r>
+      <w:r>
+        <w:rPr>
+          <w:rFonts w:ascii="Times New Roman" w:cs="Times New Roman" w:eastAsia="Times New Roman" w:hAnsi="Times New Roman"/>
+          <w:sz w:val="24"/>
+          <w:szCs w:val="24"/>
+        </w:rPr>
+        <w:t xml:space="preserve">Research participation is voluntary and clearly separated from the required course assignment. Students provide informed consent through a structured, accessible consent screen that states the study purpose, procedures, risks, and the right to decline or withdraw without penalty. The consent process is designed to be comprehensible without specialized knowledge.</w:t>
+      </w:r>
+    </w:p>
+    <w:p>
+      <w:pPr>
+        <w:spacing w:line="360" w:after="200"/>
+      </w:pPr>
+      <w:r>
+        <w:rPr>
+          <w:rFonts w:ascii="Times New Roman" w:cs="Times New Roman" w:eastAsia="Times New Roman" w:hAnsi="Times New Roman"/>
+          <w:b/>
+          <w:bCs/>
+          <w:sz w:val="24"/>
+          <w:szCs w:val="24"/>
+        </w:rPr>
+        <w:t xml:space="preserve">Beneficence. </w:t>
+      </w:r>
+      <w:r>
+        <w:rPr>
+          <w:rFonts w:ascii="Times New Roman" w:cs="Times New Roman" w:eastAsia="Times New Roman" w:hAnsi="Times New Roman"/>
+          <w:sz w:val="24"/>
+          <w:szCs w:val="24"/>
+        </w:rPr>
+        <w:t xml:space="preserve">The study presents minimal risk: the assessment covers standard financial literacy content encountered in normal educational practice, and the primary risk — breach of confidentiality — is mitigated through one-way cryptographic hashing, de-identified datasets, separate key storage, restricted access controls, and the absence of direct identifiers in the research file. Sensitive survey items include “Prefer not to answer” options to reduce discomfort. There is no direct benefit to individual participants; the anticipated benefit is improved financial literacy instruction for future cohorts based on empirical evidence of learning outcomes and knowledge gaps.</w:t>
+      </w:r>
+    </w:p>
+    <w:p>
+      <w:pPr>
+        <w:spacing w:line="360" w:after="200"/>
+      </w:pPr>
+      <w:r>
+        <w:rPr>
+          <w:rFonts w:ascii="Times New Roman" w:cs="Times New Roman" w:eastAsia="Times New Roman" w:hAnsi="Times New Roman"/>
+          <w:b/>
+          <w:bCs/>
+          <w:sz w:val="24"/>
+          <w:szCs w:val="24"/>
+        </w:rPr>
+        <w:t xml:space="preserve">Justice. </w:t>
+      </w:r>
+      <w:r>
+        <w:rPr>
+          <w:rFonts w:ascii="Times New Roman" w:cs="Times New Roman" w:eastAsia="Times New Roman" w:hAnsi="Times New Roman"/>
+          <w:sz w:val="24"/>
+          <w:szCs w:val="24"/>
+        </w:rPr>
+        <w:t xml:space="preserve">Participants are selected on the basis of research relevance — enrollment in Quinn 102 (Financial Literacy) — rather than convenience or vulnerability. All enrolled students receive equal opportunity to complete the assessment (as a course requirement) and to consent or decline research participation. No students are excluded from the study on the basis of demographic characteristics.</w:t>
       </w:r>
     </w:p>
     <w:p>
@@ -5146,7 +5463,7 @@
           <w:ilvl w:val="0"/>
           <w:numId w:val="3"/>
         </w:numPr>
-        <w:spacing w:line="360" w:after="200"/>
+        <w:spacing w:line="360" w:after="120"/>
       </w:pPr>
       <w:r>
         <w:rPr>
@@ -5155,14 +5472,6 @@
           <w:szCs w:val="24"/>
         </w:rPr>
         <w:t xml:space="preserve">The SDM-10 open-ended sample is not random: items were administered only to students whose anchor responses triggered high-Need subcategories. Per-item coverage ranges from 20% (Q32) to 90% (Q7). Extrapolation to the full class is appropriate only when item-level coverage exceeds 50%.</w:t>
-      </w:r>
-    </w:p>
-    <w:p>
-      <w:pPr>
-        <w:pStyle w:val="Heading1"/>
-      </w:pPr>
-      <w:r>
-        <w:t xml:space="preserve">8. Next Steps (Post-Course Assessment)</w:t>
       </w:r>
     </w:p>
     <w:p>
@@ -5180,7 +5489,33 @@
           <w:sz w:val="24"/>
           <w:szCs w:val="24"/>
         </w:rPr>
-        <w:t xml:space="preserve">Administer the post-course assessment during the final week of Spring 2026 instruction using the identical fixed core instrument and SDM-10 adaptive module.</w:t>
+        <w:t xml:space="preserve">Members of the research team hold instructional roles in Quinn 102, creating a potential conflict of interest. The 16.2% decline rate (68 of 421 submitted students declined research consent) provides evidence that students exercised genuine choice. The dual role was mitigated through separated consent, de-identified research dataset, and voluntary research consent with explicit no-penalty language (see Section 4.4.2).</w:t>
+      </w:r>
+    </w:p>
+    <w:p>
+      <w:pPr>
+        <w:pStyle w:val="ListParagraph"/>
+        <w:numPr>
+          <w:ilvl w:val="0"/>
+          <w:numId w:val="3"/>
+        </w:numPr>
+        <w:spacing w:line="360" w:after="200"/>
+      </w:pPr>
+      <w:r>
+        <w:rPr>
+          <w:rFonts w:ascii="Times New Roman" w:cs="Times New Roman" w:eastAsia="Times New Roman" w:hAnsi="Times New Roman"/>
+          <w:sz w:val="24"/>
+          <w:szCs w:val="24"/>
+        </w:rPr>
+        <w:t xml:space="preserve">Analyses using the research-consented subset (n = 353, 83.8% of completers) may not be fully representative of the complete student population if consent propensity correlates with assessment performance, demographics, or engagement. Pre-post comparisons will report whether the consented and declined subsamples differ on observable baseline characteristics.</w:t>
+      </w:r>
+    </w:p>
+    <w:p>
+      <w:pPr>
+        <w:pStyle w:val="Heading1"/>
+      </w:pPr>
+      <w:r>
+        <w:t xml:space="preserve">8. Next Steps (Post-Course Assessment)</w:t>
       </w:r>
     </w:p>
     <w:p>
@@ -5198,7 +5533,7 @@
           <w:sz w:val="24"/>
           <w:szCs w:val="24"/>
         </w:rPr>
-        <w:t xml:space="preserve">Link pre-course and post-course responses at the student level using anonymous identifiers to compute within-student gain scores at the overall, domain, and subdomain levels.</w:t>
+        <w:t xml:space="preserve">Administer the post-course assessment during the final week of Spring 2026 instruction using the identical fixed core instrument and SDM-10 adaptive module.</w:t>
       </w:r>
     </w:p>
     <w:p>
@@ -5216,7 +5551,7 @@
           <w:sz w:val="24"/>
           <w:szCs w:val="24"/>
         </w:rPr>
-        <w:t xml:space="preserve">Conduct paired statistical tests (t-tests, Wilcoxon signed-rank) and compute effect sizes (Cohen’s d) to assess the magnitude and significance of learning gains (RQ1).</w:t>
+        <w:t xml:space="preserve">Link pre-course and post-course responses at the student level using anonymous identifiers to compute within-student gain scores at the overall, domain, and subdomain levels.</w:t>
       </w:r>
     </w:p>
     <w:p>
@@ -5234,7 +5569,7 @@
           <w:sz w:val="24"/>
           <w:szCs w:val="24"/>
         </w:rPr>
-        <w:t xml:space="preserve">Estimate OLS regression models with gain scores as the dependent variable and baseline covariates as predictors to identify sources of heterogeneous learning gains (RQ2).</w:t>
+        <w:t xml:space="preserve">Conduct paired statistical tests (t-tests, Wilcoxon signed-rank) and compute effect sizes (Cohen’s d) to assess the magnitude and significance of learning gains (RQ1).</w:t>
       </w:r>
     </w:p>
     <w:p>
@@ -5252,6 +5587,24 @@
           <w:sz w:val="24"/>
           <w:szCs w:val="24"/>
         </w:rPr>
+        <w:t xml:space="preserve">Estimate OLS regression models with gain scores as the dependent variable and baseline covariates as predictors to identify sources of heterogeneous learning gains (RQ2).</w:t>
+      </w:r>
+    </w:p>
+    <w:p>
+      <w:pPr>
+        <w:pStyle w:val="ListParagraph"/>
+        <w:numPr>
+          <w:ilvl w:val="0"/>
+          <w:numId w:val="3"/>
+        </w:numPr>
+        <w:spacing w:line="360" w:after="120"/>
+      </w:pPr>
+      <w:r>
+        <w:rPr>
+          <w:rFonts w:ascii="Times New Roman" w:cs="Times New Roman" w:eastAsia="Times New Roman" w:hAnsi="Times New Roman"/>
+          <w:sz w:val="24"/>
+          <w:szCs w:val="24"/>
+        </w:rPr>
         <w:t xml:space="preserve">Complete psychometric validation (Cronbach’s alpha, point-biserial correlations, confirmatory factor analysis) across both administrations to assess instrument reliability and structural validity.</w:t>
       </w:r>
     </w:p>
@@ -5516,7 +5869,7 @@
           <w:sz w:val="24"/>
           <w:szCs w:val="24"/>
         </w:rPr>
-        <w:t xml:space="preserve">Mizumoto, A., &amp; Eguchi, M. (2024). Large language models and automated essay scoring of English language learner writing: Insights into validity and reliability. Computers and Education: Artificial Intelligence, 6, 100208.</w:t>
+        <w:t xml:space="preserve">National Commission for the Protection of Human Subjects of Biomedical and Behavioral Research. (1979). The Belmont Report: Ethical principles and guidelines for the protection of human subjects of research. U.S. Department of Health and Human Services.</w:t>
       </w:r>
     </w:p>
     <w:p>
@@ -5530,7 +5883,7 @@
           <w:sz w:val="24"/>
           <w:szCs w:val="24"/>
         </w:rPr>
-        <w:t xml:space="preserve">OECD. (2022). OECD/INFE toolkit for measuring financial literacy and financial inclusion 2022. OECD Publishing.</w:t>
+        <w:t xml:space="preserve">Mizumoto, A., &amp; Eguchi, M. (2024). Large language models and automated essay scoring of English language learner writing: Insights into validity and reliability. Computers and Education: Artificial Intelligence, 6, 100208.</w:t>
       </w:r>
     </w:p>
     <w:p>
@@ -5544,7 +5897,7 @@
           <w:sz w:val="24"/>
           <w:szCs w:val="24"/>
         </w:rPr>
-        <w:t xml:space="preserve">Olivos, F., Kamelski, T., &amp; Ascui-Gac, S. (2025). Assessing instructor-AI cooperation for grading essay-type questions in an introductory sociology course. Teaching Sociology. Advance online publication. https://doi.org/10.1177/0092055X251397371</w:t>
+        <w:t xml:space="preserve">OECD. (2022). OECD/INFE toolkit for measuring financial literacy and financial inclusion 2022. OECD Publishing.</w:t>
       </w:r>
     </w:p>
     <w:p>
@@ -5558,7 +5911,7 @@
           <w:sz w:val="24"/>
           <w:szCs w:val="24"/>
         </w:rPr>
-        <w:t xml:space="preserve">Porto, N., &amp; Xiao, J. J. (2016). Financial literacy overconfidence and financial advice seeking. Journal of Financial Service Professionals, 70(4), 78–88.</w:t>
+        <w:t xml:space="preserve">Olivos, F., Kamelski, T., &amp; Ascui-Gac, S. (2025). Assessing instructor-AI cooperation for grading essay-type questions in an introductory sociology course. Teaching Sociology. Advance online publication. https://doi.org/10.1177/0092055X251397371</w:t>
       </w:r>
     </w:p>
     <w:p>
@@ -5572,7 +5925,7 @@
           <w:sz w:val="24"/>
           <w:szCs w:val="24"/>
         </w:rPr>
-        <w:t xml:space="preserve">Robb, C. A., &amp; Woodyard, A. (2011). Financial knowledge and best practice behavior. Journal of Financial Counseling and Planning, 22(1), 60–70.</w:t>
+        <w:t xml:space="preserve">Porto, N., &amp; Xiao, J. J. (2016). Financial literacy overconfidence and financial advice seeking. Journal of Financial Service Professionals, 70(4), 78–88.</w:t>
       </w:r>
     </w:p>
     <w:p>
@@ -5586,7 +5939,7 @@
           <w:sz w:val="24"/>
           <w:szCs w:val="24"/>
         </w:rPr>
-        <w:t xml:space="preserve">Stango, V., &amp; Zinman, J. (2009). Exponential growth bias and household finance. Journal of Finance, 64(6), 2807–2849.</w:t>
+        <w:t xml:space="preserve">Robb, C. A., &amp; Woodyard, A. (2011). Financial knowledge and best practice behavior. Journal of Financial Counseling and Planning, 22(1), 60–70.</w:t>
       </w:r>
     </w:p>
     <w:p>
@@ -5600,7 +5953,7 @@
           <w:sz w:val="24"/>
           <w:szCs w:val="24"/>
         </w:rPr>
-        <w:t xml:space="preserve">van Rooij, M., Lusardi, A., &amp; Alessie, R. (2011). Financial literacy and stock market participation. Journal of Financial Economics, 101(2), 449–472.</w:t>
+        <w:t xml:space="preserve">Stango, V., &amp; Zinman, J. (2009). Exponential growth bias and household finance. Journal of Finance, 64(6), 2807–2849.</w:t>
       </w:r>
     </w:p>
     <w:p>
@@ -5614,7 +5967,7 @@
           <w:sz w:val="24"/>
           <w:szCs w:val="24"/>
         </w:rPr>
-        <w:t xml:space="preserve">Wagner, J., &amp; Walstad, W. B. (2019). The effects of financial education on short-term and long-term financial behaviors. Journal of Consumer Affairs, 53(1), 234–259.</w:t>
+        <w:t xml:space="preserve">Sweeney, L. (2000). Simple demographics often identify people uniquely (Carnegie Mellon University Data Privacy Working Paper No. 3).</w:t>
       </w:r>
     </w:p>
     <w:p>
@@ -5628,7 +5981,7 @@
           <w:sz w:val="24"/>
           <w:szCs w:val="24"/>
         </w:rPr>
-        <w:t xml:space="preserve">Willis, L. E. (2011). The financial education fallacy. American Economic Review, 101(3), 429–434.</w:t>
+        <w:t xml:space="preserve">van Rooij, M., Lusardi, A., &amp; Alessie, R. (2011). Financial literacy and stock market participation. Journal of Financial Economics, 101(2), 449–472.</w:t>
       </w:r>
     </w:p>
     <w:p>
@@ -5642,20 +5995,7 @@
           <w:sz w:val="24"/>
           <w:szCs w:val="24"/>
         </w:rPr>
-        <w:t xml:space="preserve">Yavuz, F. (2025). Utilizing large language models for EFL essay grading: An examination of reliability and validity in rubric-based assessments. British Journal of Educational Technology, 56(2), 487–506.</w:t>
-      </w:r>
-    </w:p>
-    <w:p>
-      <w:r>
-        <w:br w:type="page"/>
-      </w:r>
-    </w:p>
-    <w:p>
-      <w:pPr>
-        <w:pStyle w:val="Heading1"/>
-      </w:pPr>
-      <w:r>
-        <w:t xml:space="preserve">Declaration of AI and AI-Assisted Technologies</w:t>
+        <w:t xml:space="preserve">Wagner, J., &amp; Walstad, W. B. (2019). The effects of financial education on short-term and long-term financial behaviors. Journal of Consumer Affairs, 53(1), 234–259.</w:t>
       </w:r>
     </w:p>
     <w:p>
@@ -5669,6 +6009,47 @@
           <w:sz w:val="24"/>
           <w:szCs w:val="24"/>
         </w:rPr>
+        <w:t xml:space="preserve">Willis, L. E. (2011). The financial education fallacy. American Economic Review, 101(3), 429–434.</w:t>
+      </w:r>
+    </w:p>
+    <w:p>
+      <w:pPr>
+        <w:spacing w:line="360" w:after="200"/>
+        <w:jc w:val="left"/>
+      </w:pPr>
+      <w:r>
+        <w:rPr>
+          <w:rFonts w:ascii="Times New Roman" w:cs="Times New Roman" w:eastAsia="Times New Roman" w:hAnsi="Times New Roman"/>
+          <w:sz w:val="24"/>
+          <w:szCs w:val="24"/>
+        </w:rPr>
+        <w:t xml:space="preserve">Yavuz, F. (2025). Utilizing large language models for EFL essay grading: An examination of reliability and validity in rubric-based assessments. British Journal of Educational Technology, 56(2), 487–506.</w:t>
+      </w:r>
+    </w:p>
+    <w:p>
+      <w:r>
+        <w:br w:type="page"/>
+      </w:r>
+    </w:p>
+    <w:p>
+      <w:pPr>
+        <w:pStyle w:val="Heading1"/>
+      </w:pPr>
+      <w:r>
+        <w:t xml:space="preserve">Declaration of AI and AI-Assisted Technologies</w:t>
+      </w:r>
+    </w:p>
+    <w:p>
+      <w:pPr>
+        <w:spacing w:line="360" w:after="200"/>
+        <w:jc w:val="left"/>
+      </w:pPr>
+      <w:r>
+        <w:rPr>
+          <w:rFonts w:ascii="Times New Roman" w:cs="Times New Roman" w:eastAsia="Times New Roman" w:hAnsi="Times New Roman"/>
+          <w:sz w:val="24"/>
+          <w:szCs w:val="24"/>
+        </w:rPr>
         <w:t xml:space="preserve">This study employed AI tools in three capacities, disclosed here in accordance with current best-practice guidelines for transparency in academic publishing (COPE, 2023; AMEE Guide No. 192, 2025).</w:t>
       </w:r>
     </w:p>
@@ -5715,7 +6096,7 @@
           <w:sz w:val="24"/>
           <w:szCs w:val="24"/>
         </w:rPr>
-        <w:t xml:space="preserve">Claude 3.5 Sonnet (Anthropic), accessed via the OpenRouter API, served as the automated scoring engine for classifying open-ended student responses into the three-way taxonomy (misconception, knowledge gap, selection error). The scoring rubric, item-specific prompts, misconception taxonomy, and calibration examples were developed entirely by the research team based on manual analysis of 931 student responses. Low-confidence classifications were flagged for human adjudication by the course instructor. This methodological use of LLM-based scoring follows established practices in educational assessment (Mizumoto &amp; Eguchi, 2024; Yavuz, 2025) and is detailed in Section 4.2.3.</w:t>
+        <w:t xml:space="preserve">GPT-4.1 (OpenAI), accessed via the OpenRouter API, served as the automated scoring engine for classifying open-ended student responses into the three-way taxonomy (misconception, knowledge gap, selection error). The model was selected from among 11 candidate LLMs through a multi-model concordance protocol (Appendix D). The scoring rubric, item-specific prompts, misconception taxonomy, and calibration examples were developed entirely by the research team based on manual analysis of 931 student responses. Low-confidence classifications were flagged for human adjudication by the course instructor. This methodological use of LLM-based scoring follows established practices in educational assessment (Mizumoto &amp; Eguchi, 2024; Yavuz, 2025) and is detailed in Section 4.2.3.</w:t>
       </w:r>
     </w:p>
     <w:p>
@@ -11420,6 +11801,2987 @@
           <w:szCs w:val="24"/>
         </w:rPr>
         <w:t xml:space="preserve">These cross-cutting codes combine with category codes: INF-01 = inflation misconception, INF-KG = inflation knowledge gap, INF-SE = inflation selection error.</w:t>
+      </w:r>
+    </w:p>
+    <w:p>
+      <w:r>
+        <w:br w:type="page"/>
+      </w:r>
+    </w:p>
+    <w:p>
+      <w:pPr>
+        <w:pStyle w:val="Heading1"/>
+      </w:pPr>
+      <w:r>
+        <w:rPr>
+          <w:rFonts w:ascii="Times New Roman" w:cs="Times New Roman" w:eastAsia="Times New Roman" w:hAnsi="Times New Roman"/>
+          <w:b/>
+          <w:bCs/>
+          <w:sz w:val="28"/>
+          <w:szCs w:val="28"/>
+        </w:rPr>
+        <w:t xml:space="preserve">Appendix D: AI Scorer Model Selection Protocol</w:t>
+      </w:r>
+    </w:p>
+    <w:p>
+      <w:pPr>
+        <w:spacing w:line="360" w:after="200"/>
+      </w:pPr>
+      <w:r>
+        <w:rPr>
+          <w:rFonts w:ascii="Times New Roman" w:cs="Times New Roman" w:eastAsia="Times New Roman" w:hAnsi="Times New Roman"/>
+          <w:b/>
+          <w:bCs/>
+          <w:sz w:val="24"/>
+          <w:szCs w:val="24"/>
+        </w:rPr>
+        <w:t xml:space="preserve">Methodology. </w:t>
+      </w:r>
+      <w:r>
+        <w:rPr>
+          <w:rFonts w:ascii="Times New Roman" w:cs="Times New Roman" w:eastAsia="Times New Roman" w:hAnsi="Times New Roman"/>
+          <w:sz w:val="24"/>
+          <w:szCs w:val="24"/>
+        </w:rPr>
+        <w:t xml:space="preserve">To select the scoring model for the AI-assisted classification pipeline (Section 4.2.3), we conducted a multi-model concordance evaluation. Twenty identical open-ended student responses (11 diagnose, 9 confirm) were scored by 11 large language models from seven providers, accessed via the OpenRouter API. Models were evaluated on five criteria: (1) JSON schema compliance (whether diagnose items returned the correct diagnose-format output), (2) parse/API error rate, (3) classification nuance (use of partial credit, confidence variation, and balanced classification distributions), (4) throughput (wall-clock time for 20 responses), and (5) estimated cost for the full corpus of 953 responses.</w:t>
+      </w:r>
+    </w:p>
+    <w:p>
+      <w:pPr>
+        <w:spacing w:before="240" w:after="120"/>
+        <w:jc w:val="center"/>
+      </w:pPr>
+      <w:r>
+        <w:rPr>
+          <w:rFonts w:ascii="Times New Roman" w:cs="Times New Roman" w:eastAsia="Times New Roman" w:hAnsi="Times New Roman"/>
+          <w:b/>
+          <w:bCs/>
+          <w:i/>
+          <w:iCs/>
+          <w:sz w:val="22"/>
+          <w:szCs w:val="22"/>
+        </w:rPr>
+        <w:t xml:space="preserve">Table D.1: Multi-Model Concordance Results (n = 20 identical responses)</w:t>
+      </w:r>
+    </w:p>
+    <w:tbl>
+      <w:tblPr>
+        <w:tblW w:type="dxa" w:w="9360"/>
+        <w:tblBorders>
+          <w:top w:val="single" w:color="CCCCCC" w:sz="1"/>
+          <w:left w:val="single" w:color="CCCCCC" w:sz="1"/>
+          <w:bottom w:val="single" w:color="CCCCCC" w:sz="1"/>
+          <w:right w:val="single" w:color="CCCCCC" w:sz="1"/>
+          <w:insideH w:val="single" w:color="CCCCCC" w:sz="1"/>
+          <w:insideV w:val="single" w:color="CCCCCC" w:sz="1"/>
+        </w:tblBorders>
+        <w:tblLayout w:type="fixed"/>
+        <w:tblCellMar>
+          <w:top w:type="dxa" w:w="60"/>
+          <w:left w:type="dxa" w:w="120"/>
+          <w:bottom w:type="dxa" w:w="60"/>
+          <w:right w:type="dxa" w:w="120"/>
+        </w:tblCellMar>
+      </w:tblPr>
+      <w:tblGrid>
+        <w:gridCol w:w="1200"/>
+        <w:gridCol w:w="800"/>
+        <w:gridCol w:w="700"/>
+        <w:gridCol w:w="700"/>
+        <w:gridCol w:w="600"/>
+        <w:gridCol w:w="700"/>
+        <w:gridCol w:w="900"/>
+        <w:gridCol w:w="800"/>
+        <w:gridCol w:w="960"/>
+      </w:tblGrid>
+      <w:tr>
+        <w:trPr>
+          <w:tblHeader/>
+        </w:trPr>
+        <w:tc>
+          <w:tcPr>
+            <w:tcW w:type="dxa" w:w="1200"/>
+            <w:shd w:fill="D5E8F0" w:color="auto" w:val="clear"/>
+            <w:vAlign w:val="center"/>
+          </w:tcPr>
+          <w:p>
+            <w:pPr>
+              <w:jc w:val="center"/>
+            </w:pPr>
+            <w:r>
+              <w:rPr>
+                <w:rFonts w:ascii="Times New Roman" w:cs="Times New Roman" w:eastAsia="Times New Roman" w:hAnsi="Times New Roman"/>
+                <w:b/>
+                <w:bCs/>
+                <w:sz w:val="22"/>
+                <w:szCs w:val="22"/>
+              </w:rPr>
+              <w:t xml:space="preserve">Model</w:t>
+            </w:r>
+          </w:p>
+        </w:tc>
+        <w:tc>
+          <w:tcPr>
+            <w:tcW w:type="dxa" w:w="800"/>
+            <w:shd w:fill="D5E8F0" w:color="auto" w:val="clear"/>
+            <w:vAlign w:val="center"/>
+          </w:tcPr>
+          <w:p>
+            <w:pPr>
+              <w:jc w:val="center"/>
+            </w:pPr>
+            <w:r>
+              <w:rPr>
+                <w:rFonts w:ascii="Times New Roman" w:cs="Times New Roman" w:eastAsia="Times New Roman" w:hAnsi="Times New Roman"/>
+                <w:b/>
+                <w:bCs/>
+                <w:sz w:val="22"/>
+                <w:szCs w:val="22"/>
+              </w:rPr>
+              <w:t xml:space="preserve">Provider</w:t>
+            </w:r>
+          </w:p>
+        </w:tc>
+        <w:tc>
+          <w:tcPr>
+            <w:tcW w:type="dxa" w:w="700"/>
+            <w:shd w:fill="D5E8F0" w:color="auto" w:val="clear"/>
+            <w:vAlign w:val="center"/>
+          </w:tcPr>
+          <w:p>
+            <w:pPr>
+              <w:jc w:val="center"/>
+            </w:pPr>
+            <w:r>
+              <w:rPr>
+                <w:rFonts w:ascii="Times New Roman" w:cs="Times New Roman" w:eastAsia="Times New Roman" w:hAnsi="Times New Roman"/>
+                <w:b/>
+                <w:bCs/>
+                <w:sz w:val="22"/>
+                <w:szCs w:val="22"/>
+              </w:rPr>
+              <w:t xml:space="preserve">Schema Err</w:t>
+            </w:r>
+          </w:p>
+        </w:tc>
+        <w:tc>
+          <w:tcPr>
+            <w:tcW w:type="dxa" w:w="700"/>
+            <w:shd w:fill="D5E8F0" w:color="auto" w:val="clear"/>
+            <w:vAlign w:val="center"/>
+          </w:tcPr>
+          <w:p>
+            <w:pPr>
+              <w:jc w:val="center"/>
+            </w:pPr>
+            <w:r>
+              <w:rPr>
+                <w:rFonts w:ascii="Times New Roman" w:cs="Times New Roman" w:eastAsia="Times New Roman" w:hAnsi="Times New Roman"/>
+                <w:b/>
+                <w:bCs/>
+                <w:sz w:val="22"/>
+                <w:szCs w:val="22"/>
+              </w:rPr>
+              <w:t xml:space="preserve">Errors</w:t>
+            </w:r>
+          </w:p>
+        </w:tc>
+        <w:tc>
+          <w:tcPr>
+            <w:tcW w:type="dxa" w:w="600"/>
+            <w:shd w:fill="D5E8F0" w:color="auto" w:val="clear"/>
+            <w:vAlign w:val="center"/>
+          </w:tcPr>
+          <w:p>
+            <w:pPr>
+              <w:jc w:val="center"/>
+            </w:pPr>
+            <w:r>
+              <w:rPr>
+                <w:rFonts w:ascii="Times New Roman" w:cs="Times New Roman" w:eastAsia="Times New Roman" w:hAnsi="Times New Roman"/>
+                <w:b/>
+                <w:bCs/>
+                <w:sz w:val="22"/>
+                <w:szCs w:val="22"/>
+              </w:rPr>
+              <w:t xml:space="preserve">Time</w:t>
+            </w:r>
+          </w:p>
+        </w:tc>
+        <w:tc>
+          <w:tcPr>
+            <w:tcW w:type="dxa" w:w="700"/>
+            <w:shd w:fill="D5E8F0" w:color="auto" w:val="clear"/>
+            <w:vAlign w:val="center"/>
+          </w:tcPr>
+          <w:p>
+            <w:pPr>
+              <w:jc w:val="center"/>
+            </w:pPr>
+            <w:r>
+              <w:rPr>
+                <w:rFonts w:ascii="Times New Roman" w:cs="Times New Roman" w:eastAsia="Times New Roman" w:hAnsi="Times New Roman"/>
+                <w:b/>
+                <w:bCs/>
+                <w:sz w:val="22"/>
+                <w:szCs w:val="22"/>
+              </w:rPr>
+              <w:t xml:space="preserve">credit=50</w:t>
+            </w:r>
+          </w:p>
+        </w:tc>
+        <w:tc>
+          <w:tcPr>
+            <w:tcW w:type="dxa" w:w="900"/>
+            <w:shd w:fill="D5E8F0" w:color="auto" w:val="clear"/>
+            <w:vAlign w:val="center"/>
+          </w:tcPr>
+          <w:p>
+            <w:pPr>
+              <w:jc w:val="center"/>
+            </w:pPr>
+            <w:r>
+              <w:rPr>
+                <w:rFonts w:ascii="Times New Roman" w:cs="Times New Roman" w:eastAsia="Times New Roman" w:hAnsi="Times New Roman"/>
+                <w:b/>
+                <w:bCs/>
+                <w:sz w:val="22"/>
+                <w:szCs w:val="22"/>
+              </w:rPr>
+              <w:t xml:space="preserve">Conf. Var.</w:t>
+            </w:r>
+          </w:p>
+        </w:tc>
+        <w:tc>
+          <w:tcPr>
+            <w:tcW w:type="dxa" w:w="800"/>
+            <w:shd w:fill="D5E8F0" w:color="auto" w:val="clear"/>
+            <w:vAlign w:val="center"/>
+          </w:tcPr>
+          <w:p>
+            <w:pPr>
+              <w:jc w:val="center"/>
+            </w:pPr>
+            <w:r>
+              <w:rPr>
+                <w:rFonts w:ascii="Times New Roman" w:cs="Times New Roman" w:eastAsia="Times New Roman" w:hAnsi="Times New Roman"/>
+                <w:b/>
+                <w:bCs/>
+                <w:sz w:val="22"/>
+                <w:szCs w:val="22"/>
+              </w:rPr>
+              <w:t xml:space="preserve">Cost (953)</w:t>
+            </w:r>
+          </w:p>
+        </w:tc>
+        <w:tc>
+          <w:tcPr>
+            <w:tcW w:type="dxa" w:w="960"/>
+            <w:shd w:fill="D5E8F0" w:color="auto" w:val="clear"/>
+            <w:vAlign w:val="center"/>
+          </w:tcPr>
+          <w:p>
+            <w:pPr>
+              <w:jc w:val="center"/>
+            </w:pPr>
+            <w:r>
+              <w:rPr>
+                <w:rFonts w:ascii="Times New Roman" w:cs="Times New Roman" w:eastAsia="Times New Roman" w:hAnsi="Times New Roman"/>
+                <w:b/>
+                <w:bCs/>
+                <w:sz w:val="22"/>
+                <w:szCs w:val="22"/>
+              </w:rPr>
+              <w:t xml:space="preserve">Verdict</w:t>
+            </w:r>
+          </w:p>
+        </w:tc>
+      </w:tr>
+      <w:tr>
+        <w:tc>
+          <w:tcPr>
+            <w:tcW w:type="dxa" w:w="1200"/>
+            <w:vAlign w:val="center"/>
+          </w:tcPr>
+          <w:p>
+            <w:pPr>
+              <w:jc w:val="center"/>
+            </w:pPr>
+            <w:r>
+              <w:rPr>
+                <w:rFonts w:ascii="Times New Roman" w:cs="Times New Roman" w:eastAsia="Times New Roman" w:hAnsi="Times New Roman"/>
+                <w:sz w:val="22"/>
+                <w:szCs w:val="22"/>
+              </w:rPr>
+              <w:t xml:space="preserve">GPT-4.1</w:t>
+            </w:r>
+          </w:p>
+        </w:tc>
+        <w:tc>
+          <w:tcPr>
+            <w:tcW w:type="dxa" w:w="800"/>
+            <w:vAlign w:val="center"/>
+          </w:tcPr>
+          <w:p>
+            <w:pPr>
+              <w:jc w:val="center"/>
+            </w:pPr>
+            <w:r>
+              <w:rPr>
+                <w:rFonts w:ascii="Times New Roman" w:cs="Times New Roman" w:eastAsia="Times New Roman" w:hAnsi="Times New Roman"/>
+                <w:sz w:val="22"/>
+                <w:szCs w:val="22"/>
+              </w:rPr>
+              <w:t xml:space="preserve">OpenAI</w:t>
+            </w:r>
+          </w:p>
+        </w:tc>
+        <w:tc>
+          <w:tcPr>
+            <w:tcW w:type="dxa" w:w="700"/>
+            <w:vAlign w:val="center"/>
+          </w:tcPr>
+          <w:p>
+            <w:pPr>
+              <w:jc w:val="center"/>
+            </w:pPr>
+            <w:r>
+              <w:rPr>
+                <w:rFonts w:ascii="Times New Roman" w:cs="Times New Roman" w:eastAsia="Times New Roman" w:hAnsi="Times New Roman"/>
+                <w:sz w:val="22"/>
+                <w:szCs w:val="22"/>
+              </w:rPr>
+              <w:t xml:space="preserve">0</w:t>
+            </w:r>
+          </w:p>
+        </w:tc>
+        <w:tc>
+          <w:tcPr>
+            <w:tcW w:type="dxa" w:w="700"/>
+            <w:vAlign w:val="center"/>
+          </w:tcPr>
+          <w:p>
+            <w:pPr>
+              <w:jc w:val="center"/>
+            </w:pPr>
+            <w:r>
+              <w:rPr>
+                <w:rFonts w:ascii="Times New Roman" w:cs="Times New Roman" w:eastAsia="Times New Roman" w:hAnsi="Times New Roman"/>
+                <w:sz w:val="22"/>
+                <w:szCs w:val="22"/>
+              </w:rPr>
+              <w:t xml:space="preserve">0</w:t>
+            </w:r>
+          </w:p>
+        </w:tc>
+        <w:tc>
+          <w:tcPr>
+            <w:tcW w:type="dxa" w:w="600"/>
+            <w:vAlign w:val="center"/>
+          </w:tcPr>
+          <w:p>
+            <w:pPr>
+              <w:jc w:val="center"/>
+            </w:pPr>
+            <w:r>
+              <w:rPr>
+                <w:rFonts w:ascii="Times New Roman" w:cs="Times New Roman" w:eastAsia="Times New Roman" w:hAnsi="Times New Roman"/>
+                <w:sz w:val="22"/>
+                <w:szCs w:val="22"/>
+              </w:rPr>
+              <w:t xml:space="preserve">41 s</w:t>
+            </w:r>
+          </w:p>
+        </w:tc>
+        <w:tc>
+          <w:tcPr>
+            <w:tcW w:type="dxa" w:w="700"/>
+            <w:vAlign w:val="center"/>
+          </w:tcPr>
+          <w:p>
+            <w:pPr>
+              <w:jc w:val="center"/>
+            </w:pPr>
+            <w:r>
+              <w:rPr>
+                <w:rFonts w:ascii="Times New Roman" w:cs="Times New Roman" w:eastAsia="Times New Roman" w:hAnsi="Times New Roman"/>
+                <w:sz w:val="22"/>
+                <w:szCs w:val="22"/>
+              </w:rPr>
+              <w:t xml:space="preserve">Yes</w:t>
+            </w:r>
+          </w:p>
+        </w:tc>
+        <w:tc>
+          <w:tcPr>
+            <w:tcW w:type="dxa" w:w="900"/>
+            <w:vAlign w:val="center"/>
+          </w:tcPr>
+          <w:p>
+            <w:pPr>
+              <w:jc w:val="center"/>
+            </w:pPr>
+            <w:r>
+              <w:rPr>
+                <w:rFonts w:ascii="Times New Roman" w:cs="Times New Roman" w:eastAsia="Times New Roman" w:hAnsi="Times New Roman"/>
+                <w:sz w:val="22"/>
+                <w:szCs w:val="22"/>
+              </w:rPr>
+              <w:t xml:space="preserve">19H / 1M</w:t>
+            </w:r>
+          </w:p>
+        </w:tc>
+        <w:tc>
+          <w:tcPr>
+            <w:tcW w:type="dxa" w:w="800"/>
+            <w:vAlign w:val="center"/>
+          </w:tcPr>
+          <w:p>
+            <w:pPr>
+              <w:jc w:val="center"/>
+            </w:pPr>
+            <w:r>
+              <w:rPr>
+                <w:rFonts w:ascii="Times New Roman" w:cs="Times New Roman" w:eastAsia="Times New Roman" w:hAnsi="Times New Roman"/>
+                <w:sz w:val="22"/>
+                <w:szCs w:val="22"/>
+              </w:rPr>
+              <w:t xml:space="preserve">$2.86</w:t>
+            </w:r>
+          </w:p>
+        </w:tc>
+        <w:tc>
+          <w:tcPr>
+            <w:tcW w:type="dxa" w:w="960"/>
+            <w:vAlign w:val="center"/>
+          </w:tcPr>
+          <w:p>
+            <w:pPr>
+              <w:jc w:val="center"/>
+            </w:pPr>
+            <w:r>
+              <w:rPr>
+                <w:rFonts w:ascii="Times New Roman" w:cs="Times New Roman" w:eastAsia="Times New Roman" w:hAnsi="Times New Roman"/>
+                <w:sz w:val="22"/>
+                <w:szCs w:val="22"/>
+              </w:rPr>
+              <w:t xml:space="preserve">Selected</w:t>
+            </w:r>
+          </w:p>
+        </w:tc>
+      </w:tr>
+      <w:tr>
+        <w:tc>
+          <w:tcPr>
+            <w:tcW w:type="dxa" w:w="1200"/>
+            <w:vAlign w:val="center"/>
+          </w:tcPr>
+          <w:p>
+            <w:pPr>
+              <w:jc w:val="center"/>
+            </w:pPr>
+            <w:r>
+              <w:rPr>
+                <w:rFonts w:ascii="Times New Roman" w:cs="Times New Roman" w:eastAsia="Times New Roman" w:hAnsi="Times New Roman"/>
+                <w:sz w:val="22"/>
+                <w:szCs w:val="22"/>
+              </w:rPr>
+              <w:t xml:space="preserve">DeepSeek V3.2</w:t>
+            </w:r>
+          </w:p>
+        </w:tc>
+        <w:tc>
+          <w:tcPr>
+            <w:tcW w:type="dxa" w:w="800"/>
+            <w:vAlign w:val="center"/>
+          </w:tcPr>
+          <w:p>
+            <w:pPr>
+              <w:jc w:val="center"/>
+            </w:pPr>
+            <w:r>
+              <w:rPr>
+                <w:rFonts w:ascii="Times New Roman" w:cs="Times New Roman" w:eastAsia="Times New Roman" w:hAnsi="Times New Roman"/>
+                <w:sz w:val="22"/>
+                <w:szCs w:val="22"/>
+              </w:rPr>
+              <w:t xml:space="preserve">DeepSeek</w:t>
+            </w:r>
+          </w:p>
+        </w:tc>
+        <w:tc>
+          <w:tcPr>
+            <w:tcW w:type="dxa" w:w="700"/>
+            <w:vAlign w:val="center"/>
+          </w:tcPr>
+          <w:p>
+            <w:pPr>
+              <w:jc w:val="center"/>
+            </w:pPr>
+            <w:r>
+              <w:rPr>
+                <w:rFonts w:ascii="Times New Roman" w:cs="Times New Roman" w:eastAsia="Times New Roman" w:hAnsi="Times New Roman"/>
+                <w:sz w:val="22"/>
+                <w:szCs w:val="22"/>
+              </w:rPr>
+              <w:t xml:space="preserve">0</w:t>
+            </w:r>
+          </w:p>
+        </w:tc>
+        <w:tc>
+          <w:tcPr>
+            <w:tcW w:type="dxa" w:w="700"/>
+            <w:vAlign w:val="center"/>
+          </w:tcPr>
+          <w:p>
+            <w:pPr>
+              <w:jc w:val="center"/>
+            </w:pPr>
+            <w:r>
+              <w:rPr>
+                <w:rFonts w:ascii="Times New Roman" w:cs="Times New Roman" w:eastAsia="Times New Roman" w:hAnsi="Times New Roman"/>
+                <w:sz w:val="22"/>
+                <w:szCs w:val="22"/>
+              </w:rPr>
+              <w:t xml:space="preserve">0</w:t>
+            </w:r>
+          </w:p>
+        </w:tc>
+        <w:tc>
+          <w:tcPr>
+            <w:tcW w:type="dxa" w:w="600"/>
+            <w:vAlign w:val="center"/>
+          </w:tcPr>
+          <w:p>
+            <w:pPr>
+              <w:jc w:val="center"/>
+            </w:pPr>
+            <w:r>
+              <w:rPr>
+                <w:rFonts w:ascii="Times New Roman" w:cs="Times New Roman" w:eastAsia="Times New Roman" w:hAnsi="Times New Roman"/>
+                <w:sz w:val="22"/>
+                <w:szCs w:val="22"/>
+              </w:rPr>
+              <w:t xml:space="preserve">266 s</w:t>
+            </w:r>
+          </w:p>
+        </w:tc>
+        <w:tc>
+          <w:tcPr>
+            <w:tcW w:type="dxa" w:w="700"/>
+            <w:vAlign w:val="center"/>
+          </w:tcPr>
+          <w:p>
+            <w:pPr>
+              <w:jc w:val="center"/>
+            </w:pPr>
+            <w:r>
+              <w:rPr>
+                <w:rFonts w:ascii="Times New Roman" w:cs="Times New Roman" w:eastAsia="Times New Roman" w:hAnsi="Times New Roman"/>
+                <w:sz w:val="22"/>
+                <w:szCs w:val="22"/>
+              </w:rPr>
+              <w:t xml:space="preserve">Yes</w:t>
+            </w:r>
+          </w:p>
+        </w:tc>
+        <w:tc>
+          <w:tcPr>
+            <w:tcW w:type="dxa" w:w="900"/>
+            <w:vAlign w:val="center"/>
+          </w:tcPr>
+          <w:p>
+            <w:pPr>
+              <w:jc w:val="center"/>
+            </w:pPr>
+            <w:r>
+              <w:rPr>
+                <w:rFonts w:ascii="Times New Roman" w:cs="Times New Roman" w:eastAsia="Times New Roman" w:hAnsi="Times New Roman"/>
+                <w:sz w:val="22"/>
+                <w:szCs w:val="22"/>
+              </w:rPr>
+              <w:t xml:space="preserve">18H / 2M</w:t>
+            </w:r>
+          </w:p>
+        </w:tc>
+        <w:tc>
+          <w:tcPr>
+            <w:tcW w:type="dxa" w:w="800"/>
+            <w:vAlign w:val="center"/>
+          </w:tcPr>
+          <w:p>
+            <w:pPr>
+              <w:jc w:val="center"/>
+            </w:pPr>
+            <w:r>
+              <w:rPr>
+                <w:rFonts w:ascii="Times New Roman" w:cs="Times New Roman" w:eastAsia="Times New Roman" w:hAnsi="Times New Roman"/>
+                <w:sz w:val="22"/>
+                <w:szCs w:val="22"/>
+              </w:rPr>
+              <w:t xml:space="preserve">$0.24</w:t>
+            </w:r>
+          </w:p>
+        </w:tc>
+        <w:tc>
+          <w:tcPr>
+            <w:tcW w:type="dxa" w:w="960"/>
+            <w:vAlign w:val="center"/>
+          </w:tcPr>
+          <w:p>
+            <w:pPr>
+              <w:jc w:val="center"/>
+            </w:pPr>
+            <w:r>
+              <w:rPr>
+                <w:rFonts w:ascii="Times New Roman" w:cs="Times New Roman" w:eastAsia="Times New Roman" w:hAnsi="Times New Roman"/>
+                <w:sz w:val="22"/>
+                <w:szCs w:val="22"/>
+              </w:rPr>
+              <w:t xml:space="preserve">Too slow</w:t>
+            </w:r>
+          </w:p>
+        </w:tc>
+      </w:tr>
+      <w:tr>
+        <w:tc>
+          <w:tcPr>
+            <w:tcW w:type="dxa" w:w="1200"/>
+            <w:vAlign w:val="center"/>
+          </w:tcPr>
+          <w:p>
+            <w:pPr>
+              <w:jc w:val="center"/>
+            </w:pPr>
+            <w:r>
+              <w:rPr>
+                <w:rFonts w:ascii="Times New Roman" w:cs="Times New Roman" w:eastAsia="Times New Roman" w:hAnsi="Times New Roman"/>
+                <w:sz w:val="22"/>
+                <w:szCs w:val="22"/>
+              </w:rPr>
+              <w:t xml:space="preserve">Grok 4.1 Fast</w:t>
+            </w:r>
+          </w:p>
+        </w:tc>
+        <w:tc>
+          <w:tcPr>
+            <w:tcW w:type="dxa" w:w="800"/>
+            <w:vAlign w:val="center"/>
+          </w:tcPr>
+          <w:p>
+            <w:pPr>
+              <w:jc w:val="center"/>
+            </w:pPr>
+            <w:r>
+              <w:rPr>
+                <w:rFonts w:ascii="Times New Roman" w:cs="Times New Roman" w:eastAsia="Times New Roman" w:hAnsi="Times New Roman"/>
+                <w:sz w:val="22"/>
+                <w:szCs w:val="22"/>
+              </w:rPr>
+              <w:t xml:space="preserve">xAI</w:t>
+            </w:r>
+          </w:p>
+        </w:tc>
+        <w:tc>
+          <w:tcPr>
+            <w:tcW w:type="dxa" w:w="700"/>
+            <w:vAlign w:val="center"/>
+          </w:tcPr>
+          <w:p>
+            <w:pPr>
+              <w:jc w:val="center"/>
+            </w:pPr>
+            <w:r>
+              <w:rPr>
+                <w:rFonts w:ascii="Times New Roman" w:cs="Times New Roman" w:eastAsia="Times New Roman" w:hAnsi="Times New Roman"/>
+                <w:sz w:val="22"/>
+                <w:szCs w:val="22"/>
+              </w:rPr>
+              <w:t xml:space="preserve">0</w:t>
+            </w:r>
+          </w:p>
+        </w:tc>
+        <w:tc>
+          <w:tcPr>
+            <w:tcW w:type="dxa" w:w="700"/>
+            <w:vAlign w:val="center"/>
+          </w:tcPr>
+          <w:p>
+            <w:pPr>
+              <w:jc w:val="center"/>
+            </w:pPr>
+            <w:r>
+              <w:rPr>
+                <w:rFonts w:ascii="Times New Roman" w:cs="Times New Roman" w:eastAsia="Times New Roman" w:hAnsi="Times New Roman"/>
+                <w:sz w:val="22"/>
+                <w:szCs w:val="22"/>
+              </w:rPr>
+              <w:t xml:space="preserve">1 parse</w:t>
+            </w:r>
+          </w:p>
+        </w:tc>
+        <w:tc>
+          <w:tcPr>
+            <w:tcW w:type="dxa" w:w="600"/>
+            <w:vAlign w:val="center"/>
+          </w:tcPr>
+          <w:p>
+            <w:pPr>
+              <w:jc w:val="center"/>
+            </w:pPr>
+            <w:r>
+              <w:rPr>
+                <w:rFonts w:ascii="Times New Roman" w:cs="Times New Roman" w:eastAsia="Times New Roman" w:hAnsi="Times New Roman"/>
+                <w:sz w:val="22"/>
+                <w:szCs w:val="22"/>
+              </w:rPr>
+              <w:t xml:space="preserve">144 s</w:t>
+            </w:r>
+          </w:p>
+        </w:tc>
+        <w:tc>
+          <w:tcPr>
+            <w:tcW w:type="dxa" w:w="700"/>
+            <w:vAlign w:val="center"/>
+          </w:tcPr>
+          <w:p>
+            <w:pPr>
+              <w:jc w:val="center"/>
+            </w:pPr>
+            <w:r>
+              <w:rPr>
+                <w:rFonts w:ascii="Times New Roman" w:cs="Times New Roman" w:eastAsia="Times New Roman" w:hAnsi="Times New Roman"/>
+                <w:sz w:val="22"/>
+                <w:szCs w:val="22"/>
+              </w:rPr>
+              <w:t xml:space="preserve">Yes</w:t>
+            </w:r>
+          </w:p>
+        </w:tc>
+        <w:tc>
+          <w:tcPr>
+            <w:tcW w:type="dxa" w:w="900"/>
+            <w:vAlign w:val="center"/>
+          </w:tcPr>
+          <w:p>
+            <w:pPr>
+              <w:jc w:val="center"/>
+            </w:pPr>
+            <w:r>
+              <w:rPr>
+                <w:rFonts w:ascii="Times New Roman" w:cs="Times New Roman" w:eastAsia="Times New Roman" w:hAnsi="Times New Roman"/>
+                <w:sz w:val="22"/>
+                <w:szCs w:val="22"/>
+              </w:rPr>
+              <w:t xml:space="preserve">18H / 1M</w:t>
+            </w:r>
+          </w:p>
+        </w:tc>
+        <w:tc>
+          <w:tcPr>
+            <w:tcW w:type="dxa" w:w="800"/>
+            <w:vAlign w:val="center"/>
+          </w:tcPr>
+          <w:p>
+            <w:pPr>
+              <w:jc w:val="center"/>
+            </w:pPr>
+            <w:r>
+              <w:rPr>
+                <w:rFonts w:ascii="Times New Roman" w:cs="Times New Roman" w:eastAsia="Times New Roman" w:hAnsi="Times New Roman"/>
+                <w:sz w:val="22"/>
+                <w:szCs w:val="22"/>
+              </w:rPr>
+              <w:t xml:space="preserve">$0.22</w:t>
+            </w:r>
+          </w:p>
+        </w:tc>
+        <w:tc>
+          <w:tcPr>
+            <w:tcW w:type="dxa" w:w="960"/>
+            <w:vAlign w:val="center"/>
+          </w:tcPr>
+          <w:p>
+            <w:pPr>
+              <w:jc w:val="center"/>
+            </w:pPr>
+            <w:r>
+              <w:rPr>
+                <w:rFonts w:ascii="Times New Roman" w:cs="Times New Roman" w:eastAsia="Times New Roman" w:hAnsi="Times New Roman"/>
+                <w:sz w:val="22"/>
+                <w:szCs w:val="22"/>
+              </w:rPr>
+              <w:t xml:space="preserve">5% errors</w:t>
+            </w:r>
+          </w:p>
+        </w:tc>
+      </w:tr>
+      <w:tr>
+        <w:tc>
+          <w:tcPr>
+            <w:tcW w:type="dxa" w:w="1200"/>
+            <w:vAlign w:val="center"/>
+          </w:tcPr>
+          <w:p>
+            <w:pPr>
+              <w:jc w:val="center"/>
+            </w:pPr>
+            <w:r>
+              <w:rPr>
+                <w:rFonts w:ascii="Times New Roman" w:cs="Times New Roman" w:eastAsia="Times New Roman" w:hAnsi="Times New Roman"/>
+                <w:sz w:val="22"/>
+                <w:szCs w:val="22"/>
+              </w:rPr>
+              <w:t xml:space="preserve">Qwen3-235B</w:t>
+            </w:r>
+          </w:p>
+        </w:tc>
+        <w:tc>
+          <w:tcPr>
+            <w:tcW w:type="dxa" w:w="800"/>
+            <w:vAlign w:val="center"/>
+          </w:tcPr>
+          <w:p>
+            <w:pPr>
+              <w:jc w:val="center"/>
+            </w:pPr>
+            <w:r>
+              <w:rPr>
+                <w:rFonts w:ascii="Times New Roman" w:cs="Times New Roman" w:eastAsia="Times New Roman" w:hAnsi="Times New Roman"/>
+                <w:sz w:val="22"/>
+                <w:szCs w:val="22"/>
+              </w:rPr>
+              <w:t xml:space="preserve">Alibaba</w:t>
+            </w:r>
+          </w:p>
+        </w:tc>
+        <w:tc>
+          <w:tcPr>
+            <w:tcW w:type="dxa" w:w="700"/>
+            <w:vAlign w:val="center"/>
+          </w:tcPr>
+          <w:p>
+            <w:pPr>
+              <w:jc w:val="center"/>
+            </w:pPr>
+            <w:r>
+              <w:rPr>
+                <w:rFonts w:ascii="Times New Roman" w:cs="Times New Roman" w:eastAsia="Times New Roman" w:hAnsi="Times New Roman"/>
+                <w:sz w:val="22"/>
+                <w:szCs w:val="22"/>
+              </w:rPr>
+              <w:t xml:space="preserve">0</w:t>
+            </w:r>
+          </w:p>
+        </w:tc>
+        <w:tc>
+          <w:tcPr>
+            <w:tcW w:type="dxa" w:w="700"/>
+            <w:vAlign w:val="center"/>
+          </w:tcPr>
+          <w:p>
+            <w:pPr>
+              <w:jc w:val="center"/>
+            </w:pPr>
+            <w:r>
+              <w:rPr>
+                <w:rFonts w:ascii="Times New Roman" w:cs="Times New Roman" w:eastAsia="Times New Roman" w:hAnsi="Times New Roman"/>
+                <w:sz w:val="22"/>
+                <w:szCs w:val="22"/>
+              </w:rPr>
+              <w:t xml:space="preserve">0</w:t>
+            </w:r>
+          </w:p>
+        </w:tc>
+        <w:tc>
+          <w:tcPr>
+            <w:tcW w:type="dxa" w:w="600"/>
+            <w:vAlign w:val="center"/>
+          </w:tcPr>
+          <w:p>
+            <w:pPr>
+              <w:jc w:val="center"/>
+            </w:pPr>
+            <w:r>
+              <w:rPr>
+                <w:rFonts w:ascii="Times New Roman" w:cs="Times New Roman" w:eastAsia="Times New Roman" w:hAnsi="Times New Roman"/>
+                <w:sz w:val="22"/>
+                <w:szCs w:val="22"/>
+              </w:rPr>
+              <w:t xml:space="preserve">84 s</w:t>
+            </w:r>
+          </w:p>
+        </w:tc>
+        <w:tc>
+          <w:tcPr>
+            <w:tcW w:type="dxa" w:w="700"/>
+            <w:vAlign w:val="center"/>
+          </w:tcPr>
+          <w:p>
+            <w:pPr>
+              <w:jc w:val="center"/>
+            </w:pPr>
+            <w:r>
+              <w:rPr>
+                <w:rFonts w:ascii="Times New Roman" w:cs="Times New Roman" w:eastAsia="Times New Roman" w:hAnsi="Times New Roman"/>
+                <w:sz w:val="22"/>
+                <w:szCs w:val="22"/>
+              </w:rPr>
+              <w:t xml:space="preserve">No</w:t>
+            </w:r>
+          </w:p>
+        </w:tc>
+        <w:tc>
+          <w:tcPr>
+            <w:tcW w:type="dxa" w:w="900"/>
+            <w:vAlign w:val="center"/>
+          </w:tcPr>
+          <w:p>
+            <w:pPr>
+              <w:jc w:val="center"/>
+            </w:pPr>
+            <w:r>
+              <w:rPr>
+                <w:rFonts w:ascii="Times New Roman" w:cs="Times New Roman" w:eastAsia="Times New Roman" w:hAnsi="Times New Roman"/>
+                <w:sz w:val="22"/>
+                <w:szCs w:val="22"/>
+              </w:rPr>
+              <w:t xml:space="preserve">20H / 0M</w:t>
+            </w:r>
+          </w:p>
+        </w:tc>
+        <w:tc>
+          <w:tcPr>
+            <w:tcW w:type="dxa" w:w="800"/>
+            <w:vAlign w:val="center"/>
+          </w:tcPr>
+          <w:p>
+            <w:pPr>
+              <w:jc w:val="center"/>
+            </w:pPr>
+            <w:r>
+              <w:rPr>
+                <w:rFonts w:ascii="Times New Roman" w:cs="Times New Roman" w:eastAsia="Times New Roman" w:hAnsi="Times New Roman"/>
+                <w:sz w:val="22"/>
+                <w:szCs w:val="22"/>
+              </w:rPr>
+              <w:t xml:space="preserve">$0.07</w:t>
+            </w:r>
+          </w:p>
+        </w:tc>
+        <w:tc>
+          <w:tcPr>
+            <w:tcW w:type="dxa" w:w="960"/>
+            <w:vAlign w:val="center"/>
+          </w:tcPr>
+          <w:p>
+            <w:pPr>
+              <w:jc w:val="center"/>
+            </w:pPr>
+            <w:r>
+              <w:rPr>
+                <w:rFonts w:ascii="Times New Roman" w:cs="Times New Roman" w:eastAsia="Times New Roman" w:hAnsi="Times New Roman"/>
+                <w:sz w:val="22"/>
+                <w:szCs w:val="22"/>
+              </w:rPr>
+              <w:t xml:space="preserve">No partial</w:t>
+            </w:r>
+          </w:p>
+        </w:tc>
+      </w:tr>
+      <w:tr>
+        <w:tc>
+          <w:tcPr>
+            <w:tcW w:type="dxa" w:w="1200"/>
+            <w:vAlign w:val="center"/>
+          </w:tcPr>
+          <w:p>
+            <w:pPr>
+              <w:jc w:val="center"/>
+            </w:pPr>
+            <w:r>
+              <w:rPr>
+                <w:rFonts w:ascii="Times New Roman" w:cs="Times New Roman" w:eastAsia="Times New Roman" w:hAnsi="Times New Roman"/>
+                <w:sz w:val="22"/>
+                <w:szCs w:val="22"/>
+              </w:rPr>
+              <w:t xml:space="preserve">GPT-4o-mini</w:t>
+            </w:r>
+          </w:p>
+        </w:tc>
+        <w:tc>
+          <w:tcPr>
+            <w:tcW w:type="dxa" w:w="800"/>
+            <w:vAlign w:val="center"/>
+          </w:tcPr>
+          <w:p>
+            <w:pPr>
+              <w:jc w:val="center"/>
+            </w:pPr>
+            <w:r>
+              <w:rPr>
+                <w:rFonts w:ascii="Times New Roman" w:cs="Times New Roman" w:eastAsia="Times New Roman" w:hAnsi="Times New Roman"/>
+                <w:sz w:val="22"/>
+                <w:szCs w:val="22"/>
+              </w:rPr>
+              <w:t xml:space="preserve">OpenAI</w:t>
+            </w:r>
+          </w:p>
+        </w:tc>
+        <w:tc>
+          <w:tcPr>
+            <w:tcW w:type="dxa" w:w="700"/>
+            <w:vAlign w:val="center"/>
+          </w:tcPr>
+          <w:p>
+            <w:pPr>
+              <w:jc w:val="center"/>
+            </w:pPr>
+            <w:r>
+              <w:rPr>
+                <w:rFonts w:ascii="Times New Roman" w:cs="Times New Roman" w:eastAsia="Times New Roman" w:hAnsi="Times New Roman"/>
+                <w:sz w:val="22"/>
+                <w:szCs w:val="22"/>
+              </w:rPr>
+              <w:t xml:space="preserve">0</w:t>
+            </w:r>
+          </w:p>
+        </w:tc>
+        <w:tc>
+          <w:tcPr>
+            <w:tcW w:type="dxa" w:w="700"/>
+            <w:vAlign w:val="center"/>
+          </w:tcPr>
+          <w:p>
+            <w:pPr>
+              <w:jc w:val="center"/>
+            </w:pPr>
+            <w:r>
+              <w:rPr>
+                <w:rFonts w:ascii="Times New Roman" w:cs="Times New Roman" w:eastAsia="Times New Roman" w:hAnsi="Times New Roman"/>
+                <w:sz w:val="22"/>
+                <w:szCs w:val="22"/>
+              </w:rPr>
+              <w:t xml:space="preserve">0</w:t>
+            </w:r>
+          </w:p>
+        </w:tc>
+        <w:tc>
+          <w:tcPr>
+            <w:tcW w:type="dxa" w:w="600"/>
+            <w:vAlign w:val="center"/>
+          </w:tcPr>
+          <w:p>
+            <w:pPr>
+              <w:jc w:val="center"/>
+            </w:pPr>
+            <w:r>
+              <w:rPr>
+                <w:rFonts w:ascii="Times New Roman" w:cs="Times New Roman" w:eastAsia="Times New Roman" w:hAnsi="Times New Roman"/>
+                <w:sz w:val="22"/>
+                <w:szCs w:val="22"/>
+              </w:rPr>
+              <w:t xml:space="preserve">37 s</w:t>
+            </w:r>
+          </w:p>
+        </w:tc>
+        <w:tc>
+          <w:tcPr>
+            <w:tcW w:type="dxa" w:w="700"/>
+            <w:vAlign w:val="center"/>
+          </w:tcPr>
+          <w:p>
+            <w:pPr>
+              <w:jc w:val="center"/>
+            </w:pPr>
+            <w:r>
+              <w:rPr>
+                <w:rFonts w:ascii="Times New Roman" w:cs="Times New Roman" w:eastAsia="Times New Roman" w:hAnsi="Times New Roman"/>
+                <w:sz w:val="22"/>
+                <w:szCs w:val="22"/>
+              </w:rPr>
+              <w:t xml:space="preserve">No</w:t>
+            </w:r>
+          </w:p>
+        </w:tc>
+        <w:tc>
+          <w:tcPr>
+            <w:tcW w:type="dxa" w:w="900"/>
+            <w:vAlign w:val="center"/>
+          </w:tcPr>
+          <w:p>
+            <w:pPr>
+              <w:jc w:val="center"/>
+            </w:pPr>
+            <w:r>
+              <w:rPr>
+                <w:rFonts w:ascii="Times New Roman" w:cs="Times New Roman" w:eastAsia="Times New Roman" w:hAnsi="Times New Roman"/>
+                <w:sz w:val="22"/>
+                <w:szCs w:val="22"/>
+              </w:rPr>
+              <w:t xml:space="preserve">18H / 2M</w:t>
+            </w:r>
+          </w:p>
+        </w:tc>
+        <w:tc>
+          <w:tcPr>
+            <w:tcW w:type="dxa" w:w="800"/>
+            <w:vAlign w:val="center"/>
+          </w:tcPr>
+          <w:p>
+            <w:pPr>
+              <w:jc w:val="center"/>
+            </w:pPr>
+            <w:r>
+              <w:rPr>
+                <w:rFonts w:ascii="Times New Roman" w:cs="Times New Roman" w:eastAsia="Times New Roman" w:hAnsi="Times New Roman"/>
+                <w:sz w:val="22"/>
+                <w:szCs w:val="22"/>
+              </w:rPr>
+              <w:t xml:space="preserve">$0.22</w:t>
+            </w:r>
+          </w:p>
+        </w:tc>
+        <w:tc>
+          <w:tcPr>
+            <w:tcW w:type="dxa" w:w="960"/>
+            <w:vAlign w:val="center"/>
+          </w:tcPr>
+          <w:p>
+            <w:pPr>
+              <w:jc w:val="center"/>
+            </w:pPr>
+            <w:r>
+              <w:rPr>
+                <w:rFonts w:ascii="Times New Roman" w:cs="Times New Roman" w:eastAsia="Times New Roman" w:hAnsi="Times New Roman"/>
+                <w:sz w:val="22"/>
+                <w:szCs w:val="22"/>
+              </w:rPr>
+              <w:t xml:space="preserve">Overly strict</w:t>
+            </w:r>
+          </w:p>
+        </w:tc>
+      </w:tr>
+      <w:tr>
+        <w:tc>
+          <w:tcPr>
+            <w:tcW w:type="dxa" w:w="1200"/>
+            <w:vAlign w:val="center"/>
+          </w:tcPr>
+          <w:p>
+            <w:pPr>
+              <w:jc w:val="center"/>
+            </w:pPr>
+            <w:r>
+              <w:rPr>
+                <w:rFonts w:ascii="Times New Roman" w:cs="Times New Roman" w:eastAsia="Times New Roman" w:hAnsi="Times New Roman"/>
+                <w:sz w:val="22"/>
+                <w:szCs w:val="22"/>
+              </w:rPr>
+              <w:t xml:space="preserve">Haiku 4.5</w:t>
+            </w:r>
+          </w:p>
+        </w:tc>
+        <w:tc>
+          <w:tcPr>
+            <w:tcW w:type="dxa" w:w="800"/>
+            <w:vAlign w:val="center"/>
+          </w:tcPr>
+          <w:p>
+            <w:pPr>
+              <w:jc w:val="center"/>
+            </w:pPr>
+            <w:r>
+              <w:rPr>
+                <w:rFonts w:ascii="Times New Roman" w:cs="Times New Roman" w:eastAsia="Times New Roman" w:hAnsi="Times New Roman"/>
+                <w:sz w:val="22"/>
+                <w:szCs w:val="22"/>
+              </w:rPr>
+              <w:t xml:space="preserve">Anthropic</w:t>
+            </w:r>
+          </w:p>
+        </w:tc>
+        <w:tc>
+          <w:tcPr>
+            <w:tcW w:type="dxa" w:w="700"/>
+            <w:vAlign w:val="center"/>
+          </w:tcPr>
+          <w:p>
+            <w:pPr>
+              <w:jc w:val="center"/>
+            </w:pPr>
+            <w:r>
+              <w:rPr>
+                <w:rFonts w:ascii="Times New Roman" w:cs="Times New Roman" w:eastAsia="Times New Roman" w:hAnsi="Times New Roman"/>
+                <w:sz w:val="22"/>
+                <w:szCs w:val="22"/>
+              </w:rPr>
+              <w:t xml:space="preserve">0</w:t>
+            </w:r>
+          </w:p>
+        </w:tc>
+        <w:tc>
+          <w:tcPr>
+            <w:tcW w:type="dxa" w:w="700"/>
+            <w:vAlign w:val="center"/>
+          </w:tcPr>
+          <w:p>
+            <w:pPr>
+              <w:jc w:val="center"/>
+            </w:pPr>
+            <w:r>
+              <w:rPr>
+                <w:rFonts w:ascii="Times New Roman" w:cs="Times New Roman" w:eastAsia="Times New Roman" w:hAnsi="Times New Roman"/>
+                <w:sz w:val="22"/>
+                <w:szCs w:val="22"/>
+              </w:rPr>
+              <w:t xml:space="preserve">0</w:t>
+            </w:r>
+          </w:p>
+        </w:tc>
+        <w:tc>
+          <w:tcPr>
+            <w:tcW w:type="dxa" w:w="600"/>
+            <w:vAlign w:val="center"/>
+          </w:tcPr>
+          <w:p>
+            <w:pPr>
+              <w:jc w:val="center"/>
+            </w:pPr>
+            <w:r>
+              <w:rPr>
+                <w:rFonts w:ascii="Times New Roman" w:cs="Times New Roman" w:eastAsia="Times New Roman" w:hAnsi="Times New Roman"/>
+                <w:sz w:val="22"/>
+                <w:szCs w:val="22"/>
+              </w:rPr>
+              <w:t xml:space="preserve">56 s</w:t>
+            </w:r>
+          </w:p>
+        </w:tc>
+        <w:tc>
+          <w:tcPr>
+            <w:tcW w:type="dxa" w:w="700"/>
+            <w:vAlign w:val="center"/>
+          </w:tcPr>
+          <w:p>
+            <w:pPr>
+              <w:jc w:val="center"/>
+            </w:pPr>
+            <w:r>
+              <w:rPr>
+                <w:rFonts w:ascii="Times New Roman" w:cs="Times New Roman" w:eastAsia="Times New Roman" w:hAnsi="Times New Roman"/>
+                <w:sz w:val="22"/>
+                <w:szCs w:val="22"/>
+              </w:rPr>
+              <w:t xml:space="preserve">No</w:t>
+            </w:r>
+          </w:p>
+        </w:tc>
+        <w:tc>
+          <w:tcPr>
+            <w:tcW w:type="dxa" w:w="900"/>
+            <w:vAlign w:val="center"/>
+          </w:tcPr>
+          <w:p>
+            <w:pPr>
+              <w:jc w:val="center"/>
+            </w:pPr>
+            <w:r>
+              <w:rPr>
+                <w:rFonts w:ascii="Times New Roman" w:cs="Times New Roman" w:eastAsia="Times New Roman" w:hAnsi="Times New Roman"/>
+                <w:sz w:val="22"/>
+                <w:szCs w:val="22"/>
+              </w:rPr>
+              <w:t xml:space="preserve">20H / 0M</w:t>
+            </w:r>
+          </w:p>
+        </w:tc>
+        <w:tc>
+          <w:tcPr>
+            <w:tcW w:type="dxa" w:w="800"/>
+            <w:vAlign w:val="center"/>
+          </w:tcPr>
+          <w:p>
+            <w:pPr>
+              <w:jc w:val="center"/>
+            </w:pPr>
+            <w:r>
+              <w:rPr>
+                <w:rFonts w:ascii="Times New Roman" w:cs="Times New Roman" w:eastAsia="Times New Roman" w:hAnsi="Times New Roman"/>
+                <w:sz w:val="22"/>
+                <w:szCs w:val="22"/>
+              </w:rPr>
+              <w:t xml:space="preserve">$1.58</w:t>
+            </w:r>
+          </w:p>
+        </w:tc>
+        <w:tc>
+          <w:tcPr>
+            <w:tcW w:type="dxa" w:w="960"/>
+            <w:vAlign w:val="center"/>
+          </w:tcPr>
+          <w:p>
+            <w:pPr>
+              <w:jc w:val="center"/>
+            </w:pPr>
+            <w:r>
+              <w:rPr>
+                <w:rFonts w:ascii="Times New Roman" w:cs="Times New Roman" w:eastAsia="Times New Roman" w:hAnsi="Times New Roman"/>
+                <w:sz w:val="22"/>
+                <w:szCs w:val="22"/>
+              </w:rPr>
+              <w:t xml:space="preserve">Over-detects SE</w:t>
+            </w:r>
+          </w:p>
+        </w:tc>
+      </w:tr>
+      <w:tr>
+        <w:tc>
+          <w:tcPr>
+            <w:tcW w:type="dxa" w:w="1200"/>
+            <w:vAlign w:val="center"/>
+          </w:tcPr>
+          <w:p>
+            <w:pPr>
+              <w:jc w:val="center"/>
+            </w:pPr>
+            <w:r>
+              <w:rPr>
+                <w:rFonts w:ascii="Times New Roman" w:cs="Times New Roman" w:eastAsia="Times New Roman" w:hAnsi="Times New Roman"/>
+                <w:sz w:val="22"/>
+                <w:szCs w:val="22"/>
+              </w:rPr>
+              <w:t xml:space="preserve">Gemini 3 Flash</w:t>
+            </w:r>
+          </w:p>
+        </w:tc>
+        <w:tc>
+          <w:tcPr>
+            <w:tcW w:type="dxa" w:w="800"/>
+            <w:vAlign w:val="center"/>
+          </w:tcPr>
+          <w:p>
+            <w:pPr>
+              <w:jc w:val="center"/>
+            </w:pPr>
+            <w:r>
+              <w:rPr>
+                <w:rFonts w:ascii="Times New Roman" w:cs="Times New Roman" w:eastAsia="Times New Roman" w:hAnsi="Times New Roman"/>
+                <w:sz w:val="22"/>
+                <w:szCs w:val="22"/>
+              </w:rPr>
+              <w:t xml:space="preserve">Google</w:t>
+            </w:r>
+          </w:p>
+        </w:tc>
+        <w:tc>
+          <w:tcPr>
+            <w:tcW w:type="dxa" w:w="700"/>
+            <w:vAlign w:val="center"/>
+          </w:tcPr>
+          <w:p>
+            <w:pPr>
+              <w:jc w:val="center"/>
+            </w:pPr>
+            <w:r>
+              <w:rPr>
+                <w:rFonts w:ascii="Times New Roman" w:cs="Times New Roman" w:eastAsia="Times New Roman" w:hAnsi="Times New Roman"/>
+                <w:sz w:val="22"/>
+                <w:szCs w:val="22"/>
+              </w:rPr>
+              <w:t xml:space="preserve">1</w:t>
+            </w:r>
+          </w:p>
+        </w:tc>
+        <w:tc>
+          <w:tcPr>
+            <w:tcW w:type="dxa" w:w="700"/>
+            <w:vAlign w:val="center"/>
+          </w:tcPr>
+          <w:p>
+            <w:pPr>
+              <w:jc w:val="center"/>
+            </w:pPr>
+            <w:r>
+              <w:rPr>
+                <w:rFonts w:ascii="Times New Roman" w:cs="Times New Roman" w:eastAsia="Times New Roman" w:hAnsi="Times New Roman"/>
+                <w:sz w:val="22"/>
+                <w:szCs w:val="22"/>
+              </w:rPr>
+              <w:t xml:space="preserve">1 (429)</w:t>
+            </w:r>
+          </w:p>
+        </w:tc>
+        <w:tc>
+          <w:tcPr>
+            <w:tcW w:type="dxa" w:w="600"/>
+            <w:vAlign w:val="center"/>
+          </w:tcPr>
+          <w:p>
+            <w:pPr>
+              <w:jc w:val="center"/>
+            </w:pPr>
+            <w:r>
+              <w:rPr>
+                <w:rFonts w:ascii="Times New Roman" w:cs="Times New Roman" w:eastAsia="Times New Roman" w:hAnsi="Times New Roman"/>
+                <w:sz w:val="22"/>
+                <w:szCs w:val="22"/>
+              </w:rPr>
+              <w:t xml:space="preserve">42 s</w:t>
+            </w:r>
+          </w:p>
+        </w:tc>
+        <w:tc>
+          <w:tcPr>
+            <w:tcW w:type="dxa" w:w="700"/>
+            <w:vAlign w:val="center"/>
+          </w:tcPr>
+          <w:p>
+            <w:pPr>
+              <w:jc w:val="center"/>
+            </w:pPr>
+            <w:r>
+              <w:rPr>
+                <w:rFonts w:ascii="Times New Roman" w:cs="Times New Roman" w:eastAsia="Times New Roman" w:hAnsi="Times New Roman"/>
+                <w:sz w:val="22"/>
+                <w:szCs w:val="22"/>
+              </w:rPr>
+              <w:t xml:space="preserve">Yes</w:t>
+            </w:r>
+          </w:p>
+        </w:tc>
+        <w:tc>
+          <w:tcPr>
+            <w:tcW w:type="dxa" w:w="900"/>
+            <w:vAlign w:val="center"/>
+          </w:tcPr>
+          <w:p>
+            <w:pPr>
+              <w:jc w:val="center"/>
+            </w:pPr>
+            <w:r>
+              <w:rPr>
+                <w:rFonts w:ascii="Times New Roman" w:cs="Times New Roman" w:eastAsia="Times New Roman" w:hAnsi="Times New Roman"/>
+                <w:sz w:val="22"/>
+                <w:szCs w:val="22"/>
+              </w:rPr>
+              <w:t xml:space="preserve">18H / 1M</w:t>
+            </w:r>
+          </w:p>
+        </w:tc>
+        <w:tc>
+          <w:tcPr>
+            <w:tcW w:type="dxa" w:w="800"/>
+            <w:vAlign w:val="center"/>
+          </w:tcPr>
+          <w:p>
+            <w:pPr>
+              <w:jc w:val="center"/>
+            </w:pPr>
+            <w:r>
+              <w:rPr>
+                <w:rFonts w:ascii="Times New Roman" w:cs="Times New Roman" w:eastAsia="Times New Roman" w:hAnsi="Times New Roman"/>
+                <w:sz w:val="22"/>
+                <w:szCs w:val="22"/>
+              </w:rPr>
+              <w:t xml:space="preserve">$0.80</w:t>
+            </w:r>
+          </w:p>
+        </w:tc>
+        <w:tc>
+          <w:tcPr>
+            <w:tcW w:type="dxa" w:w="960"/>
+            <w:vAlign w:val="center"/>
+          </w:tcPr>
+          <w:p>
+            <w:pPr>
+              <w:jc w:val="center"/>
+            </w:pPr>
+            <w:r>
+              <w:rPr>
+                <w:rFonts w:ascii="Times New Roman" w:cs="Times New Roman" w:eastAsia="Times New Roman" w:hAnsi="Times New Roman"/>
+                <w:sz w:val="22"/>
+                <w:szCs w:val="22"/>
+              </w:rPr>
+              <w:t xml:space="preserve">Schema err</w:t>
+            </w:r>
+          </w:p>
+        </w:tc>
+      </w:tr>
+      <w:tr>
+        <w:tc>
+          <w:tcPr>
+            <w:tcW w:type="dxa" w:w="1200"/>
+            <w:vAlign w:val="center"/>
+          </w:tcPr>
+          <w:p>
+            <w:pPr>
+              <w:jc w:val="center"/>
+            </w:pPr>
+            <w:r>
+              <w:rPr>
+                <w:rFonts w:ascii="Times New Roman" w:cs="Times New Roman" w:eastAsia="Times New Roman" w:hAnsi="Times New Roman"/>
+                <w:sz w:val="22"/>
+                <w:szCs w:val="22"/>
+              </w:rPr>
+              <w:t xml:space="preserve">Sonnet 4.5</w:t>
+            </w:r>
+          </w:p>
+        </w:tc>
+        <w:tc>
+          <w:tcPr>
+            <w:tcW w:type="dxa" w:w="800"/>
+            <w:vAlign w:val="center"/>
+          </w:tcPr>
+          <w:p>
+            <w:pPr>
+              <w:jc w:val="center"/>
+            </w:pPr>
+            <w:r>
+              <w:rPr>
+                <w:rFonts w:ascii="Times New Roman" w:cs="Times New Roman" w:eastAsia="Times New Roman" w:hAnsi="Times New Roman"/>
+                <w:sz w:val="22"/>
+                <w:szCs w:val="22"/>
+              </w:rPr>
+              <w:t xml:space="preserve">Anthropic</w:t>
+            </w:r>
+          </w:p>
+        </w:tc>
+        <w:tc>
+          <w:tcPr>
+            <w:tcW w:type="dxa" w:w="700"/>
+            <w:vAlign w:val="center"/>
+          </w:tcPr>
+          <w:p>
+            <w:pPr>
+              <w:jc w:val="center"/>
+            </w:pPr>
+            <w:r>
+              <w:rPr>
+                <w:rFonts w:ascii="Times New Roman" w:cs="Times New Roman" w:eastAsia="Times New Roman" w:hAnsi="Times New Roman"/>
+                <w:sz w:val="22"/>
+                <w:szCs w:val="22"/>
+              </w:rPr>
+              <w:t xml:space="preserve">1</w:t>
+            </w:r>
+          </w:p>
+        </w:tc>
+        <w:tc>
+          <w:tcPr>
+            <w:tcW w:type="dxa" w:w="700"/>
+            <w:vAlign w:val="center"/>
+          </w:tcPr>
+          <w:p>
+            <w:pPr>
+              <w:jc w:val="center"/>
+            </w:pPr>
+            <w:r>
+              <w:rPr>
+                <w:rFonts w:ascii="Times New Roman" w:cs="Times New Roman" w:eastAsia="Times New Roman" w:hAnsi="Times New Roman"/>
+                <w:sz w:val="22"/>
+                <w:szCs w:val="22"/>
+              </w:rPr>
+              <w:t xml:space="preserve">0</w:t>
+            </w:r>
+          </w:p>
+        </w:tc>
+        <w:tc>
+          <w:tcPr>
+            <w:tcW w:type="dxa" w:w="600"/>
+            <w:vAlign w:val="center"/>
+          </w:tcPr>
+          <w:p>
+            <w:pPr>
+              <w:jc w:val="center"/>
+            </w:pPr>
+            <w:r>
+              <w:rPr>
+                <w:rFonts w:ascii="Times New Roman" w:cs="Times New Roman" w:eastAsia="Times New Roman" w:hAnsi="Times New Roman"/>
+                <w:sz w:val="22"/>
+                <w:szCs w:val="22"/>
+              </w:rPr>
+              <w:t xml:space="preserve">71 s</w:t>
+            </w:r>
+          </w:p>
+        </w:tc>
+        <w:tc>
+          <w:tcPr>
+            <w:tcW w:type="dxa" w:w="700"/>
+            <w:vAlign w:val="center"/>
+          </w:tcPr>
+          <w:p>
+            <w:pPr>
+              <w:jc w:val="center"/>
+            </w:pPr>
+            <w:r>
+              <w:rPr>
+                <w:rFonts w:ascii="Times New Roman" w:cs="Times New Roman" w:eastAsia="Times New Roman" w:hAnsi="Times New Roman"/>
+                <w:sz w:val="22"/>
+                <w:szCs w:val="22"/>
+              </w:rPr>
+              <w:t xml:space="preserve">Yes</w:t>
+            </w:r>
+          </w:p>
+        </w:tc>
+        <w:tc>
+          <w:tcPr>
+            <w:tcW w:type="dxa" w:w="900"/>
+            <w:vAlign w:val="center"/>
+          </w:tcPr>
+          <w:p>
+            <w:pPr>
+              <w:jc w:val="center"/>
+            </w:pPr>
+            <w:r>
+              <w:rPr>
+                <w:rFonts w:ascii="Times New Roman" w:cs="Times New Roman" w:eastAsia="Times New Roman" w:hAnsi="Times New Roman"/>
+                <w:sz w:val="22"/>
+                <w:szCs w:val="22"/>
+              </w:rPr>
+              <w:t xml:space="preserve">19H / 1M</w:t>
+            </w:r>
+          </w:p>
+        </w:tc>
+        <w:tc>
+          <w:tcPr>
+            <w:tcW w:type="dxa" w:w="800"/>
+            <w:vAlign w:val="center"/>
+          </w:tcPr>
+          <w:p>
+            <w:pPr>
+              <w:jc w:val="center"/>
+            </w:pPr>
+            <w:r>
+              <w:rPr>
+                <w:rFonts w:ascii="Times New Roman" w:cs="Times New Roman" w:eastAsia="Times New Roman" w:hAnsi="Times New Roman"/>
+                <w:sz w:val="22"/>
+                <w:szCs w:val="22"/>
+              </w:rPr>
+              <w:t xml:space="preserve">$4.72</w:t>
+            </w:r>
+          </w:p>
+        </w:tc>
+        <w:tc>
+          <w:tcPr>
+            <w:tcW w:type="dxa" w:w="960"/>
+            <w:vAlign w:val="center"/>
+          </w:tcPr>
+          <w:p>
+            <w:pPr>
+              <w:jc w:val="center"/>
+            </w:pPr>
+            <w:r>
+              <w:rPr>
+                <w:rFonts w:ascii="Times New Roman" w:cs="Times New Roman" w:eastAsia="Times New Roman" w:hAnsi="Times New Roman"/>
+                <w:sz w:val="22"/>
+                <w:szCs w:val="22"/>
+              </w:rPr>
+              <w:t xml:space="preserve">Schema err</w:t>
+            </w:r>
+          </w:p>
+        </w:tc>
+      </w:tr>
+      <w:tr>
+        <w:tc>
+          <w:tcPr>
+            <w:tcW w:type="dxa" w:w="1200"/>
+            <w:vAlign w:val="center"/>
+          </w:tcPr>
+          <w:p>
+            <w:pPr>
+              <w:jc w:val="center"/>
+            </w:pPr>
+            <w:r>
+              <w:rPr>
+                <w:rFonts w:ascii="Times New Roman" w:cs="Times New Roman" w:eastAsia="Times New Roman" w:hAnsi="Times New Roman"/>
+                <w:sz w:val="22"/>
+                <w:szCs w:val="22"/>
+              </w:rPr>
+              <w:t xml:space="preserve">Gemini 2.0 Flash</w:t>
+            </w:r>
+          </w:p>
+        </w:tc>
+        <w:tc>
+          <w:tcPr>
+            <w:tcW w:type="dxa" w:w="800"/>
+            <w:vAlign w:val="center"/>
+          </w:tcPr>
+          <w:p>
+            <w:pPr>
+              <w:jc w:val="center"/>
+            </w:pPr>
+            <w:r>
+              <w:rPr>
+                <w:rFonts w:ascii="Times New Roman" w:cs="Times New Roman" w:eastAsia="Times New Roman" w:hAnsi="Times New Roman"/>
+                <w:sz w:val="22"/>
+                <w:szCs w:val="22"/>
+              </w:rPr>
+              <w:t xml:space="preserve">Google</w:t>
+            </w:r>
+          </w:p>
+        </w:tc>
+        <w:tc>
+          <w:tcPr>
+            <w:tcW w:type="dxa" w:w="700"/>
+            <w:vAlign w:val="center"/>
+          </w:tcPr>
+          <w:p>
+            <w:pPr>
+              <w:jc w:val="center"/>
+            </w:pPr>
+            <w:r>
+              <w:rPr>
+                <w:rFonts w:ascii="Times New Roman" w:cs="Times New Roman" w:eastAsia="Times New Roman" w:hAnsi="Times New Roman"/>
+                <w:sz w:val="22"/>
+                <w:szCs w:val="22"/>
+              </w:rPr>
+              <w:t xml:space="preserve">2</w:t>
+            </w:r>
+          </w:p>
+        </w:tc>
+        <w:tc>
+          <w:tcPr>
+            <w:tcW w:type="dxa" w:w="700"/>
+            <w:vAlign w:val="center"/>
+          </w:tcPr>
+          <w:p>
+            <w:pPr>
+              <w:jc w:val="center"/>
+            </w:pPr>
+            <w:r>
+              <w:rPr>
+                <w:rFonts w:ascii="Times New Roman" w:cs="Times New Roman" w:eastAsia="Times New Roman" w:hAnsi="Times New Roman"/>
+                <w:sz w:val="22"/>
+                <w:szCs w:val="22"/>
+              </w:rPr>
+              <w:t xml:space="preserve">0</w:t>
+            </w:r>
+          </w:p>
+        </w:tc>
+        <w:tc>
+          <w:tcPr>
+            <w:tcW w:type="dxa" w:w="600"/>
+            <w:vAlign w:val="center"/>
+          </w:tcPr>
+          <w:p>
+            <w:pPr>
+              <w:jc w:val="center"/>
+            </w:pPr>
+            <w:r>
+              <w:rPr>
+                <w:rFonts w:ascii="Times New Roman" w:cs="Times New Roman" w:eastAsia="Times New Roman" w:hAnsi="Times New Roman"/>
+                <w:sz w:val="22"/>
+                <w:szCs w:val="22"/>
+              </w:rPr>
+              <w:t xml:space="preserve">34 s</w:t>
+            </w:r>
+          </w:p>
+        </w:tc>
+        <w:tc>
+          <w:tcPr>
+            <w:tcW w:type="dxa" w:w="700"/>
+            <w:vAlign w:val="center"/>
+          </w:tcPr>
+          <w:p>
+            <w:pPr>
+              <w:jc w:val="center"/>
+            </w:pPr>
+            <w:r>
+              <w:rPr>
+                <w:rFonts w:ascii="Times New Roman" w:cs="Times New Roman" w:eastAsia="Times New Roman" w:hAnsi="Times New Roman"/>
+                <w:sz w:val="22"/>
+                <w:szCs w:val="22"/>
+              </w:rPr>
+              <w:t xml:space="preserve">No</w:t>
+            </w:r>
+          </w:p>
+        </w:tc>
+        <w:tc>
+          <w:tcPr>
+            <w:tcW w:type="dxa" w:w="900"/>
+            <w:vAlign w:val="center"/>
+          </w:tcPr>
+          <w:p>
+            <w:pPr>
+              <w:jc w:val="center"/>
+            </w:pPr>
+            <w:r>
+              <w:rPr>
+                <w:rFonts w:ascii="Times New Roman" w:cs="Times New Roman" w:eastAsia="Times New Roman" w:hAnsi="Times New Roman"/>
+                <w:sz w:val="22"/>
+                <w:szCs w:val="22"/>
+              </w:rPr>
+              <w:t xml:space="preserve">20H / 0M</w:t>
+            </w:r>
+          </w:p>
+        </w:tc>
+        <w:tc>
+          <w:tcPr>
+            <w:tcW w:type="dxa" w:w="800"/>
+            <w:vAlign w:val="center"/>
+          </w:tcPr>
+          <w:p>
+            <w:pPr>
+              <w:jc w:val="center"/>
+            </w:pPr>
+            <w:r>
+              <w:rPr>
+                <w:rFonts w:ascii="Times New Roman" w:cs="Times New Roman" w:eastAsia="Times New Roman" w:hAnsi="Times New Roman"/>
+                <w:sz w:val="22"/>
+                <w:szCs w:val="22"/>
+              </w:rPr>
+              <w:t xml:space="preserve">$0.15</w:t>
+            </w:r>
+          </w:p>
+        </w:tc>
+        <w:tc>
+          <w:tcPr>
+            <w:tcW w:type="dxa" w:w="960"/>
+            <w:vAlign w:val="center"/>
+          </w:tcPr>
+          <w:p>
+            <w:pPr>
+              <w:jc w:val="center"/>
+            </w:pPr>
+            <w:r>
+              <w:rPr>
+                <w:rFonts w:ascii="Times New Roman" w:cs="Times New Roman" w:eastAsia="Times New Roman" w:hAnsi="Times New Roman"/>
+                <w:sz w:val="22"/>
+                <w:szCs w:val="22"/>
+              </w:rPr>
+              <w:t xml:space="preserve">Disqualified</w:t>
+            </w:r>
+          </w:p>
+        </w:tc>
+      </w:tr>
+      <w:tr>
+        <w:tc>
+          <w:tcPr>
+            <w:tcW w:type="dxa" w:w="1200"/>
+            <w:vAlign w:val="center"/>
+          </w:tcPr>
+          <w:p>
+            <w:pPr>
+              <w:jc w:val="center"/>
+            </w:pPr>
+            <w:r>
+              <w:rPr>
+                <w:rFonts w:ascii="Times New Roman" w:cs="Times New Roman" w:eastAsia="Times New Roman" w:hAnsi="Times New Roman"/>
+                <w:sz w:val="22"/>
+                <w:szCs w:val="22"/>
+              </w:rPr>
+              <w:t xml:space="preserve">Minimax M2.1</w:t>
+            </w:r>
+          </w:p>
+        </w:tc>
+        <w:tc>
+          <w:tcPr>
+            <w:tcW w:type="dxa" w:w="800"/>
+            <w:vAlign w:val="center"/>
+          </w:tcPr>
+          <w:p>
+            <w:pPr>
+              <w:jc w:val="center"/>
+            </w:pPr>
+            <w:r>
+              <w:rPr>
+                <w:rFonts w:ascii="Times New Roman" w:cs="Times New Roman" w:eastAsia="Times New Roman" w:hAnsi="Times New Roman"/>
+                <w:sz w:val="22"/>
+                <w:szCs w:val="22"/>
+              </w:rPr>
+              <w:t xml:space="preserve">Minimax</w:t>
+            </w:r>
+          </w:p>
+        </w:tc>
+        <w:tc>
+          <w:tcPr>
+            <w:tcW w:type="dxa" w:w="700"/>
+            <w:vAlign w:val="center"/>
+          </w:tcPr>
+          <w:p>
+            <w:pPr>
+              <w:jc w:val="center"/>
+            </w:pPr>
+            <w:r>
+              <w:rPr>
+                <w:rFonts w:ascii="Times New Roman" w:cs="Times New Roman" w:eastAsia="Times New Roman" w:hAnsi="Times New Roman"/>
+                <w:sz w:val="22"/>
+                <w:szCs w:val="22"/>
+              </w:rPr>
+              <w:t xml:space="preserve">—</w:t>
+            </w:r>
+          </w:p>
+        </w:tc>
+        <w:tc>
+          <w:tcPr>
+            <w:tcW w:type="dxa" w:w="700"/>
+            <w:vAlign w:val="center"/>
+          </w:tcPr>
+          <w:p>
+            <w:pPr>
+              <w:jc w:val="center"/>
+            </w:pPr>
+            <w:r>
+              <w:rPr>
+                <w:rFonts w:ascii="Times New Roman" w:cs="Times New Roman" w:eastAsia="Times New Roman" w:hAnsi="Times New Roman"/>
+                <w:sz w:val="22"/>
+                <w:szCs w:val="22"/>
+              </w:rPr>
+              <w:t xml:space="preserve">19/20</w:t>
+            </w:r>
+          </w:p>
+        </w:tc>
+        <w:tc>
+          <w:tcPr>
+            <w:tcW w:type="dxa" w:w="600"/>
+            <w:vAlign w:val="center"/>
+          </w:tcPr>
+          <w:p>
+            <w:pPr>
+              <w:jc w:val="center"/>
+            </w:pPr>
+            <w:r>
+              <w:rPr>
+                <w:rFonts w:ascii="Times New Roman" w:cs="Times New Roman" w:eastAsia="Times New Roman" w:hAnsi="Times New Roman"/>
+                <w:sz w:val="22"/>
+                <w:szCs w:val="22"/>
+              </w:rPr>
+              <w:t xml:space="preserve">83 s</w:t>
+            </w:r>
+          </w:p>
+        </w:tc>
+        <w:tc>
+          <w:tcPr>
+            <w:tcW w:type="dxa" w:w="700"/>
+            <w:vAlign w:val="center"/>
+          </w:tcPr>
+          <w:p>
+            <w:pPr>
+              <w:jc w:val="center"/>
+            </w:pPr>
+            <w:r>
+              <w:rPr>
+                <w:rFonts w:ascii="Times New Roman" w:cs="Times New Roman" w:eastAsia="Times New Roman" w:hAnsi="Times New Roman"/>
+                <w:sz w:val="22"/>
+                <w:szCs w:val="22"/>
+              </w:rPr>
+              <w:t xml:space="preserve">—</w:t>
+            </w:r>
+          </w:p>
+        </w:tc>
+        <w:tc>
+          <w:tcPr>
+            <w:tcW w:type="dxa" w:w="900"/>
+            <w:vAlign w:val="center"/>
+          </w:tcPr>
+          <w:p>
+            <w:pPr>
+              <w:jc w:val="center"/>
+            </w:pPr>
+            <w:r>
+              <w:rPr>
+                <w:rFonts w:ascii="Times New Roman" w:cs="Times New Roman" w:eastAsia="Times New Roman" w:hAnsi="Times New Roman"/>
+                <w:sz w:val="22"/>
+                <w:szCs w:val="22"/>
+              </w:rPr>
+              <w:t xml:space="preserve">—</w:t>
+            </w:r>
+          </w:p>
+        </w:tc>
+        <w:tc>
+          <w:tcPr>
+            <w:tcW w:type="dxa" w:w="800"/>
+            <w:vAlign w:val="center"/>
+          </w:tcPr>
+          <w:p>
+            <w:pPr>
+              <w:jc w:val="center"/>
+            </w:pPr>
+            <w:r>
+              <w:rPr>
+                <w:rFonts w:ascii="Times New Roman" w:cs="Times New Roman" w:eastAsia="Times New Roman" w:hAnsi="Times New Roman"/>
+                <w:sz w:val="22"/>
+                <w:szCs w:val="22"/>
+              </w:rPr>
+              <w:t xml:space="preserve">—</w:t>
+            </w:r>
+          </w:p>
+        </w:tc>
+        <w:tc>
+          <w:tcPr>
+            <w:tcW w:type="dxa" w:w="960"/>
+            <w:vAlign w:val="center"/>
+          </w:tcPr>
+          <w:p>
+            <w:pPr>
+              <w:jc w:val="center"/>
+            </w:pPr>
+            <w:r>
+              <w:rPr>
+                <w:rFonts w:ascii="Times New Roman" w:cs="Times New Roman" w:eastAsia="Times New Roman" w:hAnsi="Times New Roman"/>
+                <w:sz w:val="22"/>
+                <w:szCs w:val="22"/>
+              </w:rPr>
+              <w:t xml:space="preserve">Disqualified</w:t>
+            </w:r>
+          </w:p>
+        </w:tc>
+      </w:tr>
+      <w:tr>
+        <w:tc>
+          <w:tcPr>
+            <w:tcW w:type="dxa" w:w="1200"/>
+            <w:vAlign w:val="center"/>
+          </w:tcPr>
+          <w:p>
+            <w:pPr>
+              <w:jc w:val="center"/>
+            </w:pPr>
+            <w:r>
+              <w:rPr>
+                <w:rFonts w:ascii="Times New Roman" w:cs="Times New Roman" w:eastAsia="Times New Roman" w:hAnsi="Times New Roman"/>
+                <w:sz w:val="22"/>
+                <w:szCs w:val="22"/>
+              </w:rPr>
+              <w:t xml:space="preserve">Kimi K2.5</w:t>
+            </w:r>
+          </w:p>
+        </w:tc>
+        <w:tc>
+          <w:tcPr>
+            <w:tcW w:type="dxa" w:w="800"/>
+            <w:vAlign w:val="center"/>
+          </w:tcPr>
+          <w:p>
+            <w:pPr>
+              <w:jc w:val="center"/>
+            </w:pPr>
+            <w:r>
+              <w:rPr>
+                <w:rFonts w:ascii="Times New Roman" w:cs="Times New Roman" w:eastAsia="Times New Roman" w:hAnsi="Times New Roman"/>
+                <w:sz w:val="22"/>
+                <w:szCs w:val="22"/>
+              </w:rPr>
+              <w:t xml:space="preserve">Moonshot</w:t>
+            </w:r>
+          </w:p>
+        </w:tc>
+        <w:tc>
+          <w:tcPr>
+            <w:tcW w:type="dxa" w:w="700"/>
+            <w:vAlign w:val="center"/>
+          </w:tcPr>
+          <w:p>
+            <w:pPr>
+              <w:jc w:val="center"/>
+            </w:pPr>
+            <w:r>
+              <w:rPr>
+                <w:rFonts w:ascii="Times New Roman" w:cs="Times New Roman" w:eastAsia="Times New Roman" w:hAnsi="Times New Roman"/>
+                <w:sz w:val="22"/>
+                <w:szCs w:val="22"/>
+              </w:rPr>
+              <w:t xml:space="preserve">—</w:t>
+            </w:r>
+          </w:p>
+        </w:tc>
+        <w:tc>
+          <w:tcPr>
+            <w:tcW w:type="dxa" w:w="700"/>
+            <w:vAlign w:val="center"/>
+          </w:tcPr>
+          <w:p>
+            <w:pPr>
+              <w:jc w:val="center"/>
+            </w:pPr>
+            <w:r>
+              <w:rPr>
+                <w:rFonts w:ascii="Times New Roman" w:cs="Times New Roman" w:eastAsia="Times New Roman" w:hAnsi="Times New Roman"/>
+                <w:sz w:val="22"/>
+                <w:szCs w:val="22"/>
+              </w:rPr>
+              <w:t xml:space="preserve">20/20</w:t>
+            </w:r>
+          </w:p>
+        </w:tc>
+        <w:tc>
+          <w:tcPr>
+            <w:tcW w:type="dxa" w:w="600"/>
+            <w:vAlign w:val="center"/>
+          </w:tcPr>
+          <w:p>
+            <w:pPr>
+              <w:jc w:val="center"/>
+            </w:pPr>
+            <w:r>
+              <w:rPr>
+                <w:rFonts w:ascii="Times New Roman" w:cs="Times New Roman" w:eastAsia="Times New Roman" w:hAnsi="Times New Roman"/>
+                <w:sz w:val="22"/>
+                <w:szCs w:val="22"/>
+              </w:rPr>
+              <w:t xml:space="preserve">173 s</w:t>
+            </w:r>
+          </w:p>
+        </w:tc>
+        <w:tc>
+          <w:tcPr>
+            <w:tcW w:type="dxa" w:w="700"/>
+            <w:vAlign w:val="center"/>
+          </w:tcPr>
+          <w:p>
+            <w:pPr>
+              <w:jc w:val="center"/>
+            </w:pPr>
+            <w:r>
+              <w:rPr>
+                <w:rFonts w:ascii="Times New Roman" w:cs="Times New Roman" w:eastAsia="Times New Roman" w:hAnsi="Times New Roman"/>
+                <w:sz w:val="22"/>
+                <w:szCs w:val="22"/>
+              </w:rPr>
+              <w:t xml:space="preserve">—</w:t>
+            </w:r>
+          </w:p>
+        </w:tc>
+        <w:tc>
+          <w:tcPr>
+            <w:tcW w:type="dxa" w:w="900"/>
+            <w:vAlign w:val="center"/>
+          </w:tcPr>
+          <w:p>
+            <w:pPr>
+              <w:jc w:val="center"/>
+            </w:pPr>
+            <w:r>
+              <w:rPr>
+                <w:rFonts w:ascii="Times New Roman" w:cs="Times New Roman" w:eastAsia="Times New Roman" w:hAnsi="Times New Roman"/>
+                <w:sz w:val="22"/>
+                <w:szCs w:val="22"/>
+              </w:rPr>
+              <w:t xml:space="preserve">—</w:t>
+            </w:r>
+          </w:p>
+        </w:tc>
+        <w:tc>
+          <w:tcPr>
+            <w:tcW w:type="dxa" w:w="800"/>
+            <w:vAlign w:val="center"/>
+          </w:tcPr>
+          <w:p>
+            <w:pPr>
+              <w:jc w:val="center"/>
+            </w:pPr>
+            <w:r>
+              <w:rPr>
+                <w:rFonts w:ascii="Times New Roman" w:cs="Times New Roman" w:eastAsia="Times New Roman" w:hAnsi="Times New Roman"/>
+                <w:sz w:val="22"/>
+                <w:szCs w:val="22"/>
+              </w:rPr>
+              <w:t xml:space="preserve">—</w:t>
+            </w:r>
+          </w:p>
+        </w:tc>
+        <w:tc>
+          <w:tcPr>
+            <w:tcW w:type="dxa" w:w="960"/>
+            <w:vAlign w:val="center"/>
+          </w:tcPr>
+          <w:p>
+            <w:pPr>
+              <w:jc w:val="center"/>
+            </w:pPr>
+            <w:r>
+              <w:rPr>
+                <w:rFonts w:ascii="Times New Roman" w:cs="Times New Roman" w:eastAsia="Times New Roman" w:hAnsi="Times New Roman"/>
+                <w:sz w:val="22"/>
+                <w:szCs w:val="22"/>
+              </w:rPr>
+              <w:t xml:space="preserve">Disqualified</w:t>
+            </w:r>
+          </w:p>
+        </w:tc>
+      </w:tr>
+    </w:tbl>
+    <w:p>
+      <w:pPr>
+        <w:spacing w:line="360" w:after="200"/>
+        <w:jc w:val="left"/>
+      </w:pPr>
+      <w:r>
+        <w:rPr>
+          <w:rFonts w:ascii="Times New Roman" w:cs="Times New Roman" w:eastAsia="Times New Roman" w:hAnsi="Times New Roman"/>
+          <w:sz w:val="24"/>
+          <w:szCs w:val="24"/>
+        </w:rPr>
+        <w:t xml:space="preserve">Schema violations occur when a diagnose item returns the confirm-format JSON (e.g., understanding_level instead of diagnosis_type). Three models were disqualified: Minimax M2.1 and Kimi K2.5 returned empty or unparseable responses on nearly all items; Gemini 2.0 Flash produced two schema violations and lacked any partial-credit classifications.</w:t>
+      </w:r>
+    </w:p>
+    <w:p>
+      <w:pPr>
+        <w:spacing w:before="240" w:after="120"/>
+        <w:jc w:val="center"/>
+      </w:pPr>
+      <w:r>
+        <w:rPr>
+          <w:rFonts w:ascii="Times New Roman" w:cs="Times New Roman" w:eastAsia="Times New Roman" w:hAnsi="Times New Roman"/>
+          <w:b/>
+          <w:bCs/>
+          <w:i/>
+          <w:iCs/>
+          <w:sz w:val="22"/>
+          <w:szCs w:val="22"/>
+        </w:rPr>
+        <w:t xml:space="preserve">Table D.2: Inter-Model Agreement on Disputed Classifications</w:t>
+      </w:r>
+    </w:p>
+    <w:tbl>
+      <w:tblPr>
+        <w:tblW w:type="dxa" w:w="9360"/>
+        <w:tblBorders>
+          <w:top w:val="single" w:color="CCCCCC" w:sz="1"/>
+          <w:left w:val="single" w:color="CCCCCC" w:sz="1"/>
+          <w:bottom w:val="single" w:color="CCCCCC" w:sz="1"/>
+          <w:right w:val="single" w:color="CCCCCC" w:sz="1"/>
+          <w:insideH w:val="single" w:color="CCCCCC" w:sz="1"/>
+          <w:insideV w:val="single" w:color="CCCCCC" w:sz="1"/>
+        </w:tblBorders>
+        <w:tblLayout w:type="fixed"/>
+        <w:tblCellMar>
+          <w:top w:type="dxa" w:w="60"/>
+          <w:left w:type="dxa" w:w="120"/>
+          <w:bottom w:type="dxa" w:w="60"/>
+          <w:right w:type="dxa" w:w="120"/>
+        </w:tblCellMar>
+      </w:tblPr>
+      <w:tblGrid>
+        <w:gridCol w:w="900"/>
+        <w:gridCol w:w="1260"/>
+        <w:gridCol w:w="1200"/>
+        <w:gridCol w:w="1200"/>
+        <w:gridCol w:w="1200"/>
+        <w:gridCol w:w="1200"/>
+        <w:gridCol w:w="1200"/>
+      </w:tblGrid>
+      <w:tr>
+        <w:trPr>
+          <w:tblHeader/>
+        </w:trPr>
+        <w:tc>
+          <w:tcPr>
+            <w:tcW w:type="dxa" w:w="900"/>
+            <w:shd w:fill="D5E8F0" w:color="auto" w:val="clear"/>
+            <w:vAlign w:val="center"/>
+          </w:tcPr>
+          <w:p>
+            <w:pPr>
+              <w:jc w:val="center"/>
+            </w:pPr>
+            <w:r>
+              <w:rPr>
+                <w:rFonts w:ascii="Times New Roman" w:cs="Times New Roman" w:eastAsia="Times New Roman" w:hAnsi="Times New Roman"/>
+                <w:b/>
+                <w:bCs/>
+                <w:sz w:val="22"/>
+                <w:szCs w:val="22"/>
+              </w:rPr>
+              <w:t xml:space="preserve">Response</w:t>
+            </w:r>
+          </w:p>
+        </w:tc>
+        <w:tc>
+          <w:tcPr>
+            <w:tcW w:type="dxa" w:w="1260"/>
+            <w:shd w:fill="D5E8F0" w:color="auto" w:val="clear"/>
+            <w:vAlign w:val="center"/>
+          </w:tcPr>
+          <w:p>
+            <w:pPr>
+              <w:jc w:val="center"/>
+            </w:pPr>
+            <w:r>
+              <w:rPr>
+                <w:rFonts w:ascii="Times New Roman" w:cs="Times New Roman" w:eastAsia="Times New Roman" w:hAnsi="Times New Roman"/>
+                <w:b/>
+                <w:bCs/>
+                <w:sz w:val="22"/>
+                <w:szCs w:val="22"/>
+              </w:rPr>
+              <w:t xml:space="preserve">Student Text</w:t>
+            </w:r>
+          </w:p>
+        </w:tc>
+        <w:tc>
+          <w:tcPr>
+            <w:tcW w:type="dxa" w:w="1200"/>
+            <w:shd w:fill="D5E8F0" w:color="auto" w:val="clear"/>
+            <w:vAlign w:val="center"/>
+          </w:tcPr>
+          <w:p>
+            <w:pPr>
+              <w:jc w:val="center"/>
+            </w:pPr>
+            <w:r>
+              <w:rPr>
+                <w:rFonts w:ascii="Times New Roman" w:cs="Times New Roman" w:eastAsia="Times New Roman" w:hAnsi="Times New Roman"/>
+                <w:b/>
+                <w:bCs/>
+                <w:sz w:val="22"/>
+                <w:szCs w:val="22"/>
+              </w:rPr>
+              <w:t xml:space="preserve">GPT-4.1</w:t>
+            </w:r>
+          </w:p>
+        </w:tc>
+        <w:tc>
+          <w:tcPr>
+            <w:tcW w:type="dxa" w:w="1200"/>
+            <w:shd w:fill="D5E8F0" w:color="auto" w:val="clear"/>
+            <w:vAlign w:val="center"/>
+          </w:tcPr>
+          <w:p>
+            <w:pPr>
+              <w:jc w:val="center"/>
+            </w:pPr>
+            <w:r>
+              <w:rPr>
+                <w:rFonts w:ascii="Times New Roman" w:cs="Times New Roman" w:eastAsia="Times New Roman" w:hAnsi="Times New Roman"/>
+                <w:b/>
+                <w:bCs/>
+                <w:sz w:val="22"/>
+                <w:szCs w:val="22"/>
+              </w:rPr>
+              <w:t xml:space="preserve">DeepSeek V3.2</w:t>
+            </w:r>
+          </w:p>
+        </w:tc>
+        <w:tc>
+          <w:tcPr>
+            <w:tcW w:type="dxa" w:w="1200"/>
+            <w:shd w:fill="D5E8F0" w:color="auto" w:val="clear"/>
+            <w:vAlign w:val="center"/>
+          </w:tcPr>
+          <w:p>
+            <w:pPr>
+              <w:jc w:val="center"/>
+            </w:pPr>
+            <w:r>
+              <w:rPr>
+                <w:rFonts w:ascii="Times New Roman" w:cs="Times New Roman" w:eastAsia="Times New Roman" w:hAnsi="Times New Roman"/>
+                <w:b/>
+                <w:bCs/>
+                <w:sz w:val="22"/>
+                <w:szCs w:val="22"/>
+              </w:rPr>
+              <w:t xml:space="preserve">Grok 4.1 Fast</w:t>
+            </w:r>
+          </w:p>
+        </w:tc>
+        <w:tc>
+          <w:tcPr>
+            <w:tcW w:type="dxa" w:w="1200"/>
+            <w:shd w:fill="D5E8F0" w:color="auto" w:val="clear"/>
+            <w:vAlign w:val="center"/>
+          </w:tcPr>
+          <w:p>
+            <w:pPr>
+              <w:jc w:val="center"/>
+            </w:pPr>
+            <w:r>
+              <w:rPr>
+                <w:rFonts w:ascii="Times New Roman" w:cs="Times New Roman" w:eastAsia="Times New Roman" w:hAnsi="Times New Roman"/>
+                <w:b/>
+                <w:bCs/>
+                <w:sz w:val="22"/>
+                <w:szCs w:val="22"/>
+              </w:rPr>
+              <w:t xml:space="preserve">Haiku 4.5</w:t>
+            </w:r>
+          </w:p>
+        </w:tc>
+        <w:tc>
+          <w:tcPr>
+            <w:tcW w:type="dxa" w:w="1200"/>
+            <w:shd w:fill="D5E8F0" w:color="auto" w:val="clear"/>
+            <w:vAlign w:val="center"/>
+          </w:tcPr>
+          <w:p>
+            <w:pPr>
+              <w:jc w:val="center"/>
+            </w:pPr>
+            <w:r>
+              <w:rPr>
+                <w:rFonts w:ascii="Times New Roman" w:cs="Times New Roman" w:eastAsia="Times New Roman" w:hAnsi="Times New Roman"/>
+                <w:b/>
+                <w:bCs/>
+                <w:sz w:val="22"/>
+                <w:szCs w:val="22"/>
+              </w:rPr>
+              <w:t xml:space="preserve">Qwen3-235B</w:t>
+            </w:r>
+          </w:p>
+        </w:tc>
+      </w:tr>
+      <w:tr>
+        <w:tc>
+          <w:tcPr>
+            <w:tcW w:type="dxa" w:w="900"/>
+            <w:vAlign w:val="center"/>
+          </w:tcPr>
+          <w:p>
+            <w:pPr>
+              <w:jc w:val="center"/>
+            </w:pPr>
+            <w:r>
+              <w:rPr>
+                <w:rFonts w:ascii="Times New Roman" w:cs="Times New Roman" w:eastAsia="Times New Roman" w:hAnsi="Times New Roman"/>
+                <w:sz w:val="22"/>
+                <w:szCs w:val="22"/>
+              </w:rPr>
+              <w:t xml:space="preserve">Q9 Diagnose</w:t>
+            </w:r>
+          </w:p>
+        </w:tc>
+        <w:tc>
+          <w:tcPr>
+            <w:tcW w:type="dxa" w:w="1260"/>
+            <w:vAlign w:val="center"/>
+          </w:tcPr>
+          <w:p>
+            <w:pPr>
+              <w:jc w:val="center"/>
+            </w:pPr>
+            <w:r>
+              <w:rPr>
+                <w:rFonts w:ascii="Times New Roman" w:cs="Times New Roman" w:eastAsia="Times New Roman" w:hAnsi="Times New Roman"/>
+                <w:sz w:val="22"/>
+                <w:szCs w:val="22"/>
+              </w:rPr>
+              <w:t xml:space="preserve">“safety net… preventing interest rates”</w:t>
+            </w:r>
+          </w:p>
+        </w:tc>
+        <w:tc>
+          <w:tcPr>
+            <w:tcW w:type="dxa" w:w="1200"/>
+            <w:vAlign w:val="center"/>
+          </w:tcPr>
+          <w:p>
+            <w:pPr>
+              <w:jc w:val="center"/>
+            </w:pPr>
+            <w:r>
+              <w:rPr>
+                <w:rFonts w:ascii="Times New Roman" w:cs="Times New Roman" w:eastAsia="Times New Roman" w:hAnsi="Times New Roman"/>
+                <w:sz w:val="22"/>
+                <w:szCs w:val="22"/>
+              </w:rPr>
+              <w:t xml:space="preserve">SE (selfcorrect)</w:t>
+            </w:r>
+          </w:p>
+        </w:tc>
+        <w:tc>
+          <w:tcPr>
+            <w:tcW w:type="dxa" w:w="1200"/>
+            <w:vAlign w:val="center"/>
+          </w:tcPr>
+          <w:p>
+            <w:pPr>
+              <w:jc w:val="center"/>
+            </w:pPr>
+            <w:r>
+              <w:rPr>
+                <w:rFonts w:ascii="Times New Roman" w:cs="Times New Roman" w:eastAsia="Times New Roman" w:hAnsi="Times New Roman"/>
+                <w:sz w:val="22"/>
+                <w:szCs w:val="22"/>
+              </w:rPr>
+              <w:t xml:space="preserve">SE (selfcorrect)</w:t>
+            </w:r>
+          </w:p>
+        </w:tc>
+        <w:tc>
+          <w:tcPr>
+            <w:tcW w:type="dxa" w:w="1200"/>
+            <w:vAlign w:val="center"/>
+          </w:tcPr>
+          <w:p>
+            <w:pPr>
+              <w:jc w:val="center"/>
+            </w:pPr>
+            <w:r>
+              <w:rPr>
+                <w:rFonts w:ascii="Times New Roman" w:cs="Times New Roman" w:eastAsia="Times New Roman" w:hAnsi="Times New Roman"/>
+                <w:sz w:val="22"/>
+                <w:szCs w:val="22"/>
+              </w:rPr>
+              <w:t xml:space="preserve">misconc. (BORROW-06)</w:t>
+            </w:r>
+          </w:p>
+        </w:tc>
+        <w:tc>
+          <w:tcPr>
+            <w:tcW w:type="dxa" w:w="1200"/>
+            <w:vAlign w:val="center"/>
+          </w:tcPr>
+          <w:p>
+            <w:pPr>
+              <w:jc w:val="center"/>
+            </w:pPr>
+            <w:r>
+              <w:rPr>
+                <w:rFonts w:ascii="Times New Roman" w:cs="Times New Roman" w:eastAsia="Times New Roman" w:hAnsi="Times New Roman"/>
+                <w:sz w:val="22"/>
+                <w:szCs w:val="22"/>
+              </w:rPr>
+              <w:t xml:space="preserve">SE (selfcorrect)</w:t>
+            </w:r>
+          </w:p>
+        </w:tc>
+        <w:tc>
+          <w:tcPr>
+            <w:tcW w:type="dxa" w:w="1200"/>
+            <w:vAlign w:val="center"/>
+          </w:tcPr>
+          <w:p>
+            <w:pPr>
+              <w:jc w:val="center"/>
+            </w:pPr>
+            <w:r>
+              <w:rPr>
+                <w:rFonts w:ascii="Times New Roman" w:cs="Times New Roman" w:eastAsia="Times New Roman" w:hAnsi="Times New Roman"/>
+                <w:sz w:val="22"/>
+                <w:szCs w:val="22"/>
+              </w:rPr>
+              <w:t xml:space="preserve">misconc. (BORROW-06)</w:t>
+            </w:r>
+          </w:p>
+        </w:tc>
+      </w:tr>
+      <w:tr>
+        <w:tc>
+          <w:tcPr>
+            <w:tcW w:type="dxa" w:w="900"/>
+            <w:vAlign w:val="center"/>
+          </w:tcPr>
+          <w:p>
+            <w:pPr>
+              <w:jc w:val="center"/>
+            </w:pPr>
+            <w:r>
+              <w:rPr>
+                <w:rFonts w:ascii="Times New Roman" w:cs="Times New Roman" w:eastAsia="Times New Roman" w:hAnsi="Times New Roman"/>
+                <w:sz w:val="22"/>
+                <w:szCs w:val="22"/>
+              </w:rPr>
+              <w:t xml:space="preserve">Q5 Diagnose</w:t>
+            </w:r>
+          </w:p>
+        </w:tc>
+        <w:tc>
+          <w:tcPr>
+            <w:tcW w:type="dxa" w:w="1260"/>
+            <w:vAlign w:val="center"/>
+          </w:tcPr>
+          <w:p>
+            <w:pPr>
+              <w:jc w:val="center"/>
+            </w:pPr>
+            <w:r>
+              <w:rPr>
+                <w:rFonts w:ascii="Times New Roman" w:cs="Times New Roman" w:eastAsia="Times New Roman" w:hAnsi="Times New Roman"/>
+                <w:sz w:val="22"/>
+                <w:szCs w:val="22"/>
+              </w:rPr>
+              <w:t xml:space="preserve">“having a little extra cash is safe enough”</w:t>
+            </w:r>
+          </w:p>
+        </w:tc>
+        <w:tc>
+          <w:tcPr>
+            <w:tcW w:type="dxa" w:w="1200"/>
+            <w:vAlign w:val="center"/>
+          </w:tcPr>
+          <w:p>
+            <w:pPr>
+              <w:jc w:val="center"/>
+            </w:pPr>
+            <w:r>
+              <w:rPr>
+                <w:rFonts w:ascii="Times New Roman" w:cs="Times New Roman" w:eastAsia="Times New Roman" w:hAnsi="Times New Roman"/>
+                <w:sz w:val="22"/>
+                <w:szCs w:val="22"/>
+              </w:rPr>
+              <w:t xml:space="preserve">misconc., cr=50</w:t>
+            </w:r>
+          </w:p>
+        </w:tc>
+        <w:tc>
+          <w:tcPr>
+            <w:tcW w:type="dxa" w:w="1200"/>
+            <w:vAlign w:val="center"/>
+          </w:tcPr>
+          <w:p>
+            <w:pPr>
+              <w:jc w:val="center"/>
+            </w:pPr>
+            <w:r>
+              <w:rPr>
+                <w:rFonts w:ascii="Times New Roman" w:cs="Times New Roman" w:eastAsia="Times New Roman" w:hAnsi="Times New Roman"/>
+                <w:sz w:val="22"/>
+                <w:szCs w:val="22"/>
+              </w:rPr>
+              <w:t xml:space="preserve">misconc., cr=50</w:t>
+            </w:r>
+          </w:p>
+        </w:tc>
+        <w:tc>
+          <w:tcPr>
+            <w:tcW w:type="dxa" w:w="1200"/>
+            <w:vAlign w:val="center"/>
+          </w:tcPr>
+          <w:p>
+            <w:pPr>
+              <w:jc w:val="center"/>
+            </w:pPr>
+            <w:r>
+              <w:rPr>
+                <w:rFonts w:ascii="Times New Roman" w:cs="Times New Roman" w:eastAsia="Times New Roman" w:hAnsi="Times New Roman"/>
+                <w:sz w:val="22"/>
+                <w:szCs w:val="22"/>
+              </w:rPr>
+              <w:t xml:space="preserve">misconc., cr=100</w:t>
+            </w:r>
+          </w:p>
+        </w:tc>
+        <w:tc>
+          <w:tcPr>
+            <w:tcW w:type="dxa" w:w="1200"/>
+            <w:vAlign w:val="center"/>
+          </w:tcPr>
+          <w:p>
+            <w:pPr>
+              <w:jc w:val="center"/>
+            </w:pPr>
+            <w:r>
+              <w:rPr>
+                <w:rFonts w:ascii="Times New Roman" w:cs="Times New Roman" w:eastAsia="Times New Roman" w:hAnsi="Times New Roman"/>
+                <w:sz w:val="22"/>
+                <w:szCs w:val="22"/>
+              </w:rPr>
+              <w:t xml:space="preserve">KG (idk), cr=0</w:t>
+            </w:r>
+          </w:p>
+        </w:tc>
+        <w:tc>
+          <w:tcPr>
+            <w:tcW w:type="dxa" w:w="1200"/>
+            <w:vAlign w:val="center"/>
+          </w:tcPr>
+          <w:p>
+            <w:pPr>
+              <w:jc w:val="center"/>
+            </w:pPr>
+            <w:r>
+              <w:rPr>
+                <w:rFonts w:ascii="Times New Roman" w:cs="Times New Roman" w:eastAsia="Times New Roman" w:hAnsi="Times New Roman"/>
+                <w:sz w:val="22"/>
+                <w:szCs w:val="22"/>
+              </w:rPr>
+              <w:t xml:space="preserve">KG (idk), cr=0</w:t>
+            </w:r>
+          </w:p>
+        </w:tc>
+      </w:tr>
+      <w:tr>
+        <w:tc>
+          <w:tcPr>
+            <w:tcW w:type="dxa" w:w="900"/>
+            <w:vAlign w:val="center"/>
+          </w:tcPr>
+          <w:p>
+            <w:pPr>
+              <w:jc w:val="center"/>
+            </w:pPr>
+            <w:r>
+              <w:rPr>
+                <w:rFonts w:ascii="Times New Roman" w:cs="Times New Roman" w:eastAsia="Times New Roman" w:hAnsi="Times New Roman"/>
+                <w:sz w:val="22"/>
+                <w:szCs w:val="22"/>
+              </w:rPr>
+              <w:t xml:space="preserve">Q13 Diagnose</w:t>
+            </w:r>
+          </w:p>
+        </w:tc>
+        <w:tc>
+          <w:tcPr>
+            <w:tcW w:type="dxa" w:w="1260"/>
+            <w:vAlign w:val="center"/>
+          </w:tcPr>
+          <w:p>
+            <w:pPr>
+              <w:jc w:val="center"/>
+            </w:pPr>
+            <w:r>
+              <w:rPr>
+                <w:rFonts w:ascii="Times New Roman" w:cs="Times New Roman" w:eastAsia="Times New Roman" w:hAnsi="Times New Roman"/>
+                <w:sz w:val="22"/>
+                <w:szCs w:val="22"/>
+              </w:rPr>
+              <w:t xml:space="preserve">“deductible is $500… insurance pays rest”</w:t>
+            </w:r>
+          </w:p>
+        </w:tc>
+        <w:tc>
+          <w:tcPr>
+            <w:tcW w:type="dxa" w:w="1200"/>
+            <w:vAlign w:val="center"/>
+          </w:tcPr>
+          <w:p>
+            <w:pPr>
+              <w:jc w:val="center"/>
+            </w:pPr>
+            <w:r>
+              <w:rPr>
+                <w:rFonts w:ascii="Times New Roman" w:cs="Times New Roman" w:eastAsia="Times New Roman" w:hAnsi="Times New Roman"/>
+                <w:sz w:val="22"/>
+                <w:szCs w:val="22"/>
+              </w:rPr>
+              <w:t xml:space="preserve">SE (selfcorrect)</w:t>
+            </w:r>
+          </w:p>
+        </w:tc>
+        <w:tc>
+          <w:tcPr>
+            <w:tcW w:type="dxa" w:w="1200"/>
+            <w:vAlign w:val="center"/>
+          </w:tcPr>
+          <w:p>
+            <w:pPr>
+              <w:jc w:val="center"/>
+            </w:pPr>
+            <w:r>
+              <w:rPr>
+                <w:rFonts w:ascii="Times New Roman" w:cs="Times New Roman" w:eastAsia="Times New Roman" w:hAnsi="Times New Roman"/>
+                <w:sz w:val="22"/>
+                <w:szCs w:val="22"/>
+              </w:rPr>
+              <w:t xml:space="preserve">misconc. (INS-03), cr=50</w:t>
+            </w:r>
+          </w:p>
+        </w:tc>
+        <w:tc>
+          <w:tcPr>
+            <w:tcW w:type="dxa" w:w="1200"/>
+            <w:vAlign w:val="center"/>
+          </w:tcPr>
+          <w:p>
+            <w:pPr>
+              <w:jc w:val="center"/>
+            </w:pPr>
+            <w:r>
+              <w:rPr>
+                <w:rFonts w:ascii="Times New Roman" w:cs="Times New Roman" w:eastAsia="Times New Roman" w:hAnsi="Times New Roman"/>
+                <w:sz w:val="22"/>
+                <w:szCs w:val="22"/>
+              </w:rPr>
+              <w:t xml:space="preserve">SE (selfcorrect)</w:t>
+            </w:r>
+          </w:p>
+        </w:tc>
+        <w:tc>
+          <w:tcPr>
+            <w:tcW w:type="dxa" w:w="1200"/>
+            <w:vAlign w:val="center"/>
+          </w:tcPr>
+          <w:p>
+            <w:pPr>
+              <w:jc w:val="center"/>
+            </w:pPr>
+            <w:r>
+              <w:rPr>
+                <w:rFonts w:ascii="Times New Roman" w:cs="Times New Roman" w:eastAsia="Times New Roman" w:hAnsi="Times New Roman"/>
+                <w:sz w:val="22"/>
+                <w:szCs w:val="22"/>
+              </w:rPr>
+              <w:t xml:space="preserve">SE (INS-03)</w:t>
+            </w:r>
+          </w:p>
+        </w:tc>
+        <w:tc>
+          <w:tcPr>
+            <w:tcW w:type="dxa" w:w="1200"/>
+            <w:vAlign w:val="center"/>
+          </w:tcPr>
+          <w:p>
+            <w:pPr>
+              <w:jc w:val="center"/>
+            </w:pPr>
+            <w:r>
+              <w:rPr>
+                <w:rFonts w:ascii="Times New Roman" w:cs="Times New Roman" w:eastAsia="Times New Roman" w:hAnsi="Times New Roman"/>
+                <w:sz w:val="22"/>
+                <w:szCs w:val="22"/>
+              </w:rPr>
+              <w:t xml:space="preserve">misconc. (INS-03)</w:t>
+            </w:r>
+          </w:p>
+        </w:tc>
+      </w:tr>
+      <w:tr>
+        <w:tc>
+          <w:tcPr>
+            <w:tcW w:type="dxa" w:w="900"/>
+            <w:vAlign w:val="center"/>
+          </w:tcPr>
+          <w:p>
+            <w:pPr>
+              <w:jc w:val="center"/>
+            </w:pPr>
+            <w:r>
+              <w:rPr>
+                <w:rFonts w:ascii="Times New Roman" w:cs="Times New Roman" w:eastAsia="Times New Roman" w:hAnsi="Times New Roman"/>
+                <w:sz w:val="22"/>
+                <w:szCs w:val="22"/>
+              </w:rPr>
+              <w:t xml:space="preserve">Q37 Confirm</w:t>
+            </w:r>
+          </w:p>
+        </w:tc>
+        <w:tc>
+          <w:tcPr>
+            <w:tcW w:type="dxa" w:w="1260"/>
+            <w:vAlign w:val="center"/>
+          </w:tcPr>
+          <w:p>
+            <w:pPr>
+              <w:jc w:val="center"/>
+            </w:pPr>
+            <w:r>
+              <w:rPr>
+                <w:rFonts w:ascii="Times New Roman" w:cs="Times New Roman" w:eastAsia="Times New Roman" w:hAnsi="Times New Roman"/>
+                <w:sz w:val="22"/>
+                <w:szCs w:val="22"/>
+              </w:rPr>
+              <w:t xml:space="preserve">“Liability coverage protects you…”</w:t>
+            </w:r>
+          </w:p>
+        </w:tc>
+        <w:tc>
+          <w:tcPr>
+            <w:tcW w:type="dxa" w:w="1200"/>
+            <w:vAlign w:val="center"/>
+          </w:tcPr>
+          <w:p>
+            <w:pPr>
+              <w:jc w:val="center"/>
+            </w:pPr>
+            <w:r>
+              <w:rPr>
+                <w:rFonts w:ascii="Times New Roman" w:cs="Times New Roman" w:eastAsia="Times New Roman" w:hAnsi="Times New Roman"/>
+                <w:sz w:val="22"/>
+                <w:szCs w:val="22"/>
+              </w:rPr>
+              <w:t xml:space="preserve">verified, cr=100</w:t>
+            </w:r>
+          </w:p>
+        </w:tc>
+        <w:tc>
+          <w:tcPr>
+            <w:tcW w:type="dxa" w:w="1200"/>
+            <w:vAlign w:val="center"/>
+          </w:tcPr>
+          <w:p>
+            <w:pPr>
+              <w:jc w:val="center"/>
+            </w:pPr>
+            <w:r>
+              <w:rPr>
+                <w:rFonts w:ascii="Times New Roman" w:cs="Times New Roman" w:eastAsia="Times New Roman" w:hAnsi="Times New Roman"/>
+                <w:sz w:val="22"/>
+                <w:szCs w:val="22"/>
+              </w:rPr>
+              <w:t xml:space="preserve">verified, cr=100</w:t>
+            </w:r>
+          </w:p>
+        </w:tc>
+        <w:tc>
+          <w:tcPr>
+            <w:tcW w:type="dxa" w:w="1200"/>
+            <w:vAlign w:val="center"/>
+          </w:tcPr>
+          <w:p>
+            <w:pPr>
+              <w:jc w:val="center"/>
+            </w:pPr>
+            <w:r>
+              <w:rPr>
+                <w:rFonts w:ascii="Times New Roman" w:cs="Times New Roman" w:eastAsia="Times New Roman" w:hAnsi="Times New Roman"/>
+                <w:sz w:val="22"/>
+                <w:szCs w:val="22"/>
+              </w:rPr>
+              <w:t xml:space="preserve">verified, cr=100</w:t>
+            </w:r>
+          </w:p>
+        </w:tc>
+        <w:tc>
+          <w:tcPr>
+            <w:tcW w:type="dxa" w:w="1200"/>
+            <w:vAlign w:val="center"/>
+          </w:tcPr>
+          <w:p>
+            <w:pPr>
+              <w:jc w:val="center"/>
+            </w:pPr>
+            <w:r>
+              <w:rPr>
+                <w:rFonts w:ascii="Times New Roman" w:cs="Times New Roman" w:eastAsia="Times New Roman" w:hAnsi="Times New Roman"/>
+                <w:sz w:val="22"/>
+                <w:szCs w:val="22"/>
+              </w:rPr>
+              <w:t xml:space="preserve">partial, cr=50</w:t>
+            </w:r>
+          </w:p>
+        </w:tc>
+        <w:tc>
+          <w:tcPr>
+            <w:tcW w:type="dxa" w:w="1200"/>
+            <w:vAlign w:val="center"/>
+          </w:tcPr>
+          <w:p>
+            <w:pPr>
+              <w:jc w:val="center"/>
+            </w:pPr>
+            <w:r>
+              <w:rPr>
+                <w:rFonts w:ascii="Times New Roman" w:cs="Times New Roman" w:eastAsia="Times New Roman" w:hAnsi="Times New Roman"/>
+                <w:sz w:val="22"/>
+                <w:szCs w:val="22"/>
+              </w:rPr>
+              <w:t xml:space="preserve">verified, cr=100</w:t>
+            </w:r>
+          </w:p>
+        </w:tc>
+      </w:tr>
+    </w:tbl>
+    <w:p>
+      <w:pPr>
+        <w:spacing w:line="360" w:after="200"/>
+      </w:pPr>
+      <w:r>
+        <w:rPr>
+          <w:rFonts w:ascii="Times New Roman" w:cs="Times New Roman" w:eastAsia="Times New Roman" w:hAnsi="Times New Roman"/>
+          <w:b/>
+          <w:bCs/>
+          <w:sz w:val="24"/>
+          <w:szCs w:val="24"/>
+        </w:rPr>
+        <w:t xml:space="preserve">Selection Rationale. </w:t>
+      </w:r>
+      <w:r>
+        <w:rPr>
+          <w:rFonts w:ascii="Times New Roman" w:cs="Times New Roman" w:eastAsia="Times New Roman" w:hAnsi="Times New Roman"/>
+          <w:sz w:val="24"/>
+          <w:szCs w:val="24"/>
+        </w:rPr>
+        <w:t xml:space="preserve">GPT-4.1 was selected as the production scorer based on the following criteria: (a) zero schema violations across all 20 test items, (b) zero parse or API errors, (c) appropriate use of credit=50 for borderline misconceptions (e.g., Q5, where the student’s reasoning was directionally aligned with a misconception but lacked specificity), (d) balanced classification distributions that were neither overly lenient (as with Gemini 2.0 Flash, which classified 66.7% of confirm items as “verified”) nor overly strict (as with GPT-4o-mini, which classified only 11.1% as “verified”), and (e) reasonable throughput and cost for the full corpus (~33 minutes, ~$2.86 for 953 responses). On the disputed items, GPT-4.1’s classifications aligned with the majority of the zero-error models in three of four cases (Q9, Q5, Q37), supporting its position as a concordant central scorer.</w:t>
       </w:r>
     </w:p>
     <w:sectPr>

</xml_diff>